<commit_message>
adaugat in documentatie proiectare si diagrama
</commit_message>
<xml_diff>
--- a/Anul_3/proiect_baze_de_date/docs/Proiect_BD.docx
+++ b/Anul_3/proiect_baze_de_date/docs/Proiect_BD.docx
@@ -948,6 +948,7 @@
         </w:rPr>
       </w:pPr>
       <w:bookmarkStart w:id="0" w:name="_Toc243038869"/>
+      <w:bookmarkStart w:id="1" w:name="_GoBack"/>
       <w:proofErr w:type="spellStart"/>
       <w:r>
         <w:rPr>
@@ -1047,7 +1048,7 @@
           <w:lang w:val="en-US"/>
         </w:rPr>
       </w:pPr>
-      <w:bookmarkStart w:id="1" w:name="_Toc243038870"/>
+      <w:bookmarkStart w:id="2" w:name="_Toc243038870"/>
       <w:proofErr w:type="spellStart"/>
       <w:r>
         <w:rPr>
@@ -1075,7 +1076,7 @@
         </w:rPr>
         <w:t>proiectului</w:t>
       </w:r>
-      <w:bookmarkEnd w:id="1"/>
+      <w:bookmarkEnd w:id="2"/>
       <w:proofErr w:type="spellEnd"/>
     </w:p>
     <w:p>
@@ -1289,8 +1290,6 @@
         </w:rPr>
         <w:t>tarea modulului operațional de salon și a</w:t>
       </w:r>
-      <w:bookmarkStart w:id="2" w:name="_GoBack"/>
-      <w:bookmarkEnd w:id="2"/>
       <w:r>
         <w:rPr>
           <w:rFonts w:ascii="Times New Roman" w:eastAsia="Times New Roman" w:hAnsi="Times New Roman" w:cs="Times New Roman"/>
@@ -1485,9 +1484,200 @@
         <w:t>ocupată (administrator, recepționer, trainer, tehnician).</w:t>
       </w:r>
     </w:p>
+    <w:bookmarkEnd w:id="1"/>
+    <w:p>
+      <w:pPr>
+        <w:pStyle w:val="Heading1"/>
+        <w:numPr>
+          <w:ilvl w:val="0"/>
+          <w:numId w:val="3"/>
+        </w:numPr>
+        <w:rPr>
+          <w:rFonts w:ascii="Times New Roman" w:hAnsi="Times New Roman" w:cs="Times New Roman"/>
+          <w:color w:val="000000" w:themeColor="text1"/>
+        </w:rPr>
+      </w:pPr>
+      <w:r>
+        <w:rPr>
+          <w:rFonts w:ascii="Times New Roman" w:hAnsi="Times New Roman" w:cs="Times New Roman"/>
+          <w:color w:val="000000" w:themeColor="text1"/>
+        </w:rPr>
+        <w:t>Proiectare</w:t>
+      </w:r>
+    </w:p>
+    <w:p/>
+    <w:p>
+      <w:pPr>
+        <w:rPr>
+          <w:rFonts w:ascii="Times New Roman" w:hAnsi="Times New Roman" w:cs="Times New Roman"/>
+          <w:sz w:val="24"/>
+          <w:szCs w:val="24"/>
+        </w:rPr>
+      </w:pPr>
+      <w:r>
+        <w:rPr>
+          <w:rFonts w:ascii="Times New Roman" w:hAnsi="Times New Roman" w:cs="Times New Roman"/>
+          <w:sz w:val="24"/>
+          <w:szCs w:val="24"/>
+        </w:rPr>
+        <w:t>Analiza cerintelor</w:t>
+      </w:r>
+    </w:p>
+    <w:p>
+      <w:pPr>
+        <w:rPr>
+          <w:rFonts w:ascii="Times New Roman" w:hAnsi="Times New Roman" w:cs="Times New Roman"/>
+          <w:sz w:val="24"/>
+          <w:szCs w:val="24"/>
+        </w:rPr>
+      </w:pPr>
+      <w:r>
+        <w:rPr>
+          <w:rFonts w:ascii="Times New Roman" w:hAnsi="Times New Roman" w:cs="Times New Roman"/>
+          <w:sz w:val="24"/>
+          <w:szCs w:val="24"/>
+        </w:rPr>
+        <w:t>Sistemul informatic propus este destinat gestionarii integrate a unui salon de infrumusetare si a unei academii de formare prfesionala in domeniu. In urma analizei fluxului operational real, au fost identificate cerinte de stocare si procesare a datelor. In primul rand, sistemul va gestiona datele personaelor implicate, retinand informatii de contact, un istoric medical relevant pentru prestarea serviciilor (precum alergiile sau bolile transmisbile) si detaliile unui sistem de fidelizare pentru clienti. In paralel, pentru angajati se va tine evidenta stricta a rolulilo, a specializarilor si a acreditarilor profesionale. Pe plan operational, baza de date va inregistra in detaliu programarile pentru serviciile de salon si participarea clientilor la cursurile academiei, asociind automat fiecare actiune cu tehnicianul sau trainerul corespunzator. O componenta critica o reprezinta gestiunea resurselor si a normelor de igiena, impunandu-se o trasabilitate clara a aparaturii utilizate. Aceasta este completata de necestitatea unui registru digital de sterilizare, completat de angajati, care sa ateste comformitatea proceselor de igienizare pentru aparatura si instrumentar. Nu in ultimul rand, sistemul va asigura evidenta centralizata a produselor consumabile, separand stocul alocat operatiunilor de salon de cel destinat procesului educational din academie.</w:t>
+      </w:r>
+    </w:p>
+    <w:p>
+      <w:pPr>
+        <w:rPr>
+          <w:rFonts w:ascii="Times New Roman" w:hAnsi="Times New Roman" w:cs="Times New Roman"/>
+          <w:sz w:val="24"/>
+          <w:szCs w:val="24"/>
+        </w:rPr>
+      </w:pPr>
+    </w:p>
+    <w:p>
+      <w:pPr>
+        <w:rPr>
+          <w:rFonts w:ascii="Times New Roman" w:hAnsi="Times New Roman" w:cs="Times New Roman"/>
+          <w:sz w:val="24"/>
+          <w:szCs w:val="24"/>
+        </w:rPr>
+      </w:pPr>
+      <w:r>
+        <w:rPr>
+          <w:rFonts w:ascii="Times New Roman" w:hAnsi="Times New Roman" w:cs="Times New Roman"/>
+          <w:sz w:val="24"/>
+          <w:szCs w:val="24"/>
+        </w:rPr>
+        <w:t>Modelul conceptual (Diagrama ER)</w:t>
+      </w:r>
+    </w:p>
+    <w:p>
+      <w:pPr>
+        <w:rPr>
+          <w:rFonts w:ascii="Times New Roman" w:hAnsi="Times New Roman" w:cs="Times New Roman"/>
+          <w:sz w:val="24"/>
+          <w:szCs w:val="24"/>
+        </w:rPr>
+      </w:pPr>
+      <w:r>
+        <w:rPr>
+          <w:rFonts w:ascii="Times New Roman" w:hAnsi="Times New Roman" w:cs="Times New Roman"/>
+          <w:sz w:val="24"/>
+          <w:szCs w:val="24"/>
+        </w:rPr>
+        <w:t xml:space="preserve">Pentru modelarea conceptuala a datelor s-a utilizat Diagrama Entitate-Relatie (ER) abordand notatia care descrie arhitectura logica a sistemului independent de platforma tehnica pe care va fi implementata baza de date. Arhitectura se fundamenteaza pe opt entitati principale, fiecare dispunand de o cheie primara. Entitatile „Client” si „Angajat” stocheaza datele personale si profesionale, in timp ce entitatile „Serviciu”, „Programari” si „Cursuri” definesc activitatile comerciale si educationale, ingloband atribute precum durata, pret, disponibilitate si status. Componenta logistica si de conformitate a businessul-ui este </w:t>
+      </w:r>
+      <w:r>
+        <w:rPr>
+          <w:rFonts w:ascii="Times New Roman" w:hAnsi="Times New Roman" w:cs="Times New Roman"/>
+          <w:sz w:val="24"/>
+          <w:szCs w:val="24"/>
+        </w:rPr>
+        <w:t xml:space="preserve">acoperita prin entitatile „Aparatura”, „Registru_Sterilizare” si „Produse” care retin detalii esentiale referitoare la garantii, loturi de solutii, martori de sterilizare, termene de valabilitate, produse destinate salonului si </w:t>
+      </w:r>
+      <w:r>
+        <w:rPr>
+          <w:rFonts w:ascii="Times New Roman" w:hAnsi="Times New Roman" w:cs="Times New Roman"/>
+          <w:sz w:val="24"/>
+          <w:szCs w:val="24"/>
+        </w:rPr>
+        <w:t xml:space="preserve">academiei. </w:t>
+      </w:r>
+      <w:r>
+        <w:rPr>
+          <w:rFonts w:ascii="Times New Roman" w:hAnsi="Times New Roman" w:cs="Times New Roman"/>
+          <w:sz w:val="24"/>
+          <w:szCs w:val="24"/>
+        </w:rPr>
+        <w:t xml:space="preserve">Relațiile și cardinalitățile stabilite între aceste entități reflectă cu exactitate regulile de funcționare ale afacerii. Fluxul operațional de bază este modelat prin relații de tip unu-la-mulți (1:N), ilustrând faptul că un singur client poate efectua multiple programări, iar un angajat poate presta mai multe servicii, preda diverse cursuri și completa succesiv registrul de sterilizare. Totodată, modelul conceptual surprinde și interacțiunile </w:t>
+      </w:r>
+      <w:r>
+        <w:rPr>
+          <w:rFonts w:ascii="Times New Roman" w:hAnsi="Times New Roman" w:cs="Times New Roman"/>
+          <w:sz w:val="24"/>
+          <w:szCs w:val="24"/>
+        </w:rPr>
+        <w:lastRenderedPageBreak/>
+        <w:t>complexe specifice mediului fizic prin relații de tip mulți-la-mulți (M:N). Acestea evidențiază faptul că un curs reunește mai mulți clienți participanți, iar o anumită categorie de aparatură este necesară și alocată simultan atât pentru prestarea diverselor servicii de salon, cât și pentru susținerea orelor de practică din cadrul academiei.</w:t>
+      </w:r>
+    </w:p>
+    <w:p>
+      <w:pPr>
+        <w:rPr>
+          <w:rFonts w:ascii="Times New Roman" w:hAnsi="Times New Roman" w:cs="Times New Roman"/>
+          <w:sz w:val="24"/>
+          <w:szCs w:val="24"/>
+        </w:rPr>
+      </w:pPr>
+      <w:r>
+        <w:rPr>
+          <w:rFonts w:ascii="Times New Roman" w:hAnsi="Times New Roman" w:cs="Times New Roman"/>
+          <w:noProof/>
+          <w:sz w:val="24"/>
+          <w:szCs w:val="24"/>
+          <w:lang w:eastAsia="ro-RO"/>
+        </w:rPr>
+        <w:drawing>
+          <wp:inline distT="0" distB="0" distL="0" distR="0">
+            <wp:extent cx="5340928" cy="6780093"/>
+            <wp:effectExtent l="0" t="0" r="0" b="1905"/>
+            <wp:docPr id="2" name="Picture 2"/>
+            <wp:cNvGraphicFramePr>
+              <a:graphicFrameLocks xmlns:a="http://schemas.openxmlformats.org/drawingml/2006/main" noChangeAspect="1"/>
+            </wp:cNvGraphicFramePr>
+            <a:graphic xmlns:a="http://schemas.openxmlformats.org/drawingml/2006/main">
+              <a:graphicData uri="http://schemas.openxmlformats.org/drawingml/2006/picture">
+                <pic:pic xmlns:pic="http://schemas.openxmlformats.org/drawingml/2006/picture">
+                  <pic:nvPicPr>
+                    <pic:cNvPr id="2" name="diagrama_ER.png"/>
+                    <pic:cNvPicPr/>
+                  </pic:nvPicPr>
+                  <pic:blipFill>
+                    <a:blip r:embed="rId8" cstate="print">
+                      <a:extLst>
+                        <a:ext uri="{28A0092B-C50C-407E-A947-70E740481C1C}">
+                          <a14:useLocalDpi xmlns:a14="http://schemas.microsoft.com/office/drawing/2010/main" val="0"/>
+                        </a:ext>
+                      </a:extLst>
+                    </a:blip>
+                    <a:stretch>
+                      <a:fillRect/>
+                    </a:stretch>
+                  </pic:blipFill>
+                  <pic:spPr>
+                    <a:xfrm>
+                      <a:off x="0" y="0"/>
+                      <a:ext cx="5343724" cy="6783643"/>
+                    </a:xfrm>
+                    <a:prstGeom prst="rect">
+                      <a:avLst/>
+                    </a:prstGeom>
+                  </pic:spPr>
+                </pic:pic>
+              </a:graphicData>
+            </a:graphic>
+          </wp:inline>
+        </w:drawing>
+      </w:r>
+    </w:p>
     <w:sectPr>
-      <w:footerReference w:type="default" r:id="rId8"/>
-      <w:footerReference w:type="first" r:id="rId9"/>
+      <w:footerReference w:type="default" r:id="rId9"/>
+      <w:footerReference w:type="first" r:id="rId10"/>
       <w:pgSz w:w="11906" w:h="16838" w:code="9"/>
       <w:pgMar w:top="1418" w:right="1418" w:bottom="1418" w:left="1418" w:header="709" w:footer="709" w:gutter="0"/>
       <w:cols w:space="708"/>
@@ -1557,7 +1747,7 @@
           <w:rPr>
             <w:noProof/>
           </w:rPr>
-          <w:t>4</w:t>
+          <w:t>5</w:t>
         </w:r>
         <w:r>
           <w:rPr>
@@ -4358,7 +4548,7 @@
 </file>
 
 <file path=customXml/itemProps1.xml><?xml version="1.0" encoding="utf-8"?>
-<ds:datastoreItem xmlns:ds="http://schemas.openxmlformats.org/officeDocument/2006/customXml" ds:itemID="{2A54699A-17A1-4156-BEA6-4A771F314958}">
+<ds:datastoreItem xmlns:ds="http://schemas.openxmlformats.org/officeDocument/2006/customXml" ds:itemID="{75542D3C-944F-43E0-99EA-3F2824AD3A44}">
   <ds:schemaRefs>
     <ds:schemaRef ds:uri="http://schemas.openxmlformats.org/officeDocument/2006/bibliography"/>
   </ds:schemaRefs>

</xml_diff>

<commit_message>
made a pdf in case the docs can't be read (errors)
</commit_message>
<xml_diff>
--- a/Anul_3/proiect_baze_de_date/docs/Proiect_BD.docx
+++ b/Anul_3/proiect_baze_de_date/docs/Proiect_BD.docx
@@ -684,8 +684,6 @@
           <w:r>
             <w:t>Contents</w:t>
           </w:r>
-          <w:bookmarkStart w:id="0" w:name="_GoBack"/>
-          <w:bookmarkEnd w:id="0"/>
         </w:p>
         <w:p>
           <w:pPr>
@@ -1175,7 +1173,7 @@
           <w:lang w:val="en-US"/>
         </w:rPr>
       </w:pPr>
-      <w:bookmarkStart w:id="1" w:name="_Toc243561399"/>
+      <w:bookmarkStart w:id="0" w:name="_Toc243561399"/>
       <w:proofErr w:type="spellStart"/>
       <w:r>
         <w:rPr>
@@ -1204,52 +1202,63 @@
         </w:rPr>
         <w:t>proiectului</w:t>
       </w:r>
+      <w:bookmarkEnd w:id="0"/>
+      <w:proofErr w:type="spellEnd"/>
+    </w:p>
+    <w:p>
+      <w:pPr>
+        <w:rPr>
+          <w:lang w:val="en-US"/>
+        </w:rPr>
+      </w:pPr>
+    </w:p>
+    <w:p>
+      <w:pPr>
+        <w:rPr>
+          <w:rFonts w:ascii="Times New Roman" w:hAnsi="Times New Roman" w:cs="Times New Roman"/>
+          <w:color w:val="000000" w:themeColor="text1"/>
+          <w:sz w:val="24"/>
+          <w:szCs w:val="24"/>
+        </w:rPr>
+      </w:pPr>
+      <w:r>
+        <w:rPr>
+          <w:rFonts w:ascii="Times New Roman" w:hAnsi="Times New Roman" w:cs="Times New Roman"/>
+          <w:color w:val="000000" w:themeColor="text1"/>
+          <w:sz w:val="24"/>
+          <w:szCs w:val="24"/>
+        </w:rPr>
+        <w:t>Proiectul de față propune proiectarea și implementarea unei baze de date pentru gestionarea integrată a activității unui salon de manichiură care funcționează simultan și ca academie de profil (cursuri de formare profesională în unghii tehnice). În mediul actual, gestionarea manuală sau prin instrumente dezorganizate a programărilor, a stocurilor de materiale, a cursanților și a disponibilității personalului generează blocaje, erori și pierderi de timp.</w:t>
+      </w:r>
+      <w:r>
+        <w:rPr>
+          <w:rFonts w:ascii="Times New Roman" w:hAnsi="Times New Roman" w:cs="Times New Roman"/>
+          <w:color w:val="000000" w:themeColor="text1"/>
+          <w:sz w:val="24"/>
+          <w:szCs w:val="24"/>
+        </w:rPr>
+        <w:t xml:space="preserve"> </w:t>
+      </w:r>
+      <w:r>
+        <w:rPr>
+          <w:rFonts w:ascii="Times New Roman" w:hAnsi="Times New Roman" w:cs="Times New Roman"/>
+          <w:color w:val="000000" w:themeColor="text1"/>
+          <w:sz w:val="24"/>
+          <w:szCs w:val="24"/>
+        </w:rPr>
+        <w:t>Utilitatea practică a sistemului constă în automatizarea fluxurilor operaționale specifice: programarea clienților pentru diverse servicii de întreținere și stilizare unghii, gestionarea stocurilor separate de materiale (atât pentru salon, cât și pentru academie), evidența tehnicienilor/trainerilor, precum și gestionarea înscrierilor cursanților la modulele de academie, a reducerilor onomastice/fidelitate, a istoricului alergiilor și a feedback-ului. Prin această soluție se elimină evidența pe hârtie sau în fișiere Excel dezorganizate, asigurând integritatea datelor și acces rapid la rapoarte operaționale.</w:t>
+      </w:r>
+      <w:r>
+        <w:rPr>
+          <w:rFonts w:ascii="Times New Roman" w:hAnsi="Times New Roman" w:cs="Times New Roman"/>
+          <w:color w:val="000000" w:themeColor="text1"/>
+          <w:sz w:val="24"/>
+          <w:szCs w:val="24"/>
+        </w:rPr>
+        <w:t xml:space="preserve"> </w:t>
+      </w:r>
+      <w:bookmarkStart w:id="1" w:name="_GoBack"/>
       <w:bookmarkEnd w:id="1"/>
-      <w:proofErr w:type="spellEnd"/>
-    </w:p>
-    <w:p>
-      <w:pPr>
-        <w:rPr>
-          <w:lang w:val="en-US"/>
-        </w:rPr>
-      </w:pPr>
-    </w:p>
-    <w:p>
-      <w:pPr>
-        <w:rPr>
-          <w:rFonts w:ascii="Times New Roman" w:hAnsi="Times New Roman" w:cs="Times New Roman"/>
-          <w:color w:val="000000" w:themeColor="text1"/>
-          <w:sz w:val="24"/>
-          <w:szCs w:val="24"/>
-        </w:rPr>
-      </w:pPr>
-      <w:r>
-        <w:rPr>
-          <w:rFonts w:ascii="Times New Roman" w:hAnsi="Times New Roman" w:cs="Times New Roman"/>
-          <w:color w:val="000000" w:themeColor="text1"/>
-          <w:sz w:val="24"/>
-          <w:szCs w:val="24"/>
-        </w:rPr>
-        <w:t>Proiectul de față propune proiectarea și implementarea unei baze de date pentru gestionarea integrată a activității unui salon de manichiură care funcționează simultan și ca academie de profil (cursuri de formare profesională în unghii tehnice). În mediul actual, gestionarea manuală sau prin instrumente dezorganizate a programărilor, a stocurilor de materiale, a cursanților și a disponibilității personalului generează blocaje, erori și pierderi de timp.</w:t>
-      </w:r>
-      <w:r>
-        <w:rPr>
-          <w:rFonts w:ascii="Times New Roman" w:hAnsi="Times New Roman" w:cs="Times New Roman"/>
-          <w:color w:val="000000" w:themeColor="text1"/>
-          <w:sz w:val="24"/>
-          <w:szCs w:val="24"/>
-        </w:rPr>
-        <w:t xml:space="preserve"> </w:t>
-      </w:r>
-      <w:r>
-        <w:rPr>
-          <w:rFonts w:ascii="Times New Roman" w:hAnsi="Times New Roman" w:cs="Times New Roman"/>
-          <w:color w:val="000000" w:themeColor="text1"/>
-          <w:sz w:val="24"/>
-          <w:szCs w:val="24"/>
-        </w:rPr>
-        <w:t>Utilitatea practică a sistemului constă în automatizarea fluxurilor operaționale specifice: programarea clienților pentru diverse servicii de întreținere și stilizare unghii, gestionarea stocurilor separate de materiale (atât pentru salon, cât și pentru academie), evidența tehnicienilor/trainerilor, precum și gestionarea înscrierilor cursanților la modulele de academie, a reducerilor onomastice/fidelitate, a istoricului alergiilor și a feedback-ului. Prin această soluție se elimină evidența pe hârtie sau în fișiere Excel dezorganizate, asigurând integritatea datelor și acces rapid la rapoarte operaționale.</w:t>
-      </w:r>
     </w:p>
     <w:p>
       <w:pPr>
@@ -1828,15 +1837,7 @@
           <w:sz w:val="24"/>
           <w:szCs w:val="24"/>
         </w:rPr>
-        <w:t xml:space="preserve">academiei. </w:t>
-      </w:r>
-      <w:r>
-        <w:rPr>
-          <w:rFonts w:ascii="Times New Roman" w:hAnsi="Times New Roman" w:cs="Times New Roman"/>
-          <w:sz w:val="24"/>
-          <w:szCs w:val="24"/>
-        </w:rPr>
-        <w:t xml:space="preserve">Relațiile și cardinalitățile stabilite între aceste entități reflectă cu exactitate regulile de funcționare ale afacerii. Fluxul operațional de bază este modelat prin relații de tip unu-la-mulți (1:N), ilustrând faptul că un singur client poate efectua multiple </w:t>
+        <w:t xml:space="preserve">academiei. Relațiile și cardinalitățile stabilite între aceste entități reflectă cu exactitate regulile de funcționare ale afacerii. Fluxul operațional de bază este modelat prin relații de tip unu-la-mulți (1:N), ilustrând faptul că un singur client poate efectua multiple </w:t>
       </w:r>
       <w:r>
         <w:rPr>
@@ -1979,7 +1980,7 @@
           <w:rPr>
             <w:noProof/>
           </w:rPr>
-          <w:t>4</w:t>
+          <w:t>5</w:t>
         </w:r>
         <w:r>
           <w:rPr>
@@ -4828,7 +4829,7 @@
 </file>
 
 <file path=customXml/itemProps1.xml><?xml version="1.0" encoding="utf-8"?>
-<ds:datastoreItem xmlns:ds="http://schemas.openxmlformats.org/officeDocument/2006/customXml" ds:itemID="{96DC809C-1E91-4988-BAE6-98E038523B58}">
+<ds:datastoreItem xmlns:ds="http://schemas.openxmlformats.org/officeDocument/2006/customXml" ds:itemID="{F1112BFD-1EBD-4F70-9C41-76B817A6DC88}">
   <ds:schemaRefs>
     <ds:schemaRef ds:uri="http://schemas.openxmlformats.org/officeDocument/2006/bibliography"/>
   </ds:schemaRefs>

</xml_diff>

<commit_message>
created a pdf for the docs because it has errors opening sometimes
</commit_message>
<xml_diff>
--- a/Anul_3/proiect_baze_de_date/docs/Proiect_BD.docx
+++ b/Anul_3/proiect_baze_de_date/docs/Proiect_BD.docx
@@ -643,6 +643,7 @@
           <w:lang w:val="en-US"/>
         </w:rPr>
       </w:pPr>
+      <w:bookmarkStart w:id="0" w:name="_GoBack"/>
       <w:r>
         <w:rPr>
           <w:rFonts w:ascii="Times New Roman" w:hAnsi="Times New Roman" w:cs="Times New Roman"/>
@@ -654,6 +655,7 @@
         <w:br w:type="page"/>
       </w:r>
     </w:p>
+    <w:bookmarkEnd w:id="0" w:displacedByCustomXml="next"/>
     <w:sdt>
       <w:sdtPr>
         <w:rPr>
@@ -966,7 +968,7 @@
                 <w:noProof/>
                 <w:webHidden/>
               </w:rPr>
-              <w:t>4</w:t>
+              <w:t>3</w:t>
             </w:r>
             <w:r>
               <w:rPr>
@@ -1035,7 +1037,7 @@
                 <w:noProof/>
                 <w:webHidden/>
               </w:rPr>
-              <w:t>4</w:t>
+              <w:t>3</w:t>
             </w:r>
             <w:r>
               <w:rPr>
@@ -1173,7 +1175,7 @@
           <w:lang w:val="en-US"/>
         </w:rPr>
       </w:pPr>
-      <w:bookmarkStart w:id="0" w:name="_Toc243561399"/>
+      <w:bookmarkStart w:id="1" w:name="_Toc243561399"/>
       <w:proofErr w:type="spellStart"/>
       <w:r>
         <w:rPr>
@@ -1202,7 +1204,7 @@
         </w:rPr>
         <w:t>proiectului</w:t>
       </w:r>
-      <w:bookmarkEnd w:id="0"/>
+      <w:bookmarkEnd w:id="1"/>
       <w:proofErr w:type="spellEnd"/>
     </w:p>
     <w:p>
@@ -1257,8 +1259,6 @@
         </w:rPr>
         <w:t xml:space="preserve"> </w:t>
       </w:r>
-      <w:bookmarkStart w:id="1" w:name="_GoBack"/>
-      <w:bookmarkEnd w:id="1"/>
     </w:p>
     <w:p>
       <w:pPr>
@@ -1352,17 +1352,12 @@
     <w:p>
       <w:pPr>
         <w:pStyle w:val="NormalWeb"/>
-        <w:numPr>
-          <w:ilvl w:val="0"/>
-          <w:numId w:val="14"/>
-        </w:numPr>
-        <w:rPr>
-          <w:color w:val="000000" w:themeColor="text1"/>
-        </w:rPr>
-      </w:pPr>
-      <w:r>
-        <w:rPr>
-          <w:b/>
+        <w:rPr>
+          <w:color w:val="000000" w:themeColor="text1"/>
+        </w:rPr>
+      </w:pPr>
+      <w:r>
+        <w:rPr>
           <w:bCs/>
           <w:color w:val="000000" w:themeColor="text1"/>
         </w:rPr>
@@ -1370,353 +1365,129 @@
       </w:r>
       <w:r>
         <w:rPr>
-          <w:b/>
           <w:bCs/>
           <w:color w:val="000000" w:themeColor="text1"/>
         </w:rPr>
         <w:t>ursanților:</w:t>
       </w:r>
-    </w:p>
-    <w:p>
-      <w:pPr>
-        <w:spacing w:before="100" w:beforeAutospacing="1" w:after="100" w:afterAutospacing="1" w:line="240" w:lineRule="auto"/>
-        <w:ind w:left="720"/>
-        <w:rPr>
-          <w:rFonts w:ascii="Times New Roman" w:eastAsia="Times New Roman" w:hAnsi="Times New Roman" w:cs="Times New Roman"/>
-          <w:color w:val="000000" w:themeColor="text1"/>
-          <w:sz w:val="24"/>
-          <w:szCs w:val="24"/>
-          <w:lang w:eastAsia="ro-RO"/>
-        </w:rPr>
-      </w:pPr>
-      <w:r>
-        <w:rPr>
-          <w:rFonts w:ascii="Times New Roman" w:eastAsia="Times New Roman" w:hAnsi="Times New Roman" w:cs="Times New Roman"/>
-          <w:color w:val="000000" w:themeColor="text1"/>
-          <w:sz w:val="24"/>
-          <w:szCs w:val="24"/>
-          <w:lang w:eastAsia="ro-RO"/>
-        </w:rPr>
-        <w:t xml:space="preserve">Proiectarea structurilor de date necesare stocării informațiilor de identificare, a istoricului programărilor, a datelor </w:t>
-      </w:r>
-      <w:r>
-        <w:rPr>
-          <w:rFonts w:ascii="Times New Roman" w:eastAsia="Times New Roman" w:hAnsi="Times New Roman" w:cs="Times New Roman"/>
-          <w:color w:val="000000" w:themeColor="text1"/>
-          <w:sz w:val="24"/>
-          <w:szCs w:val="24"/>
-          <w:lang w:eastAsia="ro-RO"/>
-        </w:rPr>
-        <w:t>personale</w:t>
-      </w:r>
-      <w:r>
-        <w:rPr>
-          <w:rFonts w:ascii="Times New Roman" w:eastAsia="Times New Roman" w:hAnsi="Times New Roman" w:cs="Times New Roman"/>
-          <w:color w:val="000000" w:themeColor="text1"/>
-          <w:sz w:val="24"/>
-          <w:szCs w:val="24"/>
-          <w:lang w:eastAsia="ro-RO"/>
-        </w:rPr>
-        <w:t>, a programului de fidelizare, precum și a fișei de alergii pentru asigurarea conformității sanitare și a siguranței clienților.</w:t>
-      </w:r>
-    </w:p>
-    <w:p>
-      <w:pPr>
-        <w:pStyle w:val="ListParagraph"/>
-        <w:numPr>
-          <w:ilvl w:val="0"/>
-          <w:numId w:val="14"/>
-        </w:numPr>
-        <w:spacing w:before="100" w:beforeAutospacing="1" w:after="100" w:afterAutospacing="1" w:line="240" w:lineRule="auto"/>
-        <w:rPr>
-          <w:rFonts w:ascii="Times New Roman" w:eastAsia="Times New Roman" w:hAnsi="Times New Roman" w:cs="Times New Roman"/>
-          <w:b/>
+      <w:r>
+        <w:rPr>
           <w:bCs/>
           <w:color w:val="000000" w:themeColor="text1"/>
-          <w:sz w:val="24"/>
-          <w:szCs w:val="24"/>
-          <w:lang w:eastAsia="ro-RO"/>
-        </w:rPr>
-      </w:pPr>
-      <w:r>
-        <w:rPr>
-          <w:rFonts w:ascii="Times New Roman" w:eastAsia="Times New Roman" w:hAnsi="Times New Roman" w:cs="Times New Roman"/>
-          <w:b/>
+        </w:rPr>
+        <w:t xml:space="preserve"> </w:t>
+      </w:r>
+      <w:r>
+        <w:rPr>
+          <w:color w:val="000000" w:themeColor="text1"/>
+        </w:rPr>
+        <w:t>Proiectarea structurilor de date necesare stocării informațiilor de identificare, a istoricului programărilor, a datelor personale, a programului de fidelizare, precum și a fișei de alergii pentru asigurarea conformității sanitare și a siguranței clienților.</w:t>
+      </w:r>
+      <w:r>
+        <w:rPr>
+          <w:color w:val="000000" w:themeColor="text1"/>
+        </w:rPr>
+        <w:t xml:space="preserve"> </w:t>
+      </w:r>
+      <w:r>
+        <w:rPr>
           <w:bCs/>
           <w:color w:val="000000" w:themeColor="text1"/>
-          <w:sz w:val="24"/>
-          <w:szCs w:val="24"/>
-          <w:lang w:eastAsia="ro-RO"/>
         </w:rPr>
         <w:t>Proiectarea subsistemului de resurse u</w:t>
       </w:r>
       <w:r>
         <w:rPr>
-          <w:rFonts w:ascii="Times New Roman" w:eastAsia="Times New Roman" w:hAnsi="Times New Roman" w:cs="Times New Roman"/>
-          <w:b/>
           <w:bCs/>
           <w:color w:val="000000" w:themeColor="text1"/>
-          <w:sz w:val="24"/>
-          <w:szCs w:val="24"/>
-          <w:lang w:eastAsia="ro-RO"/>
         </w:rPr>
         <w:t>mane:</w:t>
       </w:r>
-    </w:p>
-    <w:p>
-      <w:pPr>
-        <w:spacing w:before="100" w:beforeAutospacing="1" w:after="100" w:afterAutospacing="1" w:line="240" w:lineRule="auto"/>
-        <w:ind w:left="720"/>
-        <w:rPr>
-          <w:rFonts w:ascii="Times New Roman" w:eastAsia="Times New Roman" w:hAnsi="Times New Roman" w:cs="Times New Roman"/>
-          <w:color w:val="000000" w:themeColor="text1"/>
-          <w:sz w:val="24"/>
-          <w:szCs w:val="24"/>
-          <w:lang w:eastAsia="ro-RO"/>
-        </w:rPr>
-      </w:pPr>
-      <w:r>
-        <w:rPr>
-          <w:rFonts w:ascii="Times New Roman" w:eastAsia="Times New Roman" w:hAnsi="Times New Roman" w:cs="Times New Roman"/>
-          <w:color w:val="000000" w:themeColor="text1"/>
-          <w:sz w:val="24"/>
-          <w:szCs w:val="24"/>
-          <w:lang w:eastAsia="ro-RO"/>
+      <w:r>
+        <w:rPr>
+          <w:bCs/>
+          <w:color w:val="000000" w:themeColor="text1"/>
+        </w:rPr>
+        <w:t xml:space="preserve"> </w:t>
+      </w:r>
+      <w:r>
+        <w:rPr>
+          <w:color w:val="000000" w:themeColor="text1"/>
         </w:rPr>
         <w:t>Crearea entităților dedicate evidenței personalului (tehnicieni și traineri), a specializărilor și acreditărilor profesionale deținute, alături de gestionarea programului de lucru, a concediilor și a disponibilității acestora.</w:t>
       </w:r>
-    </w:p>
-    <w:p>
-      <w:pPr>
-        <w:pStyle w:val="ListParagraph"/>
-        <w:numPr>
-          <w:ilvl w:val="0"/>
-          <w:numId w:val="14"/>
-        </w:numPr>
-        <w:spacing w:before="100" w:beforeAutospacing="1" w:after="100" w:afterAutospacing="1" w:line="240" w:lineRule="auto"/>
-        <w:rPr>
-          <w:rFonts w:ascii="Times New Roman" w:eastAsia="Times New Roman" w:hAnsi="Times New Roman" w:cs="Times New Roman"/>
-          <w:color w:val="000000" w:themeColor="text1"/>
-          <w:sz w:val="24"/>
-          <w:szCs w:val="24"/>
-          <w:lang w:eastAsia="ro-RO"/>
-        </w:rPr>
-      </w:pPr>
-      <w:r>
-        <w:rPr>
-          <w:rFonts w:ascii="Times New Roman" w:eastAsia="Times New Roman" w:hAnsi="Times New Roman" w:cs="Times New Roman"/>
-          <w:b/>
+      <w:r>
+        <w:rPr>
+          <w:color w:val="000000" w:themeColor="text1"/>
+        </w:rPr>
+        <w:t xml:space="preserve"> </w:t>
+      </w:r>
+      <w:r>
+        <w:rPr>
           <w:bCs/>
           <w:color w:val="000000" w:themeColor="text1"/>
-          <w:sz w:val="24"/>
-          <w:szCs w:val="24"/>
-          <w:lang w:eastAsia="ro-RO"/>
         </w:rPr>
         <w:t>Dezvol</w:t>
       </w:r>
       <w:r>
         <w:rPr>
-          <w:rFonts w:ascii="Times New Roman" w:eastAsia="Times New Roman" w:hAnsi="Times New Roman" w:cs="Times New Roman"/>
-          <w:b/>
           <w:bCs/>
           <w:color w:val="000000" w:themeColor="text1"/>
-          <w:sz w:val="24"/>
-          <w:szCs w:val="24"/>
-          <w:lang w:eastAsia="ro-RO"/>
         </w:rPr>
         <w:t>tarea modulului operațional de salon și a</w:t>
       </w:r>
       <w:r>
         <w:rPr>
-          <w:rFonts w:ascii="Times New Roman" w:eastAsia="Times New Roman" w:hAnsi="Times New Roman" w:cs="Times New Roman"/>
-          <w:b/>
           <w:bCs/>
           <w:color w:val="000000" w:themeColor="text1"/>
-          <w:sz w:val="24"/>
-          <w:szCs w:val="24"/>
-          <w:lang w:eastAsia="ro-RO"/>
         </w:rPr>
         <w:t>cademie:</w:t>
       </w:r>
-    </w:p>
-    <w:p>
-      <w:pPr>
-        <w:spacing w:before="100" w:beforeAutospacing="1" w:after="100" w:afterAutospacing="1" w:line="240" w:lineRule="auto"/>
-        <w:ind w:left="720"/>
-        <w:rPr>
-          <w:rFonts w:ascii="Times New Roman" w:eastAsia="Times New Roman" w:hAnsi="Times New Roman" w:cs="Times New Roman"/>
-          <w:color w:val="000000" w:themeColor="text1"/>
-          <w:sz w:val="24"/>
-          <w:szCs w:val="24"/>
-          <w:lang w:eastAsia="ro-RO"/>
-        </w:rPr>
-      </w:pPr>
-      <w:r>
-        <w:rPr>
-          <w:rFonts w:ascii="Times New Roman" w:eastAsia="Times New Roman" w:hAnsi="Times New Roman" w:cs="Times New Roman"/>
-          <w:color w:val="000000" w:themeColor="text1"/>
-          <w:sz w:val="24"/>
-          <w:szCs w:val="24"/>
-          <w:lang w:eastAsia="ro-RO"/>
+      <w:r>
+        <w:rPr>
+          <w:bCs/>
+          <w:color w:val="000000" w:themeColor="text1"/>
+        </w:rPr>
+        <w:t xml:space="preserve"> </w:t>
+      </w:r>
+      <w:r>
+        <w:rPr>
+          <w:color w:val="000000" w:themeColor="text1"/>
         </w:rPr>
         <w:t>Asigurarea suportului bazei de date pentru programarea serviciilor de salon, asocierea optimă cu personalul calificat, gestionarea înscrierilor la cursurile academiei și stocarea feedback-ului orientat spre calitatea serviciilor.</w:t>
       </w:r>
-    </w:p>
-    <w:p>
-      <w:pPr>
-        <w:pStyle w:val="ListParagraph"/>
-        <w:numPr>
-          <w:ilvl w:val="0"/>
-          <w:numId w:val="14"/>
-        </w:numPr>
-        <w:spacing w:before="100" w:beforeAutospacing="1" w:after="100" w:afterAutospacing="1" w:line="240" w:lineRule="auto"/>
-        <w:rPr>
-          <w:rFonts w:ascii="Times New Roman" w:hAnsi="Times New Roman" w:cs="Times New Roman"/>
-          <w:b/>
-          <w:color w:val="000000" w:themeColor="text1"/>
-          <w:sz w:val="24"/>
-          <w:szCs w:val="24"/>
-        </w:rPr>
-      </w:pPr>
-      <w:r>
-        <w:rPr>
-          <w:rFonts w:ascii="Times New Roman" w:hAnsi="Times New Roman" w:cs="Times New Roman"/>
-          <w:b/>
-          <w:color w:val="000000" w:themeColor="text1"/>
-          <w:sz w:val="24"/>
-          <w:szCs w:val="24"/>
-        </w:rPr>
-        <w:t xml:space="preserve">Gestiunea stocurilor, a aparaturii și a registrului de sterilizare: </w:t>
-      </w:r>
-    </w:p>
-    <w:p>
-      <w:pPr>
-        <w:pStyle w:val="ListParagraph"/>
-        <w:spacing w:before="100" w:beforeAutospacing="1" w:after="100" w:afterAutospacing="1" w:line="240" w:lineRule="auto"/>
-        <w:rPr>
-          <w:rFonts w:ascii="Times New Roman" w:hAnsi="Times New Roman" w:cs="Times New Roman"/>
-          <w:color w:val="000000" w:themeColor="text1"/>
-          <w:sz w:val="24"/>
-          <w:szCs w:val="24"/>
-        </w:rPr>
-      </w:pPr>
-    </w:p>
-    <w:p>
-      <w:pPr>
-        <w:pStyle w:val="ListParagraph"/>
-        <w:spacing w:before="100" w:beforeAutospacing="1" w:after="100" w:afterAutospacing="1" w:line="240" w:lineRule="auto"/>
-        <w:rPr>
-          <w:rFonts w:ascii="Times New Roman" w:hAnsi="Times New Roman" w:cs="Times New Roman"/>
-          <w:color w:val="000000" w:themeColor="text1"/>
-          <w:sz w:val="24"/>
-          <w:szCs w:val="24"/>
-        </w:rPr>
-      </w:pPr>
-      <w:r>
-        <w:rPr>
-          <w:rFonts w:ascii="Times New Roman" w:hAnsi="Times New Roman" w:cs="Times New Roman"/>
-          <w:color w:val="000000" w:themeColor="text1"/>
-          <w:sz w:val="24"/>
-          <w:szCs w:val="24"/>
-        </w:rPr>
-        <w:t xml:space="preserve">Monitorizarea riguroasă a stocurilor de produse, consumabile (disociind resursele de salon de cele didactice din academie), evidența aparaturii din dotare (lămpi, freze, sterilizatoare) și implementarea unui registru digital de sterilizare și igienizare pentru </w:t>
-      </w:r>
-      <w:r>
-        <w:rPr>
-          <w:rFonts w:ascii="Times New Roman" w:hAnsi="Times New Roman" w:cs="Times New Roman"/>
-          <w:color w:val="000000" w:themeColor="text1"/>
-          <w:sz w:val="24"/>
-          <w:szCs w:val="24"/>
-        </w:rPr>
-        <w:lastRenderedPageBreak/>
-        <w:t>urmărirea ciclurilor de sterilizare, a substanțelor de dezinfecție și a conformității sanitare.</w:t>
-      </w:r>
-    </w:p>
-    <w:p>
-      <w:pPr>
-        <w:pStyle w:val="ListParagraph"/>
-        <w:spacing w:before="100" w:beforeAutospacing="1" w:after="100" w:afterAutospacing="1" w:line="240" w:lineRule="auto"/>
-        <w:rPr>
-          <w:rFonts w:ascii="Times New Roman" w:hAnsi="Times New Roman" w:cs="Times New Roman"/>
-          <w:color w:val="000000" w:themeColor="text1"/>
-          <w:sz w:val="24"/>
-          <w:szCs w:val="24"/>
-        </w:rPr>
-      </w:pPr>
-    </w:p>
-    <w:p>
-      <w:pPr>
-        <w:pStyle w:val="ListParagraph"/>
-        <w:numPr>
-          <w:ilvl w:val="0"/>
-          <w:numId w:val="14"/>
-        </w:numPr>
-        <w:spacing w:before="100" w:beforeAutospacing="1" w:after="100" w:afterAutospacing="1" w:line="240" w:lineRule="auto"/>
-        <w:rPr>
-          <w:rFonts w:ascii="Times New Roman" w:hAnsi="Times New Roman" w:cs="Times New Roman"/>
-          <w:color w:val="000000" w:themeColor="text1"/>
-          <w:sz w:val="24"/>
-          <w:szCs w:val="24"/>
-        </w:rPr>
-      </w:pPr>
-      <w:r>
-        <w:rPr>
-          <w:rFonts w:ascii="Times New Roman" w:hAnsi="Times New Roman" w:cs="Times New Roman"/>
-          <w:b/>
+      <w:r>
+        <w:rPr>
+          <w:color w:val="000000" w:themeColor="text1"/>
+        </w:rPr>
+        <w:t xml:space="preserve"> </w:t>
+      </w:r>
+      <w:r>
+        <w:rPr>
+          <w:color w:val="000000" w:themeColor="text1"/>
+        </w:rPr>
+        <w:t>Gestiunea stocurilor, a aparaturii și a registrului de sterilizare: Monitorizarea riguroasă a stocurilor de produse, consumabile (disociind resursele de salon de cele didactice din academie), evidența aparaturii din dotare (lămpi, freze, sterilizatoare) și implementarea unui registru digital de sterilizare și igienizare pentru urmărirea ciclurilor de sterilizare, a substanțelor de dezinfecție și a conformității sanitare.</w:t>
+      </w:r>
+      <w:r>
+        <w:rPr>
+          <w:color w:val="000000" w:themeColor="text1"/>
+        </w:rPr>
+        <w:t xml:space="preserve"> </w:t>
+      </w:r>
+      <w:r>
+        <w:rPr>
           <w:bCs/>
           <w:color w:val="000000" w:themeColor="text1"/>
-          <w:sz w:val="24"/>
-          <w:szCs w:val="24"/>
         </w:rPr>
         <w:t>Implementarea politicilor de securitate și a drepturilor de acces:</w:t>
       </w:r>
       <w:r>
         <w:rPr>
-          <w:rFonts w:ascii="Times New Roman" w:hAnsi="Times New Roman" w:cs="Times New Roman"/>
-          <w:color w:val="000000" w:themeColor="text1"/>
-          <w:sz w:val="24"/>
-          <w:szCs w:val="24"/>
-        </w:rPr>
-        <w:t xml:space="preserve"> </w:t>
-      </w:r>
-    </w:p>
-    <w:p>
-      <w:pPr>
-        <w:pStyle w:val="ListParagraph"/>
-        <w:spacing w:before="100" w:beforeAutospacing="1" w:after="100" w:afterAutospacing="1" w:line="240" w:lineRule="auto"/>
-        <w:rPr>
-          <w:rFonts w:ascii="Times New Roman" w:hAnsi="Times New Roman" w:cs="Times New Roman"/>
-          <w:color w:val="000000" w:themeColor="text1"/>
-          <w:sz w:val="24"/>
-          <w:szCs w:val="24"/>
-        </w:rPr>
-      </w:pPr>
-    </w:p>
-    <w:p>
-      <w:pPr>
-        <w:pStyle w:val="ListParagraph"/>
-        <w:spacing w:before="100" w:beforeAutospacing="1" w:after="100" w:afterAutospacing="1" w:line="360" w:lineRule="auto"/>
-        <w:rPr>
-          <w:rFonts w:ascii="Times New Roman" w:hAnsi="Times New Roman" w:cs="Times New Roman"/>
-          <w:sz w:val="24"/>
-          <w:szCs w:val="24"/>
-        </w:rPr>
-      </w:pPr>
-      <w:r>
-        <w:rPr>
-          <w:rFonts w:ascii="Times New Roman" w:hAnsi="Times New Roman" w:cs="Times New Roman"/>
-          <w:color w:val="000000" w:themeColor="text1"/>
-          <w:sz w:val="24"/>
-          <w:szCs w:val="24"/>
-        </w:rPr>
-        <w:t xml:space="preserve">Proiectarea unor vizualizări (views) și roluri specifice pentru securizarea informațiilor, garantând că datele sunt accesate și modificate doar de personalul autorizat, în funcție de funcția </w:t>
-      </w:r>
-      <w:r>
-        <w:rPr>
-          <w:rFonts w:ascii="Times New Roman" w:hAnsi="Times New Roman" w:cs="Times New Roman"/>
-          <w:sz w:val="24"/>
-          <w:szCs w:val="24"/>
-        </w:rPr>
+          <w:color w:val="000000" w:themeColor="text1"/>
+        </w:rPr>
+        <w:t xml:space="preserve"> Proiectarea unor vizualizări (views) și roluri specifice pentru securizarea informațiilor, garantând că datele sunt accesate și modificate doar de personalul autorizat, în funcție de funcția </w:t>
+      </w:r>
+      <w:r>
         <w:t>ocupată (administrator, recepționer, trainer, tehnician).</w:t>
       </w:r>
     </w:p>
@@ -1776,6 +1547,7 @@
           <w:sz w:val="24"/>
           <w:szCs w:val="24"/>
         </w:rPr>
+        <w:lastRenderedPageBreak/>
         <w:t>Sistemul informatic propus este destinat gestionarii integrate a unui salon de infrumusetare si a unei academii de formare prfesionala in domeniu. In urma analizei fluxului operational real, au fost identificate cerinte de stocare si procesare a datelor. In primul rand, sistemul va gestiona datele personaelor implicate, retinand informatii de contact, un istoric medical relevant pentru prestarea serviciilor (precum alergiile sau bolile transmisbile) si detaliile unui sistem de fidelizare pentru clienti. In paralel, pentru angajati se va tine evidenta stricta a rolulilo, a specializarilor si a acreditarilor profesionale. Pe plan operational, baza de date va inregistra in detaliu programarile pentru serviciile de salon si participarea clientilor la cursurile academiei, asociind automat fiecare actiune cu tehnicianul sau trainerul corespunzator. O componenta critica o reprezinta gestiunea resurselor si a normelor de igiena, impunandu-se o trasabilitate clara a aparaturii utilizate. Aceasta este completata de necestitatea unui registru digital de sterilizare, completat de angajati, care sa ateste comformitatea proceselor de igienizare pentru aparatura si instrumentar. Nu in ultimul rand, sistemul va asigura evidenta centralizata a produselor consumabile, separand stocul alocat operatiunilor de salon de cel destinat procesului educational din academie.</w:t>
       </w:r>
     </w:p>
@@ -1837,16 +1609,7 @@
           <w:sz w:val="24"/>
           <w:szCs w:val="24"/>
         </w:rPr>
-        <w:t xml:space="preserve">academiei. Relațiile și cardinalitățile stabilite între aceste entități reflectă cu exactitate regulile de funcționare ale afacerii. Fluxul operațional de bază este modelat prin relații de tip unu-la-mulți (1:N), ilustrând faptul că un singur client poate efectua multiple </w:t>
-      </w:r>
-      <w:r>
-        <w:rPr>
-          <w:rFonts w:ascii="Times New Roman" w:hAnsi="Times New Roman" w:cs="Times New Roman"/>
-          <w:sz w:val="24"/>
-          <w:szCs w:val="24"/>
-        </w:rPr>
-        <w:lastRenderedPageBreak/>
-        <w:t>programări, iar un angajat poate presta mai multe servicii, preda diverse cursuri și completa succesiv registrul de sterilizare. Totodată, modelul conceptual surprinde și interacțiunile complexe specifice mediului fizic prin relații de tip mulți-la-mulți (M:N). Acestea evidențiază faptul că un curs reunește mai mulți clienți participanți, iar o anumită categorie de aparatură este necesară și alocată simultan atât pentru prestarea diverselor servicii de salon, cât și pentru susținerea orelor de practică din cadrul academiei.</w:t>
+        <w:t>academiei. Relațiile și cardinalitățile stabilite între aceste entități reflectă cu exactitate regulile de funcționare ale afacerii. Fluxul operațional de bază este modelat prin relații de tip unu-la-mulți (1:N), ilustrând faptul că un singur client poate efectua multiple programări, iar un angajat poate presta mai multe servicii, preda diverse cursuri și completa succesiv registrul de sterilizare. Totodată, modelul conceptual surprinde și interacțiunile complexe specifice mediului fizic prin relații de tip mulți-la-mulți (M:N). Acestea evidențiază faptul că un curs reunește mai mulți clienți participanți, iar o anumită categorie de aparatură este necesară și alocată simultan atât pentru prestarea diverselor servicii de salon, cât și pentru susținerea orelor de practică din cadrul academiei.</w:t>
       </w:r>
     </w:p>
     <w:p>
@@ -1865,6 +1628,7 @@
           <w:szCs w:val="24"/>
           <w:lang w:eastAsia="ro-RO"/>
         </w:rPr>
+        <w:lastRenderedPageBreak/>
         <w:drawing>
           <wp:inline distT="0" distB="0" distL="0" distR="0">
             <wp:extent cx="5340928" cy="6780093"/>
@@ -2895,7 +2659,7 @@
   <w:abstractNum w:abstractNumId="7" w15:restartNumberingAfterBreak="0">
     <w:nsid w:val="50C30A8E"/>
     <w:multiLevelType w:val="hybridMultilevel"/>
-    <w:tmpl w:val="C486ED9A"/>
+    <w:tmpl w:val="0FC086E8"/>
     <w:lvl w:ilvl="0" w:tplc="04180001">
       <w:start w:val="1"/>
       <w:numFmt w:val="bullet"/>
@@ -3417,6 +3181,119 @@
     </w:lvl>
   </w:abstractNum>
   <w:abstractNum w:abstractNumId="11" w15:restartNumberingAfterBreak="0">
+    <w:nsid w:val="5B0B0CA9"/>
+    <w:multiLevelType w:val="hybridMultilevel"/>
+    <w:tmpl w:val="CFD4B5B8"/>
+    <w:lvl w:ilvl="0" w:tplc="04180001">
+      <w:start w:val="1"/>
+      <w:numFmt w:val="bullet"/>
+      <w:lvlText w:val=""/>
+      <w:lvlJc w:val="left"/>
+      <w:pPr>
+        <w:ind w:left="720" w:hanging="360"/>
+      </w:pPr>
+      <w:rPr>
+        <w:rFonts w:ascii="Symbol" w:hAnsi="Symbol" w:hint="default"/>
+      </w:rPr>
+    </w:lvl>
+    <w:lvl w:ilvl="1" w:tplc="04180003">
+      <w:start w:val="1"/>
+      <w:numFmt w:val="bullet"/>
+      <w:lvlText w:val="o"/>
+      <w:lvlJc w:val="left"/>
+      <w:pPr>
+        <w:ind w:left="1440" w:hanging="360"/>
+      </w:pPr>
+      <w:rPr>
+        <w:rFonts w:ascii="Courier New" w:hAnsi="Courier New" w:cs="Courier New" w:hint="default"/>
+      </w:rPr>
+    </w:lvl>
+    <w:lvl w:ilvl="2" w:tplc="04180005" w:tentative="1">
+      <w:start w:val="1"/>
+      <w:numFmt w:val="bullet"/>
+      <w:lvlText w:val=""/>
+      <w:lvlJc w:val="left"/>
+      <w:pPr>
+        <w:ind w:left="2160" w:hanging="360"/>
+      </w:pPr>
+      <w:rPr>
+        <w:rFonts w:ascii="Wingdings" w:hAnsi="Wingdings" w:hint="default"/>
+      </w:rPr>
+    </w:lvl>
+    <w:lvl w:ilvl="3" w:tplc="04180001" w:tentative="1">
+      <w:start w:val="1"/>
+      <w:numFmt w:val="bullet"/>
+      <w:lvlText w:val=""/>
+      <w:lvlJc w:val="left"/>
+      <w:pPr>
+        <w:ind w:left="2880" w:hanging="360"/>
+      </w:pPr>
+      <w:rPr>
+        <w:rFonts w:ascii="Symbol" w:hAnsi="Symbol" w:hint="default"/>
+      </w:rPr>
+    </w:lvl>
+    <w:lvl w:ilvl="4" w:tplc="04180003" w:tentative="1">
+      <w:start w:val="1"/>
+      <w:numFmt w:val="bullet"/>
+      <w:lvlText w:val="o"/>
+      <w:lvlJc w:val="left"/>
+      <w:pPr>
+        <w:ind w:left="3600" w:hanging="360"/>
+      </w:pPr>
+      <w:rPr>
+        <w:rFonts w:ascii="Courier New" w:hAnsi="Courier New" w:cs="Courier New" w:hint="default"/>
+      </w:rPr>
+    </w:lvl>
+    <w:lvl w:ilvl="5" w:tplc="04180005" w:tentative="1">
+      <w:start w:val="1"/>
+      <w:numFmt w:val="bullet"/>
+      <w:lvlText w:val=""/>
+      <w:lvlJc w:val="left"/>
+      <w:pPr>
+        <w:ind w:left="4320" w:hanging="360"/>
+      </w:pPr>
+      <w:rPr>
+        <w:rFonts w:ascii="Wingdings" w:hAnsi="Wingdings" w:hint="default"/>
+      </w:rPr>
+    </w:lvl>
+    <w:lvl w:ilvl="6" w:tplc="04180001" w:tentative="1">
+      <w:start w:val="1"/>
+      <w:numFmt w:val="bullet"/>
+      <w:lvlText w:val=""/>
+      <w:lvlJc w:val="left"/>
+      <w:pPr>
+        <w:ind w:left="5040" w:hanging="360"/>
+      </w:pPr>
+      <w:rPr>
+        <w:rFonts w:ascii="Symbol" w:hAnsi="Symbol" w:hint="default"/>
+      </w:rPr>
+    </w:lvl>
+    <w:lvl w:ilvl="7" w:tplc="04180003" w:tentative="1">
+      <w:start w:val="1"/>
+      <w:numFmt w:val="bullet"/>
+      <w:lvlText w:val="o"/>
+      <w:lvlJc w:val="left"/>
+      <w:pPr>
+        <w:ind w:left="5760" w:hanging="360"/>
+      </w:pPr>
+      <w:rPr>
+        <w:rFonts w:ascii="Courier New" w:hAnsi="Courier New" w:cs="Courier New" w:hint="default"/>
+      </w:rPr>
+    </w:lvl>
+    <w:lvl w:ilvl="8" w:tplc="04180005" w:tentative="1">
+      <w:start w:val="1"/>
+      <w:numFmt w:val="bullet"/>
+      <w:lvlText w:val=""/>
+      <w:lvlJc w:val="left"/>
+      <w:pPr>
+        <w:ind w:left="6480" w:hanging="360"/>
+      </w:pPr>
+      <w:rPr>
+        <w:rFonts w:ascii="Wingdings" w:hAnsi="Wingdings" w:hint="default"/>
+      </w:rPr>
+    </w:lvl>
+  </w:abstractNum>
+  <w:abstractNum w:abstractNumId="12" w15:restartNumberingAfterBreak="0">
     <w:nsid w:val="717737FC"/>
     <w:multiLevelType w:val="hybridMultilevel"/>
     <w:tmpl w:val="FF146070"/>
@@ -3529,7 +3406,7 @@
       </w:rPr>
     </w:lvl>
   </w:abstractNum>
-  <w:abstractNum w:abstractNumId="12" w15:restartNumberingAfterBreak="0">
+  <w:abstractNum w:abstractNumId="13" w15:restartNumberingAfterBreak="0">
     <w:nsid w:val="7BA12F78"/>
     <w:multiLevelType w:val="multilevel"/>
     <w:tmpl w:val="8E68CAF8"/>
@@ -3678,7 +3555,7 @@
       </w:rPr>
     </w:lvl>
   </w:abstractNum>
-  <w:abstractNum w:abstractNumId="13" w15:restartNumberingAfterBreak="0">
+  <w:abstractNum w:abstractNumId="14" w15:restartNumberingAfterBreak="0">
     <w:nsid w:val="7F3159BA"/>
     <w:multiLevelType w:val="hybridMultilevel"/>
     <w:tmpl w:val="02BEB450"/>
@@ -3816,22 +3693,25 @@
     <w:abstractNumId w:val="10"/>
   </w:num>
   <w:num w:numId="9">
-    <w:abstractNumId w:val="12"/>
+    <w:abstractNumId w:val="13"/>
   </w:num>
   <w:num w:numId="10">
     <w:abstractNumId w:val="6"/>
   </w:num>
   <w:num w:numId="11">
-    <w:abstractNumId w:val="13"/>
+    <w:abstractNumId w:val="14"/>
   </w:num>
   <w:num w:numId="12">
-    <w:abstractNumId w:val="11"/>
+    <w:abstractNumId w:val="12"/>
   </w:num>
   <w:num w:numId="13">
     <w:abstractNumId w:val="0"/>
   </w:num>
   <w:num w:numId="14">
     <w:abstractNumId w:val="7"/>
+  </w:num>
+  <w:num w:numId="15">
+    <w:abstractNumId w:val="11"/>
   </w:num>
 </w:numbering>
 </file>
@@ -4829,7 +4709,7 @@
 </file>
 
 <file path=customXml/itemProps1.xml><?xml version="1.0" encoding="utf-8"?>
-<ds:datastoreItem xmlns:ds="http://schemas.openxmlformats.org/officeDocument/2006/customXml" ds:itemID="{F1112BFD-1EBD-4F70-9C41-76B817A6DC88}">
+<ds:datastoreItem xmlns:ds="http://schemas.openxmlformats.org/officeDocument/2006/customXml" ds:itemID="{E97E13A7-F44B-4F9C-94E7-AEB587A3535D}">
   <ds:schemaRefs>
     <ds:schemaRef ds:uri="http://schemas.openxmlformats.org/officeDocument/2006/bibliography"/>
   </ds:schemaRefs>

</xml_diff>

<commit_message>
refacut diagrama er salon/academie
</commit_message>
<xml_diff>
--- a/Anul_3/proiect_baze_de_date/docs/Proiect_BD.docx
+++ b/Anul_3/proiect_baze_de_date/docs/Proiect_BD.docx
@@ -734,129 +734,82 @@
             </w:rPr>
             <w:fldChar w:fldCharType="separate"/>
           </w:r>
-          <w:bookmarkStart w:id="0" w:name="_GoBack"/>
-          <w:bookmarkEnd w:id="0"/>
-          <w:r>
-            <w:rPr>
-              <w:rStyle w:val="Hyperlink"/>
-              <w:noProof/>
-            </w:rPr>
-            <w:fldChar w:fldCharType="begin"/>
-          </w:r>
-          <w:r>
-            <w:rPr>
-              <w:rStyle w:val="Hyperlink"/>
-              <w:noProof/>
-            </w:rPr>
-            <w:instrText xml:space="preserve"> </w:instrText>
-          </w:r>
-          <w:r>
-            <w:rPr>
-              <w:noProof/>
-            </w:rPr>
-            <w:instrText>HYPERLINK \l "_Toc244008943"</w:instrText>
-          </w:r>
-          <w:r>
-            <w:rPr>
-              <w:rStyle w:val="Hyperlink"/>
-              <w:noProof/>
-            </w:rPr>
-            <w:instrText xml:space="preserve"> </w:instrText>
-          </w:r>
-          <w:r>
-            <w:rPr>
-              <w:rStyle w:val="Hyperlink"/>
-              <w:noProof/>
-            </w:rPr>
-          </w:r>
-          <w:r>
-            <w:rPr>
-              <w:rStyle w:val="Hyperlink"/>
-              <w:noProof/>
-            </w:rPr>
-            <w:fldChar w:fldCharType="separate"/>
-          </w:r>
-          <w:r>
-            <w:rPr>
-              <w:rStyle w:val="Hyperlink"/>
-              <w:rFonts w:ascii="Times New Roman" w:hAnsi="Times New Roman" w:cs="Times New Roman"/>
-              <w:noProof/>
-              <w:lang w:val="en-US"/>
-            </w:rPr>
-            <w:t>1.</w:t>
-          </w:r>
-          <w:r>
-            <w:rPr>
-              <w:rFonts w:eastAsiaTheme="minorEastAsia"/>
-              <w:noProof/>
-              <w:lang w:eastAsia="ro-RO"/>
-            </w:rPr>
-            <w:tab/>
-          </w:r>
-          <w:r>
-            <w:rPr>
-              <w:rStyle w:val="Hyperlink"/>
-              <w:rFonts w:ascii="Times New Roman" w:hAnsi="Times New Roman" w:cs="Times New Roman"/>
-              <w:noProof/>
-              <w:lang w:val="en-US"/>
-            </w:rPr>
-            <w:t>Scopul proiectului</w:t>
-          </w:r>
-          <w:r>
-            <w:rPr>
-              <w:noProof/>
-              <w:webHidden/>
-            </w:rPr>
-            <w:tab/>
-          </w:r>
-          <w:r>
-            <w:rPr>
-              <w:noProof/>
-              <w:webHidden/>
-            </w:rPr>
-            <w:fldChar w:fldCharType="begin"/>
-          </w:r>
-          <w:r>
-            <w:rPr>
-              <w:noProof/>
-              <w:webHidden/>
-            </w:rPr>
-            <w:instrText xml:space="preserve"> PAGEREF _Toc244008943 \h </w:instrText>
-          </w:r>
-          <w:r>
-            <w:rPr>
-              <w:noProof/>
-              <w:webHidden/>
-            </w:rPr>
-          </w:r>
-          <w:r>
-            <w:rPr>
-              <w:noProof/>
-              <w:webHidden/>
-            </w:rPr>
-            <w:fldChar w:fldCharType="separate"/>
-          </w:r>
-          <w:r>
-            <w:rPr>
-              <w:noProof/>
-              <w:webHidden/>
-            </w:rPr>
-            <w:t>3</w:t>
-          </w:r>
-          <w:r>
-            <w:rPr>
-              <w:noProof/>
-              <w:webHidden/>
-            </w:rPr>
-            <w:fldChar w:fldCharType="end"/>
-          </w:r>
-          <w:r>
-            <w:rPr>
-              <w:rStyle w:val="Hyperlink"/>
-              <w:noProof/>
-            </w:rPr>
-            <w:fldChar w:fldCharType="end"/>
-          </w:r>
+          <w:hyperlink w:anchor="_Toc244008943" w:history="1">
+            <w:r>
+              <w:rPr>
+                <w:rStyle w:val="Hyperlink"/>
+                <w:rFonts w:ascii="Times New Roman" w:hAnsi="Times New Roman" w:cs="Times New Roman"/>
+                <w:noProof/>
+                <w:lang w:val="en-US"/>
+              </w:rPr>
+              <w:t>1.</w:t>
+            </w:r>
+            <w:r>
+              <w:rPr>
+                <w:rFonts w:eastAsiaTheme="minorEastAsia"/>
+                <w:noProof/>
+                <w:lang w:eastAsia="ro-RO"/>
+              </w:rPr>
+              <w:tab/>
+            </w:r>
+            <w:r>
+              <w:rPr>
+                <w:rStyle w:val="Hyperlink"/>
+                <w:rFonts w:ascii="Times New Roman" w:hAnsi="Times New Roman" w:cs="Times New Roman"/>
+                <w:noProof/>
+                <w:lang w:val="en-US"/>
+              </w:rPr>
+              <w:t>Scopul proiectului</w:t>
+            </w:r>
+            <w:r>
+              <w:rPr>
+                <w:noProof/>
+                <w:webHidden/>
+              </w:rPr>
+              <w:tab/>
+            </w:r>
+            <w:r>
+              <w:rPr>
+                <w:noProof/>
+                <w:webHidden/>
+              </w:rPr>
+              <w:fldChar w:fldCharType="begin"/>
+            </w:r>
+            <w:r>
+              <w:rPr>
+                <w:noProof/>
+                <w:webHidden/>
+              </w:rPr>
+              <w:instrText xml:space="preserve"> PAGEREF _Toc244008943 \h </w:instrText>
+            </w:r>
+            <w:r>
+              <w:rPr>
+                <w:noProof/>
+                <w:webHidden/>
+              </w:rPr>
+            </w:r>
+            <w:r>
+              <w:rPr>
+                <w:noProof/>
+                <w:webHidden/>
+              </w:rPr>
+              <w:fldChar w:fldCharType="separate"/>
+            </w:r>
+            <w:r>
+              <w:rPr>
+                <w:noProof/>
+                <w:webHidden/>
+              </w:rPr>
+              <w:t>3</w:t>
+            </w:r>
+            <w:r>
+              <w:rPr>
+                <w:noProof/>
+                <w:webHidden/>
+              </w:rPr>
+              <w:fldChar w:fldCharType="end"/>
+            </w:r>
+          </w:hyperlink>
         </w:p>
         <w:p>
           <w:pPr>
@@ -1244,7 +1197,7 @@
           <w:lang w:val="en-US"/>
         </w:rPr>
       </w:pPr>
-      <w:bookmarkStart w:id="1" w:name="_Toc244008943"/>
+      <w:bookmarkStart w:id="0" w:name="_Toc244008943"/>
       <w:proofErr w:type="spellStart"/>
       <w:r>
         <w:rPr>
@@ -1273,7 +1226,7 @@
         </w:rPr>
         <w:t>proiectului</w:t>
       </w:r>
-      <w:bookmarkEnd w:id="1"/>
+      <w:bookmarkEnd w:id="0"/>
       <w:proofErr w:type="spellEnd"/>
     </w:p>
     <w:p>
@@ -1404,7 +1357,7 @@
           <w:lang w:val="en-US"/>
         </w:rPr>
       </w:pPr>
-      <w:bookmarkStart w:id="2" w:name="_Toc244008944"/>
+      <w:bookmarkStart w:id="1" w:name="_Toc244008944"/>
       <w:proofErr w:type="spellStart"/>
       <w:r>
         <w:rPr>
@@ -1432,7 +1385,7 @@
         </w:rPr>
         <w:t>proiectului</w:t>
       </w:r>
-      <w:bookmarkEnd w:id="2"/>
+      <w:bookmarkEnd w:id="1"/>
       <w:proofErr w:type="spellEnd"/>
     </w:p>
     <w:p>
@@ -1483,7 +1436,7 @@
           <w:color w:val="000000" w:themeColor="text1"/>
         </w:rPr>
       </w:pPr>
-      <w:bookmarkStart w:id="3" w:name="_Toc244008945"/>
+      <w:bookmarkStart w:id="2" w:name="_Toc244008945"/>
       <w:r>
         <w:rPr>
           <w:rFonts w:ascii="Times New Roman" w:hAnsi="Times New Roman" w:cs="Times New Roman"/>
@@ -1492,33 +1445,33 @@
         <w:lastRenderedPageBreak/>
         <w:t>Proiectare</w:t>
       </w:r>
+      <w:bookmarkEnd w:id="2"/>
+    </w:p>
+    <w:p>
+      <w:pPr>
+        <w:rPr>
+          <w:rFonts w:ascii="Times New Roman" w:hAnsi="Times New Roman" w:cs="Times New Roman"/>
+          <w:color w:val="000000" w:themeColor="text1"/>
+        </w:rPr>
+      </w:pPr>
+    </w:p>
+    <w:p>
+      <w:pPr>
+        <w:pStyle w:val="Heading2"/>
+        <w:rPr>
+          <w:rFonts w:ascii="Times New Roman" w:hAnsi="Times New Roman" w:cs="Times New Roman"/>
+          <w:color w:val="000000" w:themeColor="text1"/>
+        </w:rPr>
+      </w:pPr>
+      <w:bookmarkStart w:id="3" w:name="_Toc244008946"/>
+      <w:r>
+        <w:rPr>
+          <w:rFonts w:ascii="Times New Roman" w:hAnsi="Times New Roman" w:cs="Times New Roman"/>
+          <w:color w:val="000000" w:themeColor="text1"/>
+        </w:rPr>
+        <w:t>Analiza cerintelor</w:t>
+      </w:r>
       <w:bookmarkEnd w:id="3"/>
-    </w:p>
-    <w:p>
-      <w:pPr>
-        <w:rPr>
-          <w:rFonts w:ascii="Times New Roman" w:hAnsi="Times New Roman" w:cs="Times New Roman"/>
-          <w:color w:val="000000" w:themeColor="text1"/>
-        </w:rPr>
-      </w:pPr>
-    </w:p>
-    <w:p>
-      <w:pPr>
-        <w:pStyle w:val="Heading2"/>
-        <w:rPr>
-          <w:rFonts w:ascii="Times New Roman" w:hAnsi="Times New Roman" w:cs="Times New Roman"/>
-          <w:color w:val="000000" w:themeColor="text1"/>
-        </w:rPr>
-      </w:pPr>
-      <w:bookmarkStart w:id="4" w:name="_Toc244008946"/>
-      <w:r>
-        <w:rPr>
-          <w:rFonts w:ascii="Times New Roman" w:hAnsi="Times New Roman" w:cs="Times New Roman"/>
-          <w:color w:val="000000" w:themeColor="text1"/>
-        </w:rPr>
-        <w:t>Analiza cerintelor</w:t>
-      </w:r>
-      <w:bookmarkEnd w:id="4"/>
     </w:p>
     <w:p>
       <w:pPr>
@@ -1700,7 +1653,7 @@
           <w:color w:val="000000" w:themeColor="text1"/>
         </w:rPr>
       </w:pPr>
-      <w:bookmarkStart w:id="5" w:name="_Toc244008947"/>
+      <w:bookmarkStart w:id="4" w:name="_Toc244008947"/>
       <w:r>
         <w:rPr>
           <w:rFonts w:ascii="Times New Roman" w:hAnsi="Times New Roman" w:cs="Times New Roman"/>
@@ -1708,7 +1661,7 @@
         </w:rPr>
         <w:t>Modelul conceptual (Diagrama ER)</w:t>
       </w:r>
-      <w:bookmarkEnd w:id="5"/>
+      <w:bookmarkEnd w:id="4"/>
     </w:p>
     <w:p>
       <w:pPr>
@@ -1774,11 +1727,10 @@
           <w:szCs w:val="24"/>
           <w:lang w:eastAsia="ro-RO"/>
         </w:rPr>
-        <w:lastRenderedPageBreak/>
         <w:drawing>
           <wp:inline distT="0" distB="0" distL="0" distR="0">
-            <wp:extent cx="5340928" cy="6780093"/>
-            <wp:effectExtent l="0" t="0" r="0" b="1905"/>
+            <wp:extent cx="3655555" cy="4640580"/>
+            <wp:effectExtent l="0" t="0" r="2540" b="7620"/>
             <wp:docPr id="2" name="Picture 2"/>
             <wp:cNvGraphicFramePr>
               <a:graphicFrameLocks xmlns:a="http://schemas.openxmlformats.org/drawingml/2006/main" noChangeAspect="1"/>
@@ -1805,7 +1757,7 @@
                   <pic:spPr>
                     <a:xfrm>
                       <a:off x="0" y="0"/>
-                      <a:ext cx="5343724" cy="6783643"/>
+                      <a:ext cx="3661437" cy="4648047"/>
                     </a:xfrm>
                     <a:prstGeom prst="rect">
                       <a:avLst/>
@@ -1817,6 +1769,8 @@
           </wp:inline>
         </w:drawing>
       </w:r>
+      <w:bookmarkStart w:id="5" w:name="_GoBack"/>
+      <w:bookmarkEnd w:id="5"/>
     </w:p>
     <w:sectPr>
       <w:footerReference w:type="default" r:id="rId9"/>
@@ -1890,7 +1844,7 @@
           <w:rPr>
             <w:noProof/>
           </w:rPr>
-          <w:t>9</w:t>
+          <w:t>7</w:t>
         </w:r>
         <w:r>
           <w:rPr>
@@ -4869,7 +4823,7 @@
 </file>
 
 <file path=customXml/itemProps1.xml><?xml version="1.0" encoding="utf-8"?>
-<ds:datastoreItem xmlns:ds="http://schemas.openxmlformats.org/officeDocument/2006/customXml" ds:itemID="{A4B14E8E-D841-4729-A362-CD8A60FFFB52}">
+<ds:datastoreItem xmlns:ds="http://schemas.openxmlformats.org/officeDocument/2006/customXml" ds:itemID="{A5B1AD56-CF9B-44C0-8273-1FEA06E3F959}">
   <ds:schemaRefs>
     <ds:schemaRef ds:uri="http://schemas.openxmlformats.org/officeDocument/2006/bibliography"/>
   </ds:schemaRefs>

</xml_diff>

<commit_message>
updated docs (model conceptual adaugat)
</commit_message>
<xml_diff>
--- a/Anul_3/proiect_baze_de_date/docs/Proiect_BD.docx
+++ b/Anul_3/proiect_baze_de_date/docs/Proiect_BD.docx
@@ -134,6 +134,7 @@
           <w:lang w:val="en-US"/>
         </w:rPr>
       </w:pPr>
+      <w:proofErr w:type="spellStart"/>
       <w:r>
         <w:rPr>
           <w:rFonts w:ascii="Times New Roman" w:hAnsi="Times New Roman" w:cs="Times New Roman"/>
@@ -142,7 +143,18 @@
           <w:szCs w:val="40"/>
           <w:lang w:val="en-US"/>
         </w:rPr>
-        <w:t xml:space="preserve">Proiect </w:t>
+        <w:t>Proiect</w:t>
+      </w:r>
+      <w:proofErr w:type="spellEnd"/>
+      <w:r>
+        <w:rPr>
+          <w:rFonts w:ascii="Times New Roman" w:hAnsi="Times New Roman" w:cs="Times New Roman"/>
+          <w:color w:val="000000" w:themeColor="text1"/>
+          <w:sz w:val="40"/>
+          <w:szCs w:val="40"/>
+          <w:lang w:val="en-US"/>
+        </w:rPr>
+        <w:t xml:space="preserve"> </w:t>
       </w:r>
       <w:proofErr w:type="spellStart"/>
       <w:r>
@@ -734,7 +746,7 @@
             </w:rPr>
             <w:fldChar w:fldCharType="separate"/>
           </w:r>
-          <w:hyperlink w:anchor="_Toc244008943" w:history="1">
+          <w:hyperlink w:anchor="_Toc244079896" w:history="1">
             <w:r>
               <w:rPr>
                 <w:rStyle w:val="Hyperlink"/>
@@ -780,7 +792,7 @@
                 <w:noProof/>
                 <w:webHidden/>
               </w:rPr>
-              <w:instrText xml:space="preserve"> PAGEREF _Toc244008943 \h </w:instrText>
+              <w:instrText xml:space="preserve"> PAGEREF _Toc244079896 \h </w:instrText>
             </w:r>
             <w:r>
               <w:rPr>
@@ -824,7 +836,7 @@
               <w:lang w:eastAsia="ro-RO"/>
             </w:rPr>
           </w:pPr>
-          <w:hyperlink w:anchor="_Toc244008944" w:history="1">
+          <w:hyperlink w:anchor="_Toc244079897" w:history="1">
             <w:r>
               <w:rPr>
                 <w:rStyle w:val="Hyperlink"/>
@@ -870,7 +882,7 @@
                 <w:noProof/>
                 <w:webHidden/>
               </w:rPr>
-              <w:instrText xml:space="preserve"> PAGEREF _Toc244008944 \h </w:instrText>
+              <w:instrText xml:space="preserve"> PAGEREF _Toc244079897 \h </w:instrText>
             </w:r>
             <w:r>
               <w:rPr>
@@ -914,7 +926,7 @@
               <w:lang w:eastAsia="ro-RO"/>
             </w:rPr>
           </w:pPr>
-          <w:hyperlink w:anchor="_Toc244008945" w:history="1">
+          <w:hyperlink w:anchor="_Toc244079898" w:history="1">
             <w:r>
               <w:rPr>
                 <w:rStyle w:val="Hyperlink"/>
@@ -958,7 +970,7 @@
                 <w:noProof/>
                 <w:webHidden/>
               </w:rPr>
-              <w:instrText xml:space="preserve"> PAGEREF _Toc244008945 \h </w:instrText>
+              <w:instrText xml:space="preserve"> PAGEREF _Toc244079898 \h </w:instrText>
             </w:r>
             <w:r>
               <w:rPr>
@@ -1001,7 +1013,7 @@
               <w:lang w:eastAsia="ro-RO"/>
             </w:rPr>
           </w:pPr>
-          <w:hyperlink w:anchor="_Toc244008946" w:history="1">
+          <w:hyperlink w:anchor="_Toc244079899" w:history="1">
             <w:r>
               <w:rPr>
                 <w:rStyle w:val="Hyperlink"/>
@@ -1029,7 +1041,7 @@
                 <w:noProof/>
                 <w:webHidden/>
               </w:rPr>
-              <w:instrText xml:space="preserve"> PAGEREF _Toc244008946 \h </w:instrText>
+              <w:instrText xml:space="preserve"> PAGEREF _Toc244079899 \h </w:instrText>
             </w:r>
             <w:r>
               <w:rPr>
@@ -1072,7 +1084,7 @@
               <w:lang w:eastAsia="ro-RO"/>
             </w:rPr>
           </w:pPr>
-          <w:hyperlink w:anchor="_Toc244008947" w:history="1">
+          <w:hyperlink w:anchor="_Toc244079900" w:history="1">
             <w:r>
               <w:rPr>
                 <w:rStyle w:val="Hyperlink"/>
@@ -1100,7 +1112,7 @@
                 <w:noProof/>
                 <w:webHidden/>
               </w:rPr>
-              <w:instrText xml:space="preserve"> PAGEREF _Toc244008947 \h </w:instrText>
+              <w:instrText xml:space="preserve"> PAGEREF _Toc244079900 \h </w:instrText>
             </w:r>
             <w:r>
               <w:rPr>
@@ -1120,7 +1132,7 @@
                 <w:noProof/>
                 <w:webHidden/>
               </w:rPr>
-              <w:t>7</w:t>
+              <w:t>8</w:t>
             </w:r>
             <w:r>
               <w:rPr>
@@ -1197,7 +1209,7 @@
           <w:lang w:val="en-US"/>
         </w:rPr>
       </w:pPr>
-      <w:bookmarkStart w:id="0" w:name="_Toc244008943"/>
+      <w:bookmarkStart w:id="0" w:name="_Toc244079896"/>
       <w:proofErr w:type="spellStart"/>
       <w:r>
         <w:rPr>
@@ -1357,7 +1369,7 @@
           <w:lang w:val="en-US"/>
         </w:rPr>
       </w:pPr>
-      <w:bookmarkStart w:id="1" w:name="_Toc244008944"/>
+      <w:bookmarkStart w:id="1" w:name="_Toc244079897"/>
       <w:proofErr w:type="spellStart"/>
       <w:r>
         <w:rPr>
@@ -1436,7 +1448,7 @@
           <w:color w:val="000000" w:themeColor="text1"/>
         </w:rPr>
       </w:pPr>
-      <w:bookmarkStart w:id="2" w:name="_Toc244008945"/>
+      <w:bookmarkStart w:id="2" w:name="_Toc244079898"/>
       <w:r>
         <w:rPr>
           <w:rFonts w:ascii="Times New Roman" w:hAnsi="Times New Roman" w:cs="Times New Roman"/>
@@ -1463,7 +1475,7 @@
           <w:color w:val="000000" w:themeColor="text1"/>
         </w:rPr>
       </w:pPr>
-      <w:bookmarkStart w:id="3" w:name="_Toc244008946"/>
+      <w:bookmarkStart w:id="3" w:name="_Toc244079899"/>
       <w:r>
         <w:rPr>
           <w:rFonts w:ascii="Times New Roman" w:hAnsi="Times New Roman" w:cs="Times New Roman"/>
@@ -1638,6 +1650,24 @@
     <w:p>
       <w:pPr>
         <w:rPr>
+          <w:rFonts w:ascii="Times New Roman" w:eastAsia="Times New Roman" w:hAnsi="Times New Roman" w:cs="Times New Roman"/>
+          <w:sz w:val="24"/>
+          <w:szCs w:val="24"/>
+          <w:lang w:eastAsia="ro-RO"/>
+        </w:rPr>
+      </w:pPr>
+      <w:r>
+        <w:br w:type="page"/>
+      </w:r>
+    </w:p>
+    <w:p>
+      <w:pPr>
+        <w:pStyle w:val="my-2"/>
+      </w:pPr>
+    </w:p>
+    <w:p>
+      <w:pPr>
+        <w:rPr>
           <w:rFonts w:ascii="Times New Roman" w:hAnsi="Times New Roman" w:cs="Times New Roman"/>
           <w:color w:val="000000" w:themeColor="text1"/>
           <w:sz w:val="24"/>
@@ -1653,7 +1683,7 @@
           <w:color w:val="000000" w:themeColor="text1"/>
         </w:rPr>
       </w:pPr>
-      <w:bookmarkStart w:id="4" w:name="_Toc244008947"/>
+      <w:bookmarkStart w:id="4" w:name="_Toc244079900"/>
       <w:r>
         <w:rPr>
           <w:rFonts w:ascii="Times New Roman" w:hAnsi="Times New Roman" w:cs="Times New Roman"/>
@@ -1668,70 +1698,479 @@
         <w:rPr>
           <w:rFonts w:ascii="Times New Roman" w:hAnsi="Times New Roman" w:cs="Times New Roman"/>
           <w:color w:val="000000" w:themeColor="text1"/>
-        </w:rPr>
-      </w:pPr>
-    </w:p>
-    <w:p>
-      <w:pPr>
-        <w:rPr>
-          <w:rFonts w:ascii="Times New Roman" w:hAnsi="Times New Roman" w:cs="Times New Roman"/>
-          <w:color w:val="000000" w:themeColor="text1"/>
-          <w:sz w:val="24"/>
-          <w:szCs w:val="24"/>
-        </w:rPr>
-      </w:pPr>
-      <w:r>
-        <w:rPr>
-          <w:rFonts w:ascii="Times New Roman" w:hAnsi="Times New Roman" w:cs="Times New Roman"/>
-          <w:color w:val="000000" w:themeColor="text1"/>
-          <w:sz w:val="24"/>
-          <w:szCs w:val="24"/>
-        </w:rPr>
-        <w:t xml:space="preserve">Pentru modelarea conceptuala a datelor s-a utilizat Diagrama Entitate-Relatie (ER) abordand notatia care descrie arhitectura logica a sistemului independent de platforma tehnica pe care va fi implementata baza de date. Arhitectura se fundamenteaza pe opt entitati principale, fiecare dispunand de o cheie primara. Entitatile „Client” si „Angajat” stocheaza datele </w:t>
-      </w:r>
-      <w:r>
-        <w:rPr>
-          <w:rFonts w:ascii="Times New Roman" w:hAnsi="Times New Roman" w:cs="Times New Roman"/>
-          <w:color w:val="000000" w:themeColor="text1"/>
+          <w:sz w:val="24"/>
+          <w:szCs w:val="24"/>
+        </w:rPr>
+      </w:pPr>
+    </w:p>
+    <w:p>
+      <w:pPr>
+        <w:rPr>
+          <w:rFonts w:ascii="Times New Roman" w:hAnsi="Times New Roman" w:cs="Times New Roman"/>
+          <w:sz w:val="24"/>
+          <w:szCs w:val="24"/>
+        </w:rPr>
+      </w:pPr>
+      <w:r>
+        <w:rPr>
+          <w:rFonts w:ascii="Times New Roman" w:hAnsi="Times New Roman" w:cs="Times New Roman"/>
+          <w:sz w:val="24"/>
+          <w:szCs w:val="24"/>
+        </w:rPr>
+        <w:t>Modelul conceptual al proiectului este prezentat prin două diagrame Entitate–Relație, care descriu informațiile necesare activității salonului de manichiură și academiei de nail art și legăturile dintre acestea. Pentru reprezentare au fost folosite dreptunghiuri pentru entități, ovale pentru atribute și romburi pentru relații. Cardinalitățile asociate relațiilor indică numărul de înregistrări care pot fi legate între ele. Modelul este împărțit în două figuri pentru a păstra lizibilitatea: prima prezintă activitatea salonului și a academiei, iar a doua prezintă gestionarea produselor, a aparaturii, a instrumentarului și a operațiunilor de dezinfectare și sterilizare. Entitățile comune celor două figuri reprezintă aceleași categorii de informații și asigură legătura dintre activitățile descrise.</w:t>
+      </w:r>
+      <w:r>
+        <w:rPr>
+          <w:rFonts w:ascii="Times New Roman" w:hAnsi="Times New Roman" w:cs="Times New Roman"/>
+          <w:sz w:val="24"/>
+          <w:szCs w:val="24"/>
+        </w:rPr>
+        <w:t xml:space="preserve"> </w:t>
+      </w:r>
+      <w:r>
+        <w:rPr>
+          <w:rFonts w:ascii="Times New Roman" w:hAnsi="Times New Roman" w:cs="Times New Roman"/>
+          <w:sz w:val="24"/>
+          <w:szCs w:val="24"/>
+        </w:rPr>
+        <w:t xml:space="preserve"> </w:t>
+      </w:r>
+    </w:p>
+    <w:p>
+      <w:pPr>
+        <w:rPr>
+          <w:rFonts w:ascii="Times New Roman" w:hAnsi="Times New Roman" w:cs="Times New Roman"/>
+          <w:sz w:val="24"/>
+          <w:szCs w:val="24"/>
+        </w:rPr>
+      </w:pPr>
+      <w:r>
+        <w:rPr>
+          <w:rFonts w:ascii="Times New Roman" w:hAnsi="Times New Roman" w:cs="Times New Roman"/>
+          <w:sz w:val="24"/>
+          <w:szCs w:val="24"/>
+        </w:rPr>
+        <w:t xml:space="preserve">Prima parte a modelului cuprinde entitățile </w:t>
+      </w:r>
+      <w:r>
+        <w:rPr>
+          <w:rStyle w:val="HTMLCode"/>
+          <w:rFonts w:ascii="Times New Roman" w:eastAsiaTheme="minorHAnsi" w:hAnsi="Times New Roman" w:cs="Times New Roman"/>
+          <w:sz w:val="24"/>
+          <w:szCs w:val="24"/>
+        </w:rPr>
+        <w:t>Client</w:t>
+      </w:r>
+      <w:r>
+        <w:rPr>
+          <w:rFonts w:ascii="Times New Roman" w:hAnsi="Times New Roman" w:cs="Times New Roman"/>
+          <w:sz w:val="24"/>
+          <w:szCs w:val="24"/>
+        </w:rPr>
+        <w:t xml:space="preserve">, </w:t>
+      </w:r>
+      <w:r>
+        <w:rPr>
+          <w:rStyle w:val="HTMLCode"/>
+          <w:rFonts w:ascii="Times New Roman" w:eastAsiaTheme="minorHAnsi" w:hAnsi="Times New Roman" w:cs="Times New Roman"/>
+          <w:sz w:val="24"/>
+          <w:szCs w:val="24"/>
+        </w:rPr>
+        <w:t>Angajat</w:t>
+      </w:r>
+      <w:r>
+        <w:rPr>
+          <w:rFonts w:ascii="Times New Roman" w:hAnsi="Times New Roman" w:cs="Times New Roman"/>
+          <w:sz w:val="24"/>
+          <w:szCs w:val="24"/>
+        </w:rPr>
+        <w:t xml:space="preserve">, </w:t>
+      </w:r>
+      <w:r>
+        <w:rPr>
+          <w:rStyle w:val="HTMLCode"/>
+          <w:rFonts w:ascii="Times New Roman" w:eastAsiaTheme="minorHAnsi" w:hAnsi="Times New Roman" w:cs="Times New Roman"/>
+          <w:sz w:val="24"/>
+          <w:szCs w:val="24"/>
+        </w:rPr>
+        <w:t>Programare</w:t>
+      </w:r>
+      <w:r>
+        <w:rPr>
+          <w:rFonts w:ascii="Times New Roman" w:hAnsi="Times New Roman" w:cs="Times New Roman"/>
+          <w:sz w:val="24"/>
+          <w:szCs w:val="24"/>
+        </w:rPr>
+        <w:t xml:space="preserve">, </w:t>
+      </w:r>
+      <w:r>
+        <w:rPr>
+          <w:rStyle w:val="HTMLCode"/>
+          <w:rFonts w:ascii="Times New Roman" w:eastAsiaTheme="minorHAnsi" w:hAnsi="Times New Roman" w:cs="Times New Roman"/>
+          <w:sz w:val="24"/>
+          <w:szCs w:val="24"/>
+        </w:rPr>
+        <w:t>Serviciu</w:t>
+      </w:r>
+      <w:r>
+        <w:rPr>
+          <w:rFonts w:ascii="Times New Roman" w:hAnsi="Times New Roman" w:cs="Times New Roman"/>
+          <w:sz w:val="24"/>
+          <w:szCs w:val="24"/>
+        </w:rPr>
+        <w:t xml:space="preserve">, </w:t>
+      </w:r>
+      <w:r>
+        <w:rPr>
+          <w:rStyle w:val="HTMLCode"/>
+          <w:rFonts w:ascii="Times New Roman" w:eastAsiaTheme="minorHAnsi" w:hAnsi="Times New Roman" w:cs="Times New Roman"/>
+          <w:sz w:val="24"/>
+          <w:szCs w:val="24"/>
+        </w:rPr>
+        <w:t>Interval_Disponibilitate</w:t>
+      </w:r>
+      <w:r>
+        <w:rPr>
+          <w:rFonts w:ascii="Times New Roman" w:hAnsi="Times New Roman" w:cs="Times New Roman"/>
+          <w:sz w:val="24"/>
+          <w:szCs w:val="24"/>
+        </w:rPr>
+        <w:t xml:space="preserve"> și </w:t>
+      </w:r>
+      <w:r>
+        <w:rPr>
+          <w:rStyle w:val="HTMLCode"/>
+          <w:rFonts w:ascii="Times New Roman" w:eastAsiaTheme="minorHAnsi" w:hAnsi="Times New Roman" w:cs="Times New Roman"/>
+          <w:sz w:val="24"/>
+          <w:szCs w:val="24"/>
+        </w:rPr>
+        <w:t>Feedback</w:t>
+      </w:r>
+      <w:r>
+        <w:rPr>
+          <w:rFonts w:ascii="Times New Roman" w:hAnsi="Times New Roman" w:cs="Times New Roman"/>
+          <w:sz w:val="24"/>
+          <w:szCs w:val="24"/>
+        </w:rPr>
+        <w:t xml:space="preserve">. Entitatea </w:t>
+      </w:r>
+      <w:r>
+        <w:rPr>
+          <w:rStyle w:val="HTMLCode"/>
+          <w:rFonts w:ascii="Times New Roman" w:eastAsiaTheme="minorHAnsi" w:hAnsi="Times New Roman" w:cs="Times New Roman"/>
+          <w:sz w:val="24"/>
+          <w:szCs w:val="24"/>
+        </w:rPr>
+        <w:t>Client</w:t>
+      </w:r>
+      <w:r>
+        <w:rPr>
+          <w:rFonts w:ascii="Times New Roman" w:hAnsi="Times New Roman" w:cs="Times New Roman"/>
+          <w:sz w:val="24"/>
+          <w:szCs w:val="24"/>
+        </w:rPr>
+        <w:t xml:space="preserve"> păstrează informațiile de identificare și de contact, alături de datele privind fidelizarea. Entitatea </w:t>
+      </w:r>
+      <w:r>
+        <w:rPr>
+          <w:rStyle w:val="HTMLCode"/>
+          <w:rFonts w:ascii="Times New Roman" w:eastAsiaTheme="minorHAnsi" w:hAnsi="Times New Roman" w:cs="Times New Roman"/>
+          <w:sz w:val="24"/>
+          <w:szCs w:val="24"/>
+        </w:rPr>
+        <w:t>Angajat</w:t>
+      </w:r>
+      <w:r>
+        <w:rPr>
+          <w:rFonts w:ascii="Times New Roman" w:hAnsi="Times New Roman" w:cs="Times New Roman"/>
+          <w:sz w:val="24"/>
+          <w:szCs w:val="24"/>
+        </w:rPr>
+        <w:t xml:space="preserve"> descrie personalul salonului și al academiei, prin informații despre identificare, contact, roluri, specializări și certificări. Disponibilitatea angajaților este reprezentată separat, prin intervalele care vor fi luate în considerare la organizarea activităților.</w:t>
+      </w:r>
+      <w:r>
+        <w:rPr>
+          <w:rFonts w:ascii="Times New Roman" w:hAnsi="Times New Roman" w:cs="Times New Roman"/>
+          <w:sz w:val="24"/>
+          <w:szCs w:val="24"/>
+        </w:rPr>
+        <w:t xml:space="preserve"> </w:t>
+      </w:r>
+      <w:r>
+        <w:rPr>
+          <w:rFonts w:ascii="Times New Roman" w:hAnsi="Times New Roman" w:cs="Times New Roman"/>
+          <w:sz w:val="24"/>
+          <w:szCs w:val="24"/>
+        </w:rPr>
+        <w:t xml:space="preserve">Entitatea </w:t>
+      </w:r>
+      <w:r>
+        <w:rPr>
+          <w:rStyle w:val="HTMLCode"/>
+          <w:rFonts w:ascii="Times New Roman" w:eastAsiaTheme="minorHAnsi" w:hAnsi="Times New Roman" w:cs="Times New Roman"/>
+          <w:sz w:val="24"/>
+          <w:szCs w:val="24"/>
+        </w:rPr>
+        <w:t>Programare</w:t>
+      </w:r>
+      <w:r>
+        <w:rPr>
+          <w:rFonts w:ascii="Times New Roman" w:hAnsi="Times New Roman" w:cs="Times New Roman"/>
+          <w:sz w:val="24"/>
+          <w:szCs w:val="24"/>
+        </w:rPr>
+        <w:t xml:space="preserve"> descrie o vizită planificată în salon, prin data, ora, situația programării și eventualul motiv al anulării. În modelul propus, fiecare programare este asociată unui client și unui angajat responsabil. Un client poate avea mai multe programări, iar un angajat poate realiza mai multe programări în timp. Relația dintre </w:t>
+      </w:r>
+      <w:r>
+        <w:rPr>
+          <w:rStyle w:val="HTMLCode"/>
+          <w:rFonts w:ascii="Times New Roman" w:eastAsiaTheme="minorHAnsi" w:hAnsi="Times New Roman" w:cs="Times New Roman"/>
+          <w:sz w:val="24"/>
+          <w:szCs w:val="24"/>
+        </w:rPr>
+        <w:t>Programare</w:t>
+      </w:r>
+      <w:r>
+        <w:rPr>
+          <w:rFonts w:ascii="Times New Roman" w:hAnsi="Times New Roman" w:cs="Times New Roman"/>
+          <w:sz w:val="24"/>
+          <w:szCs w:val="24"/>
+        </w:rPr>
+        <w:t xml:space="preserve"> și </w:t>
+      </w:r>
+      <w:r>
+        <w:rPr>
+          <w:rStyle w:val="HTMLCode"/>
+          <w:rFonts w:ascii="Times New Roman" w:eastAsiaTheme="minorHAnsi" w:hAnsi="Times New Roman" w:cs="Times New Roman"/>
+          <w:sz w:val="24"/>
+          <w:szCs w:val="24"/>
+        </w:rPr>
+        <w:t>Serviciu</w:t>
+      </w:r>
+      <w:r>
+        <w:rPr>
+          <w:rFonts w:ascii="Times New Roman" w:hAnsi="Times New Roman" w:cs="Times New Roman"/>
+          <w:sz w:val="24"/>
+          <w:szCs w:val="24"/>
+        </w:rPr>
+        <w:t xml:space="preserve"> este de tip mulți-la-mulți, deoarece o programare poate include mai multe servicii, iar același serviciu poate fi solicitat în programări diferite. Prețul și durata aplicate sunt asociate acestei relații, pentru a putea fi păstrate valorile corespunzătoare programării respective. Feedback-ul este legat de programarea la care se referă.</w:t>
+      </w:r>
+      <w:r>
+        <w:rPr>
+          <w:rFonts w:ascii="Times New Roman" w:hAnsi="Times New Roman" w:cs="Times New Roman"/>
+          <w:sz w:val="24"/>
+          <w:szCs w:val="24"/>
+        </w:rPr>
+        <w:t xml:space="preserve"> </w:t>
+      </w:r>
+      <w:r>
+        <w:rPr>
+          <w:rFonts w:ascii="Times New Roman" w:hAnsi="Times New Roman" w:cs="Times New Roman"/>
+          <w:sz w:val="24"/>
+          <w:szCs w:val="24"/>
+        </w:rPr>
+        <w:t xml:space="preserve">Activitatea academiei este reprezentată prin entitățile </w:t>
+      </w:r>
+      <w:r>
+        <w:rPr>
+          <w:rStyle w:val="HTMLCode"/>
+          <w:rFonts w:ascii="Times New Roman" w:eastAsiaTheme="minorHAnsi" w:hAnsi="Times New Roman" w:cs="Times New Roman"/>
+          <w:sz w:val="24"/>
+          <w:szCs w:val="24"/>
+        </w:rPr>
+        <w:t>Curs</w:t>
+      </w:r>
+      <w:r>
+        <w:rPr>
+          <w:rFonts w:ascii="Times New Roman" w:hAnsi="Times New Roman" w:cs="Times New Roman"/>
+          <w:sz w:val="24"/>
+          <w:szCs w:val="24"/>
+        </w:rPr>
+        <w:t xml:space="preserve">, </w:t>
+      </w:r>
+      <w:r>
+        <w:rPr>
+          <w:rStyle w:val="HTMLCode"/>
+          <w:rFonts w:ascii="Times New Roman" w:eastAsiaTheme="minorHAnsi" w:hAnsi="Times New Roman" w:cs="Times New Roman"/>
+          <w:sz w:val="24"/>
+          <w:szCs w:val="24"/>
+        </w:rPr>
+        <w:t>Sesiune_Curs</w:t>
+      </w:r>
+      <w:r>
+        <w:rPr>
+          <w:rFonts w:ascii="Times New Roman" w:hAnsi="Times New Roman" w:cs="Times New Roman"/>
+          <w:sz w:val="24"/>
+          <w:szCs w:val="24"/>
+        </w:rPr>
+        <w:t xml:space="preserve">, </w:t>
+      </w:r>
+      <w:r>
+        <w:rPr>
+          <w:rStyle w:val="HTMLCode"/>
+          <w:rFonts w:ascii="Times New Roman" w:eastAsiaTheme="minorHAnsi" w:hAnsi="Times New Roman" w:cs="Times New Roman"/>
+          <w:sz w:val="24"/>
+          <w:szCs w:val="24"/>
+        </w:rPr>
+        <w:t>Inscriere</w:t>
+      </w:r>
+      <w:r>
+        <w:rPr>
+          <w:rFonts w:ascii="Times New Roman" w:hAnsi="Times New Roman" w:cs="Times New Roman"/>
+          <w:sz w:val="24"/>
+          <w:szCs w:val="24"/>
+        </w:rPr>
+        <w:t xml:space="preserve">, </w:t>
+      </w:r>
+      <w:r>
+        <w:rPr>
+          <w:rStyle w:val="HTMLCode"/>
+          <w:rFonts w:ascii="Times New Roman" w:eastAsiaTheme="minorHAnsi" w:hAnsi="Times New Roman" w:cs="Times New Roman"/>
+          <w:sz w:val="24"/>
+          <w:szCs w:val="24"/>
+        </w:rPr>
+        <w:t>Plata</w:t>
+      </w:r>
+      <w:r>
+        <w:rPr>
+          <w:rFonts w:ascii="Times New Roman" w:hAnsi="Times New Roman" w:cs="Times New Roman"/>
+          <w:sz w:val="24"/>
+          <w:szCs w:val="24"/>
+        </w:rPr>
+        <w:t xml:space="preserve">, </w:t>
+      </w:r>
+      <w:r>
+        <w:rPr>
+          <w:rStyle w:val="HTMLCode"/>
+          <w:rFonts w:ascii="Times New Roman" w:eastAsiaTheme="minorHAnsi" w:hAnsi="Times New Roman" w:cs="Times New Roman"/>
+          <w:sz w:val="24"/>
+          <w:szCs w:val="24"/>
+        </w:rPr>
+        <w:t>Document_Inscriere</w:t>
+      </w:r>
+      <w:r>
+        <w:rPr>
+          <w:rFonts w:ascii="Times New Roman" w:hAnsi="Times New Roman" w:cs="Times New Roman"/>
+          <w:sz w:val="24"/>
+          <w:szCs w:val="24"/>
+        </w:rPr>
+        <w:t xml:space="preserve"> și </w:t>
+      </w:r>
+      <w:r>
+        <w:rPr>
+          <w:rStyle w:val="HTMLCode"/>
+          <w:rFonts w:ascii="Times New Roman" w:eastAsiaTheme="minorHAnsi" w:hAnsi="Times New Roman" w:cs="Times New Roman"/>
+          <w:sz w:val="24"/>
+          <w:szCs w:val="24"/>
+        </w:rPr>
+        <w:t>Feedback_Curs</w:t>
+      </w:r>
+      <w:r>
+        <w:rPr>
+          <w:rFonts w:ascii="Times New Roman" w:hAnsi="Times New Roman" w:cs="Times New Roman"/>
+          <w:sz w:val="24"/>
+          <w:szCs w:val="24"/>
+        </w:rPr>
+        <w:t xml:space="preserve">. Entitatea </w:t>
+      </w:r>
+      <w:r>
+        <w:rPr>
+          <w:rStyle w:val="HTMLCode"/>
+          <w:rFonts w:ascii="Times New Roman" w:eastAsiaTheme="minorHAnsi" w:hAnsi="Times New Roman" w:cs="Times New Roman"/>
+          <w:sz w:val="24"/>
+          <w:szCs w:val="24"/>
+        </w:rPr>
+        <w:t>Curs</w:t>
+      </w:r>
+      <w:r>
+        <w:rPr>
+          <w:rFonts w:ascii="Times New Roman" w:hAnsi="Times New Roman" w:cs="Times New Roman"/>
+          <w:sz w:val="24"/>
+          <w:szCs w:val="24"/>
+        </w:rPr>
+        <w:t xml:space="preserve"> descrie tipul de pregătire oferit, iar </w:t>
+      </w:r>
+      <w:r>
+        <w:rPr>
+          <w:rStyle w:val="HTMLCode"/>
+          <w:rFonts w:ascii="Times New Roman" w:eastAsiaTheme="minorHAnsi" w:hAnsi="Times New Roman" w:cs="Times New Roman"/>
+          <w:sz w:val="24"/>
+          <w:szCs w:val="24"/>
+        </w:rPr>
+        <w:t>Sesiune_Curs</w:t>
+      </w:r>
+      <w:r>
+        <w:rPr>
+          <w:rFonts w:ascii="Times New Roman" w:hAnsi="Times New Roman" w:cs="Times New Roman"/>
+          <w:sz w:val="24"/>
+          <w:szCs w:val="24"/>
+        </w:rPr>
+        <w:t xml:space="preserve"> reprezintă organizarea acestuia într-o anumită perioadă, cu un program, un preț și un trainer responsabil. Relația dintre curs și sesiune este de tip unu-la-mulți, deoarece același curs poate fi organizat de mai multe ori. În mod asemănător, un angajat cu rol de trainer poate susține mai multe sesiuni.</w:t>
+      </w:r>
+      <w:r>
+        <w:rPr>
+          <w:rFonts w:ascii="Times New Roman" w:hAnsi="Times New Roman" w:cs="Times New Roman"/>
+          <w:sz w:val="24"/>
+          <w:szCs w:val="24"/>
+        </w:rPr>
+        <w:t xml:space="preserve"> </w:t>
+      </w:r>
+      <w:r>
+        <w:rPr>
+          <w:rFonts w:ascii="Times New Roman" w:hAnsi="Times New Roman" w:cs="Times New Roman"/>
+          <w:sz w:val="24"/>
+          <w:szCs w:val="24"/>
+        </w:rPr>
+        <w:t xml:space="preserve">Entitatea </w:t>
+      </w:r>
+      <w:r>
+        <w:rPr>
+          <w:rStyle w:val="HTMLCode"/>
+          <w:rFonts w:ascii="Times New Roman" w:eastAsiaTheme="minorHAnsi" w:hAnsi="Times New Roman" w:cs="Times New Roman"/>
+          <w:sz w:val="24"/>
+          <w:szCs w:val="24"/>
+        </w:rPr>
+        <w:t>Inscriere</w:t>
+      </w:r>
+      <w:r>
+        <w:rPr>
+          <w:rFonts w:ascii="Times New Roman" w:hAnsi="Times New Roman" w:cs="Times New Roman"/>
+          <w:sz w:val="24"/>
+          <w:szCs w:val="24"/>
+        </w:rPr>
+        <w:t xml:space="preserve"> face legătura dintre client și sesiunea de curs aleasă. Aceasta păstrează informații despre data înscrierii, situația participării, prețul aplicat, prezență și eventuala retragere. Plățile și documentele sunt reprezentate separat și asociate înscrierii corespunzătoare. Această organizare permite păstrarea mai multor plăți și documente pentru aceeași înscriere. Modelul include și relația prin care un client poate fi trecut pe lista de așteptare pentru o sesiune, precum și posibilitatea de a urmări înlocuirea unei înscrieri cu alta. Feedback-ul cursantului este asociat înscrierii, pentru a putea fi identificată sesiunea la care se referă.</w:t>
+      </w:r>
+      <w:r>
+        <w:rPr>
+          <w:rFonts w:ascii="Times New Roman" w:hAnsi="Times New Roman" w:cs="Times New Roman"/>
+          <w:sz w:val="24"/>
+          <w:szCs w:val="24"/>
+        </w:rPr>
+        <w:t xml:space="preserve"> Pentru activitatea academiei se aplică regulile stabilite în analiza cerințelor: o sesiune are maximum opt participanți confirmați, iar ocuparea locului presupune plata avansului și depunerea documentelor necesare în momentul înscrierii. Retragerea trebuie anunțată cu minimum două săptămâni înainte de începerea sesiunii; în caz contrar, conform regulii proiectului, cursantul trebuie să participe sau să </w:t>
+      </w:r>
+      <w:r>
+        <w:rPr>
+          <w:rFonts w:ascii="Times New Roman" w:hAnsi="Times New Roman" w:cs="Times New Roman"/>
           <w:sz w:val="24"/>
           <w:szCs w:val="24"/>
         </w:rPr>
         <w:lastRenderedPageBreak/>
-        <w:t xml:space="preserve">personale si profesionale, in timp ce entitatile „Serviciu”, „Programari” si „Cursuri” definesc activitatile comerciale si educationale, ingloband atribute precum durata, pret, disponibilitate si status. Componenta logistica si de conformitate a businessul-ui este </w:t>
-      </w:r>
-      <w:r>
-        <w:rPr>
-          <w:rFonts w:ascii="Times New Roman" w:hAnsi="Times New Roman" w:cs="Times New Roman"/>
-          <w:color w:val="000000" w:themeColor="text1"/>
-          <w:sz w:val="24"/>
-          <w:szCs w:val="24"/>
-        </w:rPr>
-        <w:t>acoperita prin entitatile „Aparatura”, „Registru_Sterilizare” si „Produse” care retin detalii esentiale referitoare la garantii, loturi de solutii, martori de sterilizare, termene de valabilitate, produse destinate salonului si academiei. Relațiile și cardinalitățile stabilite între aceste entități reflectă cu exactitate regulile de funcționare ale afacerii. Fluxul operațional de bază este modelat prin relații de tip unu-la-mulți (1:N), ilustrând faptul că un singur client poate efectua multiple programări, iar un angajat poate presta mai multe servicii, preda diverse cursuri și completa succesiv registrul de sterilizare. Totodată, modelul conceptual surprinde și interacțiunile complexe specifice mediului fizic prin relații de tip mulți-la-mulți (M:N). Acestea evidențiază faptul că un curs reunește mai mulți clienți participanți, iar o anumită categorie de aparatură este necesară și alocată simultan atât pentru prestarea diverselor servicii de salon, cât și pentru susținerea orelor de practică din cadrul academiei.</w:t>
-      </w:r>
-    </w:p>
-    <w:p>
-      <w:pPr>
-        <w:rPr>
-          <w:rFonts w:ascii="Times New Roman" w:hAnsi="Times New Roman" w:cs="Times New Roman"/>
-          <w:color w:val="000000" w:themeColor="text1"/>
-          <w:sz w:val="24"/>
-          <w:szCs w:val="24"/>
-        </w:rPr>
-      </w:pPr>
-      <w:r>
-        <w:rPr>
-          <w:rFonts w:ascii="Times New Roman" w:hAnsi="Times New Roman" w:cs="Times New Roman"/>
+        <w:t>găsească un înlocuitor. Aceste condiții completează relațiile reprezentate în diagramă și vor fi avute în vedere la implementare.</w:t>
+      </w:r>
+    </w:p>
+    <w:p>
+      <w:pPr>
+        <w:pStyle w:val="my-2"/>
+      </w:pPr>
+      <w:r>
+        <w:rPr>
           <w:noProof/>
-          <w:color w:val="000000" w:themeColor="text1"/>
-          <w:sz w:val="24"/>
-          <w:szCs w:val="24"/>
-          <w:lang w:eastAsia="ro-RO"/>
         </w:rPr>
         <w:drawing>
           <wp:inline distT="0" distB="0" distL="0" distR="0">
-            <wp:extent cx="3655555" cy="4640580"/>
-            <wp:effectExtent l="0" t="0" r="2540" b="7620"/>
-            <wp:docPr id="2" name="Picture 2"/>
+            <wp:extent cx="5759450" cy="2235835"/>
+            <wp:effectExtent l="0" t="0" r="0" b="0"/>
+            <wp:docPr id="1" name="Picture 1"/>
             <wp:cNvGraphicFramePr>
               <a:graphicFrameLocks xmlns:a="http://schemas.openxmlformats.org/drawingml/2006/main" noChangeAspect="1"/>
             </wp:cNvGraphicFramePr>
@@ -1739,7 +2178,7 @@
               <a:graphicData uri="http://schemas.openxmlformats.org/drawingml/2006/picture">
                 <pic:pic xmlns:pic="http://schemas.openxmlformats.org/drawingml/2006/picture">
                   <pic:nvPicPr>
-                    <pic:cNvPr id="2" name="diagrama_ER.png"/>
+                    <pic:cNvPr id="1" name="diagrama_ER_salon_academie.png"/>
                     <pic:cNvPicPr/>
                   </pic:nvPicPr>
                   <pic:blipFill>
@@ -1757,7 +2196,7 @@
                   <pic:spPr>
                     <a:xfrm>
                       <a:off x="0" y="0"/>
-                      <a:ext cx="3661437" cy="4648047"/>
+                      <a:ext cx="5759450" cy="2235835"/>
                     </a:xfrm>
                     <a:prstGeom prst="rect">
                       <a:avLst/>
@@ -1769,12 +2208,278 @@
           </wp:inline>
         </w:drawing>
       </w:r>
+    </w:p>
+    <w:p>
+      <w:pPr>
+        <w:pStyle w:val="my-2"/>
+        <w:jc w:val="center"/>
+        <w:rPr>
+          <w:i/>
+        </w:rPr>
+      </w:pPr>
+      <w:r>
+        <w:rPr>
+          <w:i/>
+        </w:rPr>
+        <w:t>Figura 1. Modelul conceptual ER pentru activitatea salonului și a academiei</w:t>
+      </w:r>
+    </w:p>
+    <w:p>
+      <w:pPr>
+        <w:spacing w:before="100" w:beforeAutospacing="1" w:after="100" w:afterAutospacing="1" w:line="240" w:lineRule="auto"/>
+        <w:rPr>
+          <w:rFonts w:ascii="Times New Roman" w:eastAsia="Times New Roman" w:hAnsi="Times New Roman" w:cs="Times New Roman"/>
+          <w:sz w:val="24"/>
+          <w:szCs w:val="24"/>
+          <w:lang w:eastAsia="ro-RO"/>
+        </w:rPr>
+      </w:pPr>
+      <w:r>
+        <w:rPr>
+          <w:rFonts w:ascii="Times New Roman" w:eastAsia="Times New Roman" w:hAnsi="Times New Roman" w:cs="Times New Roman"/>
+          <w:sz w:val="24"/>
+          <w:szCs w:val="24"/>
+          <w:lang w:eastAsia="ro-RO"/>
+        </w:rPr>
+        <w:t xml:space="preserve">A doua parte a modelului cuprinde entitățile Produs, Ingredient, Recipient și Miscare_Stoc. Entitatea Produs descrie articolul din catalog, prin denumire, categorie, unitate de măsură și pragul minim de stoc. Entitatea Recipient reprezintă fiecare exemplar fizic cumpărat din acel produs, cum ar fi o sticlă de cleaner, un borcănel de gel sau un recipient cu dezinfectant. Separarea permite păstrarea individuală a lotului, datei cumpărării, termenului de expirare și datei deschiderii. Relația dintre produs și recipient este de tip unu-la-mulți. Mișcările de stoc sunt asociate recipientelor și păstrează informații despre dată, tipul operațiunii, cantitate și sursa sau destinația acesteia. </w:t>
+      </w:r>
+      <w:r>
+        <w:rPr>
+          <w:rFonts w:ascii="Times New Roman" w:hAnsi="Times New Roman" w:cs="Times New Roman"/>
+          <w:sz w:val="24"/>
+          <w:szCs w:val="24"/>
+        </w:rPr>
+        <w:t>Ingredientele sunt reprezentate separat și legate de produse printr-o relație de tip mulți-la-mulți: un produs poate conține mai multe ingrediente, iar un ingredient poate apărea în mai multe produse. Clienții sunt legați de ingredientele la care au declarat alergii. Aceste relații oferă informațiile necesare verificării produselor selectate pentru un client. Legătura dintre programare și recipient permite păstrarea produselor folosite și a cantităților utilizate în cadrul unei vizite</w:t>
+      </w:r>
+      <w:r>
+        <w:rPr>
+          <w:rFonts w:ascii="Times New Roman" w:hAnsi="Times New Roman" w:cs="Times New Roman"/>
+          <w:sz w:val="24"/>
+          <w:szCs w:val="24"/>
+        </w:rPr>
+        <w:t xml:space="preserve">. </w:t>
+      </w:r>
+      <w:r>
+        <w:rPr>
+          <w:rFonts w:ascii="Times New Roman" w:hAnsi="Times New Roman" w:cs="Times New Roman"/>
+          <w:sz w:val="24"/>
+          <w:szCs w:val="24"/>
+        </w:rPr>
+        <w:t xml:space="preserve">Entitățile </w:t>
+      </w:r>
+      <w:r>
+        <w:rPr>
+          <w:rStyle w:val="HTMLCode"/>
+          <w:rFonts w:ascii="Times New Roman" w:eastAsiaTheme="minorHAnsi" w:hAnsi="Times New Roman" w:cs="Times New Roman"/>
+          <w:sz w:val="24"/>
+          <w:szCs w:val="24"/>
+        </w:rPr>
+        <w:t>Aparatura</w:t>
+      </w:r>
+      <w:r>
+        <w:rPr>
+          <w:rFonts w:ascii="Times New Roman" w:hAnsi="Times New Roman" w:cs="Times New Roman"/>
+          <w:sz w:val="24"/>
+          <w:szCs w:val="24"/>
+        </w:rPr>
+        <w:t xml:space="preserve"> și </w:t>
+      </w:r>
+      <w:r>
+        <w:rPr>
+          <w:rStyle w:val="HTMLCode"/>
+          <w:rFonts w:ascii="Times New Roman" w:eastAsiaTheme="minorHAnsi" w:hAnsi="Times New Roman" w:cs="Times New Roman"/>
+          <w:sz w:val="24"/>
+          <w:szCs w:val="24"/>
+        </w:rPr>
+        <w:t>Instrument</w:t>
+      </w:r>
+      <w:r>
+        <w:rPr>
+          <w:rFonts w:ascii="Times New Roman" w:hAnsi="Times New Roman" w:cs="Times New Roman"/>
+          <w:sz w:val="24"/>
+          <w:szCs w:val="24"/>
+        </w:rPr>
+        <w:t xml:space="preserve"> descriu echipamentele și instrumentarul folosite în salon și academie. Pentru aparatură sunt păstrate informații despre identificare, categorie, furnizor, cumpărare, garanție, verificare și stare. Instrumentele au o evidență distinctă, pentru a putea fi urmărite în operațiunile de prelucrare și în pungile în care sunt ambalate. Entitatea </w:t>
+      </w:r>
+      <w:r>
+        <w:rPr>
+          <w:rStyle w:val="HTMLCode"/>
+          <w:rFonts w:ascii="Times New Roman" w:eastAsiaTheme="minorHAnsi" w:hAnsi="Times New Roman" w:cs="Times New Roman"/>
+          <w:sz w:val="24"/>
+          <w:szCs w:val="24"/>
+        </w:rPr>
+        <w:t>Punga_Sterilizare</w:t>
+      </w:r>
+      <w:r>
+        <w:rPr>
+          <w:rFonts w:ascii="Times New Roman" w:hAnsi="Times New Roman" w:cs="Times New Roman"/>
+          <w:sz w:val="24"/>
+          <w:szCs w:val="24"/>
+        </w:rPr>
+        <w:t xml:space="preserve"> păstrează codul pungii și informațiile despre ambalare, deschidere, stare și martorul de sterilizare. Relația dintre pungă și instrument permite păstrarea istoricului conținutului, iar legătura cu programarea indică vizita la care punga a fost utilizată.</w:t>
+      </w:r>
+      <w:r>
+        <w:rPr>
+          <w:rFonts w:ascii="Times New Roman" w:hAnsi="Times New Roman" w:cs="Times New Roman"/>
+          <w:sz w:val="24"/>
+          <w:szCs w:val="24"/>
+        </w:rPr>
+        <w:t xml:space="preserve"> </w:t>
+      </w:r>
+      <w:r>
+        <w:rPr>
+          <w:rFonts w:ascii="Times New Roman" w:hAnsi="Times New Roman" w:cs="Times New Roman"/>
+          <w:sz w:val="24"/>
+          <w:szCs w:val="24"/>
+        </w:rPr>
+        <w:t xml:space="preserve">Registrul este reprezentat prin entitatea </w:t>
+      </w:r>
+      <w:r>
+        <w:rPr>
+          <w:rStyle w:val="HTMLCode"/>
+          <w:rFonts w:ascii="Times New Roman" w:eastAsiaTheme="minorHAnsi" w:hAnsi="Times New Roman" w:cs="Times New Roman"/>
+          <w:sz w:val="24"/>
+          <w:szCs w:val="24"/>
+        </w:rPr>
+        <w:t>Operatiune_Registru</w:t>
+      </w:r>
+      <w:r>
+        <w:rPr>
+          <w:rFonts w:ascii="Times New Roman" w:hAnsi="Times New Roman" w:cs="Times New Roman"/>
+          <w:sz w:val="24"/>
+          <w:szCs w:val="24"/>
+        </w:rPr>
+        <w:t xml:space="preserve">, fiecare înregistrare descriind o operațiune concretă de dezinfectare sau sterilizare. Aceasta păstrează tipul operațiunii, data, ora, rezultatul și observațiile. Fiecare operațiune este asociată angajatului responsabil și protocolului urmat. Legăturile cu recipientele, aparatura, instrumentele și pungile permit identificarea soluțiilor consumate, a echipamentelor folosite sau prelucrate și a instrumentarului implicat. Entitatea </w:t>
+      </w:r>
+      <w:r>
+        <w:rPr>
+          <w:rStyle w:val="HTMLCode"/>
+          <w:rFonts w:ascii="Times New Roman" w:eastAsiaTheme="minorHAnsi" w:hAnsi="Times New Roman" w:cs="Times New Roman"/>
+          <w:sz w:val="24"/>
+          <w:szCs w:val="24"/>
+        </w:rPr>
+        <w:t>Protocol</w:t>
+      </w:r>
+      <w:r>
+        <w:rPr>
+          <w:rFonts w:ascii="Times New Roman" w:hAnsi="Times New Roman" w:cs="Times New Roman"/>
+          <w:sz w:val="24"/>
+          <w:szCs w:val="24"/>
+        </w:rPr>
+        <w:t xml:space="preserve"> păstrează denumirea, tipul și pașii procedurii înregistrate.</w:t>
+      </w:r>
+    </w:p>
+    <w:p>
+      <w:pPr>
+        <w:rPr>
+          <w:rFonts w:ascii="Times New Roman" w:hAnsi="Times New Roman" w:cs="Times New Roman"/>
+          <w:color w:val="000000" w:themeColor="text1"/>
+          <w:sz w:val="24"/>
+          <w:szCs w:val="24"/>
+        </w:rPr>
+      </w:pPr>
+      <w:r>
+        <w:rPr>
+          <w:rFonts w:ascii="Times New Roman" w:hAnsi="Times New Roman" w:cs="Times New Roman"/>
+          <w:noProof/>
+          <w:color w:val="000000" w:themeColor="text1"/>
+          <w:sz w:val="24"/>
+          <w:szCs w:val="24"/>
+          <w:lang w:eastAsia="ro-RO"/>
+        </w:rPr>
+        <w:lastRenderedPageBreak/>
+        <w:drawing>
+          <wp:inline distT="0" distB="0" distL="0" distR="0">
+            <wp:extent cx="5759450" cy="3912870"/>
+            <wp:effectExtent l="0" t="0" r="0" b="0"/>
+            <wp:docPr id="3" name="Picture 3"/>
+            <wp:cNvGraphicFramePr>
+              <a:graphicFrameLocks xmlns:a="http://schemas.openxmlformats.org/drawingml/2006/main" noChangeAspect="1"/>
+            </wp:cNvGraphicFramePr>
+            <a:graphic xmlns:a="http://schemas.openxmlformats.org/drawingml/2006/main">
+              <a:graphicData uri="http://schemas.openxmlformats.org/drawingml/2006/picture">
+                <pic:pic xmlns:pic="http://schemas.openxmlformats.org/drawingml/2006/picture">
+                  <pic:nvPicPr>
+                    <pic:cNvPr id="3" name="diagrama_er_stoc.png"/>
+                    <pic:cNvPicPr/>
+                  </pic:nvPicPr>
+                  <pic:blipFill>
+                    <a:blip r:embed="rId9" cstate="print">
+                      <a:extLst>
+                        <a:ext uri="{28A0092B-C50C-407E-A947-70E740481C1C}">
+                          <a14:useLocalDpi xmlns:a14="http://schemas.microsoft.com/office/drawing/2010/main" val="0"/>
+                        </a:ext>
+                      </a:extLst>
+                    </a:blip>
+                    <a:stretch>
+                      <a:fillRect/>
+                    </a:stretch>
+                  </pic:blipFill>
+                  <pic:spPr>
+                    <a:xfrm>
+                      <a:off x="0" y="0"/>
+                      <a:ext cx="5759450" cy="3912870"/>
+                    </a:xfrm>
+                    <a:prstGeom prst="rect">
+                      <a:avLst/>
+                    </a:prstGeom>
+                  </pic:spPr>
+                </pic:pic>
+              </a:graphicData>
+            </a:graphic>
+          </wp:inline>
+        </w:drawing>
+      </w:r>
+    </w:p>
+    <w:p>
+      <w:pPr>
+        <w:jc w:val="center"/>
+        <w:rPr>
+          <w:rFonts w:ascii="Times New Roman" w:hAnsi="Times New Roman" w:cs="Times New Roman"/>
+          <w:i/>
+          <w:color w:val="000000" w:themeColor="text1"/>
+          <w:sz w:val="24"/>
+          <w:szCs w:val="24"/>
+        </w:rPr>
+      </w:pPr>
+      <w:r>
+        <w:rPr>
+          <w:rFonts w:ascii="Times New Roman" w:hAnsi="Times New Roman" w:cs="Times New Roman"/>
+          <w:i/>
+          <w:color w:val="000000" w:themeColor="text1"/>
+          <w:sz w:val="24"/>
+          <w:szCs w:val="24"/>
+        </w:rPr>
+        <w:t>Figura 2. Modelul conceptual ER pentru produse, stocuri, aparatură și registrul de dezinfectare și sterilizare</w:t>
+      </w:r>
+    </w:p>
+    <w:p>
+      <w:pPr>
+        <w:jc w:val="center"/>
+        <w:rPr>
+          <w:rFonts w:ascii="Times New Roman" w:hAnsi="Times New Roman" w:cs="Times New Roman"/>
+          <w:i/>
+          <w:color w:val="000000" w:themeColor="text1"/>
+          <w:sz w:val="24"/>
+          <w:szCs w:val="24"/>
+        </w:rPr>
+      </w:pPr>
+    </w:p>
+    <w:p>
+      <w:pPr>
+        <w:rPr>
+          <w:rFonts w:ascii="Times New Roman" w:hAnsi="Times New Roman" w:cs="Times New Roman"/>
+          <w:color w:val="000000" w:themeColor="text1"/>
+          <w:sz w:val="24"/>
+          <w:szCs w:val="24"/>
+        </w:rPr>
+      </w:pPr>
       <w:bookmarkStart w:id="5" w:name="_GoBack"/>
       <w:bookmarkEnd w:id="5"/>
     </w:p>
     <w:sectPr>
-      <w:footerReference w:type="default" r:id="rId9"/>
-      <w:footerReference w:type="first" r:id="rId10"/>
+      <w:footerReference w:type="default" r:id="rId10"/>
+      <w:footerReference w:type="first" r:id="rId11"/>
       <w:pgSz w:w="11906" w:h="16838" w:code="9"/>
       <w:pgMar w:top="1418" w:right="1418" w:bottom="1418" w:left="1418" w:header="709" w:footer="709" w:gutter="0"/>
       <w:cols w:space="708"/>
@@ -1844,7 +2549,7 @@
           <w:rPr>
             <w:noProof/>
           </w:rPr>
-          <w:t>7</w:t>
+          <w:t>8</w:t>
         </w:r>
         <w:r>
           <w:rPr>
@@ -4554,6 +5259,19 @@
       <w:lang w:eastAsia="ro-RO"/>
     </w:rPr>
   </w:style>
+  <w:style w:type="character" w:styleId="HTMLCode">
+    <w:name w:val="HTML Code"/>
+    <w:basedOn w:val="DefaultParagraphFont"/>
+    <w:uiPriority w:val="99"/>
+    <w:semiHidden/>
+    <w:unhideWhenUsed/>
+    <w:rsid w:val="000A4C62"/>
+    <w:rPr>
+      <w:rFonts w:ascii="Courier New" w:eastAsia="Times New Roman" w:hAnsi="Courier New" w:cs="Courier New"/>
+      <w:sz w:val="20"/>
+      <w:szCs w:val="20"/>
+    </w:rPr>
+  </w:style>
 </w:styles>
 </file>
 
@@ -4823,7 +5541,7 @@
 </file>
 
 <file path=customXml/itemProps1.xml><?xml version="1.0" encoding="utf-8"?>
-<ds:datastoreItem xmlns:ds="http://schemas.openxmlformats.org/officeDocument/2006/customXml" ds:itemID="{A5B1AD56-CF9B-44C0-8273-1FEA06E3F959}">
+<ds:datastoreItem xmlns:ds="http://schemas.openxmlformats.org/officeDocument/2006/customXml" ds:itemID="{9C79830A-B7D1-454F-8083-F96F56180647}">
   <ds:schemaRefs>
     <ds:schemaRef ds:uri="http://schemas.openxmlformats.org/officeDocument/2006/bibliography"/>
   </ds:schemaRefs>

</xml_diff>

<commit_message>
adaugat in documentatie diagrama cazurilor de utilizare
</commit_message>
<xml_diff>
--- a/Anul_3/proiect_baze_de_date/docs/Proiect_BD.docx
+++ b/Anul_3/proiect_baze_de_date/docs/Proiect_BD.docx
@@ -746,7 +746,7 @@
             </w:rPr>
             <w:fldChar w:fldCharType="separate"/>
           </w:r>
-          <w:hyperlink w:anchor="_Toc244253044" w:history="1">
+          <w:hyperlink w:anchor="_Toc244345900" w:history="1">
             <w:r>
               <w:rPr>
                 <w:rStyle w:val="Hyperlink"/>
@@ -792,7 +792,7 @@
                 <w:noProof/>
                 <w:webHidden/>
               </w:rPr>
-              <w:instrText xml:space="preserve"> PAGEREF _Toc244253044 \h </w:instrText>
+              <w:instrText xml:space="preserve"> PAGEREF _Toc244345900 \h </w:instrText>
             </w:r>
             <w:r>
               <w:rPr>
@@ -836,7 +836,7 @@
               <w:lang w:eastAsia="ro-RO"/>
             </w:rPr>
           </w:pPr>
-          <w:hyperlink w:anchor="_Toc244253045" w:history="1">
+          <w:hyperlink w:anchor="_Toc244345901" w:history="1">
             <w:r>
               <w:rPr>
                 <w:rStyle w:val="Hyperlink"/>
@@ -882,7 +882,7 @@
                 <w:noProof/>
                 <w:webHidden/>
               </w:rPr>
-              <w:instrText xml:space="preserve"> PAGEREF _Toc244253045 \h </w:instrText>
+              <w:instrText xml:space="preserve"> PAGEREF _Toc244345901 \h </w:instrText>
             </w:r>
             <w:r>
               <w:rPr>
@@ -902,7 +902,7 @@
                 <w:noProof/>
                 <w:webHidden/>
               </w:rPr>
-              <w:t>4</w:t>
+              <w:t>3</w:t>
             </w:r>
             <w:r>
               <w:rPr>
@@ -926,7 +926,7 @@
               <w:lang w:eastAsia="ro-RO"/>
             </w:rPr>
           </w:pPr>
-          <w:hyperlink w:anchor="_Toc244253046" w:history="1">
+          <w:hyperlink w:anchor="_Toc244345902" w:history="1">
             <w:r>
               <w:rPr>
                 <w:rStyle w:val="Hyperlink"/>
@@ -970,7 +970,7 @@
                 <w:noProof/>
                 <w:webHidden/>
               </w:rPr>
-              <w:instrText xml:space="preserve"> PAGEREF _Toc244253046 \h </w:instrText>
+              <w:instrText xml:space="preserve"> PAGEREF _Toc244345902 \h </w:instrText>
             </w:r>
             <w:r>
               <w:rPr>
@@ -990,7 +990,7 @@
                 <w:noProof/>
                 <w:webHidden/>
               </w:rPr>
-              <w:t>5</w:t>
+              <w:t>4</w:t>
             </w:r>
             <w:r>
               <w:rPr>
@@ -1013,7 +1013,7 @@
               <w:lang w:eastAsia="ro-RO"/>
             </w:rPr>
           </w:pPr>
-          <w:hyperlink w:anchor="_Toc244253047" w:history="1">
+          <w:hyperlink w:anchor="_Toc244345903" w:history="1">
             <w:r>
               <w:rPr>
                 <w:rStyle w:val="Hyperlink"/>
@@ -1041,7 +1041,7 @@
                 <w:noProof/>
                 <w:webHidden/>
               </w:rPr>
-              <w:instrText xml:space="preserve"> PAGEREF _Toc244253047 \h </w:instrText>
+              <w:instrText xml:space="preserve"> PAGEREF _Toc244345903 \h </w:instrText>
             </w:r>
             <w:r>
               <w:rPr>
@@ -1061,7 +1061,7 @@
                 <w:noProof/>
                 <w:webHidden/>
               </w:rPr>
-              <w:t>5</w:t>
+              <w:t>4</w:t>
             </w:r>
             <w:r>
               <w:rPr>
@@ -1084,7 +1084,7 @@
               <w:lang w:eastAsia="ro-RO"/>
             </w:rPr>
           </w:pPr>
-          <w:hyperlink w:anchor="_Toc244253048" w:history="1">
+          <w:hyperlink w:anchor="_Toc244345904" w:history="1">
             <w:r>
               <w:rPr>
                 <w:rStyle w:val="Hyperlink"/>
@@ -1112,7 +1112,7 @@
                 <w:noProof/>
                 <w:webHidden/>
               </w:rPr>
-              <w:instrText xml:space="preserve"> PAGEREF _Toc244253048 \h </w:instrText>
+              <w:instrText xml:space="preserve"> PAGEREF _Toc244345904 \h </w:instrText>
             </w:r>
             <w:r>
               <w:rPr>
@@ -1132,7 +1132,7 @@
                 <w:noProof/>
                 <w:webHidden/>
               </w:rPr>
-              <w:t>8</w:t>
+              <w:t>7</w:t>
             </w:r>
             <w:r>
               <w:rPr>
@@ -1155,14 +1155,14 @@
               <w:lang w:eastAsia="ro-RO"/>
             </w:rPr>
           </w:pPr>
-          <w:hyperlink w:anchor="_Toc244253049" w:history="1">
+          <w:hyperlink w:anchor="_Toc244345905" w:history="1">
             <w:r>
               <w:rPr>
                 <w:rStyle w:val="Hyperlink"/>
                 <w:rFonts w:ascii="Times New Roman" w:hAnsi="Times New Roman" w:cs="Times New Roman"/>
                 <w:noProof/>
               </w:rPr>
-              <w:t>Diagrama cazului de utilizare</w:t>
+              <w:t>Diagrama cazurilor de utilizare</w:t>
             </w:r>
             <w:r>
               <w:rPr>
@@ -1183,7 +1183,7 @@
                 <w:noProof/>
                 <w:webHidden/>
               </w:rPr>
-              <w:instrText xml:space="preserve"> PAGEREF _Toc244253049 \h </w:instrText>
+              <w:instrText xml:space="preserve"> PAGEREF _Toc244345905 \h </w:instrText>
             </w:r>
             <w:r>
               <w:rPr>
@@ -1203,7 +1203,7 @@
                 <w:noProof/>
                 <w:webHidden/>
               </w:rPr>
-              <w:t>10</w:t>
+              <w:t>9</w:t>
             </w:r>
             <w:r>
               <w:rPr>
@@ -1266,8 +1266,6 @@
         </w:rPr>
         <w:br w:type="page"/>
       </w:r>
-      <w:bookmarkStart w:id="0" w:name="_GoBack"/>
-      <w:bookmarkEnd w:id="0"/>
     </w:p>
     <w:p>
       <w:pPr>
@@ -1282,7 +1280,7 @@
           <w:lang w:val="en-US"/>
         </w:rPr>
       </w:pPr>
-      <w:bookmarkStart w:id="1" w:name="_Toc244253044"/>
+      <w:bookmarkStart w:id="0" w:name="_Toc244345900"/>
       <w:proofErr w:type="spellStart"/>
       <w:r>
         <w:rPr>
@@ -1311,7 +1309,7 @@
         </w:rPr>
         <w:t>proiectului</w:t>
       </w:r>
-      <w:bookmarkEnd w:id="1"/>
+      <w:bookmarkEnd w:id="0"/>
       <w:proofErr w:type="spellEnd"/>
     </w:p>
     <w:p>
@@ -1336,61 +1334,74 @@
         </w:rPr>
         <w:t>Acest proiect are ca scop proiectarea și implementarea unui sistem de gestiune destinat unui salon de manichiură care funcționează, în același timp, și ca academie de nail art. Salonul oferă servicii de îngrijire și stilizare a unghiilor, iar academia organizează cursuri de formare profesională pentru persoanele care doresc să învețe tehnicile specifice acestui domeniu.</w:t>
       </w:r>
-    </w:p>
-    <w:p>
-      <w:pPr>
-        <w:pStyle w:val="my-2"/>
-        <w:rPr>
-          <w:color w:val="000000" w:themeColor="text1"/>
-        </w:rPr>
-      </w:pPr>
+      <w:r>
+        <w:rPr>
+          <w:color w:val="000000" w:themeColor="text1"/>
+        </w:rPr>
+        <w:t xml:space="preserve"> </w:t>
+      </w:r>
       <w:r>
         <w:rPr>
           <w:color w:val="000000" w:themeColor="text1"/>
         </w:rPr>
         <w:t>În prezent, multe activități dintr-un astfel de salon sunt gestionate manual, în registre sau în fișiere Excel separate. Această metodă poate duce la pierderi de timp, greșeli de programare, neconcordanțe în evidența stocurilor și dificultăți în urmărirea activității angajaților. De asemenea, informațiile despre clienți, cursanți, produse și aparatură nu sunt păstrate într-un singur loc, ceea ce face mai greu accesul rapid la datele necesare.</w:t>
       </w:r>
-    </w:p>
-    <w:p>
-      <w:pPr>
-        <w:pStyle w:val="my-2"/>
-        <w:rPr>
-          <w:color w:val="000000" w:themeColor="text1"/>
-        </w:rPr>
-      </w:pPr>
+      <w:r>
+        <w:rPr>
+          <w:color w:val="000000" w:themeColor="text1"/>
+        </w:rPr>
+        <w:t xml:space="preserve"> </w:t>
+      </w:r>
       <w:r>
         <w:rPr>
           <w:color w:val="000000" w:themeColor="text1"/>
         </w:rPr>
         <w:t>Sistemul propus adună aceste informații într-un singur mediu organizat. El va permite gestionarea programărilor clienților, evidența cursanților înscriși la cursuri, urmărirea stocurilor de produse, evidența aparaturii și a procesului de sterilizare, precum și organizarea activității tehnicienilor și trainerilor.</w:t>
       </w:r>
-    </w:p>
-    <w:p>
-      <w:pPr>
-        <w:pStyle w:val="my-2"/>
-        <w:rPr>
-          <w:color w:val="000000" w:themeColor="text1"/>
-        </w:rPr>
-      </w:pPr>
-      <w:r>
-        <w:rPr>
-          <w:color w:val="000000" w:themeColor="text1"/>
-        </w:rPr>
-        <w:t>Un aspect important îl reprezintă și evidența informațiilor legate de sănătatea clienților, cum ar fi alergiile sau alte probleme medicale relevante. Aceste date sunt necesare pentru ca personalul să poată presta serviciile în condiții de siguranță. Totodată, sistemul va ține evidența reducerilor acordate clienților fideli și a feedback-ului primit după servicii sau cursuri.</w:t>
-      </w:r>
-    </w:p>
-    <w:p>
-      <w:pPr>
-        <w:pStyle w:val="my-2"/>
-        <w:rPr>
-          <w:color w:val="000000" w:themeColor="text1"/>
-        </w:rPr>
-      </w:pPr>
-      <w:r>
-        <w:rPr>
-          <w:color w:val="000000" w:themeColor="text1"/>
-        </w:rPr>
-        <w:t>Prin acest proiect se dorește înlocuirea evidenței pe hârtie sau a fișierelor dezorganizate cu un sistem clar, ușor de folosit și adaptat activității reale a salonului și academiei. Astfel, personalul va putea accesa mai rapid informațiile necesare, iar administratorii vor putea obține rapoarte utile despre programări, vânzări, stocuri și participarea la cursuri.</w:t>
+      <w:r>
+        <w:rPr>
+          <w:color w:val="000000" w:themeColor="text1"/>
+        </w:rPr>
+        <w:t xml:space="preserve"> </w:t>
+      </w:r>
+      <w:r>
+        <w:rPr>
+          <w:color w:val="000000" w:themeColor="text1"/>
+        </w:rPr>
+        <w:t xml:space="preserve">Un aspect important îl reprezintă și evidența informațiilor legate de sănătatea clienților, cum ar fi alergiile sau alte probleme medicale relevante. Aceste date sunt necesare pentru ca personalul să poată presta serviciile în condiții de siguranță. Totodată, sistemul va ține evidența reducerilor acordate clienților fideli și a </w:t>
+      </w:r>
+      <w:r>
+        <w:t>feedback-ului primit după serviciile salonului</w:t>
+      </w:r>
+      <w:r>
+        <w:rPr>
+          <w:color w:val="000000" w:themeColor="text1"/>
+        </w:rPr>
+        <w:t>.</w:t>
+      </w:r>
+      <w:r>
+        <w:rPr>
+          <w:color w:val="000000" w:themeColor="text1"/>
+        </w:rPr>
+        <w:t xml:space="preserve"> </w:t>
+      </w:r>
+      <w:r>
+        <w:rPr>
+          <w:color w:val="000000" w:themeColor="text1"/>
+        </w:rPr>
+        <w:t xml:space="preserve">Prin acest proiect se dorește înlocuirea evidenței pe hârtie sau a fișierelor dezorganizate cu un sistem clar, ușor de folosit și adaptat activității reale a salonului și academiei. Astfel, personalul va putea accesa mai rapid informațiile necesare, iar </w:t>
+      </w:r>
+      <w:r>
+        <w:t>personalul autorizat va putea consulta situații</w:t>
+      </w:r>
+      <w:r>
+        <w:t xml:space="preserve"> </w:t>
+      </w:r>
+      <w:r>
+        <w:rPr>
+          <w:color w:val="000000" w:themeColor="text1"/>
+        </w:rPr>
+        <w:t>utile despre programări, vânzări, stocuri și participarea la cursuri.</w:t>
       </w:r>
     </w:p>
     <w:p>
@@ -1401,31 +1412,6 @@
           <w:sz w:val="24"/>
           <w:szCs w:val="24"/>
           <w:lang w:eastAsia="ro-RO"/>
-        </w:rPr>
-      </w:pPr>
-      <w:r>
-        <w:rPr>
-          <w:color w:val="000000" w:themeColor="text1"/>
-        </w:rPr>
-        <w:br w:type="page"/>
-      </w:r>
-    </w:p>
-    <w:p>
-      <w:pPr>
-        <w:pStyle w:val="my-2"/>
-        <w:rPr>
-          <w:color w:val="000000" w:themeColor="text1"/>
-        </w:rPr>
-      </w:pPr>
-    </w:p>
-    <w:p>
-      <w:pPr>
-        <w:rPr>
-          <w:rFonts w:ascii="Times New Roman" w:hAnsi="Times New Roman" w:cs="Times New Roman"/>
-          <w:color w:val="000000" w:themeColor="text1"/>
-          <w:sz w:val="24"/>
-          <w:szCs w:val="24"/>
-          <w:lang w:val="en-US"/>
         </w:rPr>
       </w:pPr>
     </w:p>
@@ -1442,7 +1428,7 @@
           <w:lang w:val="en-US"/>
         </w:rPr>
       </w:pPr>
-      <w:bookmarkStart w:id="2" w:name="_Toc244253045"/>
+      <w:bookmarkStart w:id="1" w:name="_Toc244345901"/>
       <w:proofErr w:type="spellStart"/>
       <w:r>
         <w:rPr>
@@ -1470,7 +1456,7 @@
         </w:rPr>
         <w:t>proiectului</w:t>
       </w:r>
-      <w:bookmarkEnd w:id="2"/>
+      <w:bookmarkEnd w:id="1"/>
       <w:proofErr w:type="spellEnd"/>
     </w:p>
     <w:p>
@@ -1497,7 +1483,56 @@
           <w:sz w:val="24"/>
           <w:szCs w:val="24"/>
         </w:rPr>
-        <w:t>Obiectivul general al proiectului este proiectarea și implementarea unei baze de date care să sprijine organizarea activității unui salon de manichiură și a unei academii de nail art. Prin realizarea acestui proiect se urmărește păstrarea informațiilor într-un singur loc, astfel încât activitățile salonului și ale academiei să poată fi urmărite fără folosirea unor evidențe separate și greu de corelat. Un prim obiectiv este gestionarea persoanelor implicate, prin înregistrarea clienților și a angajaților și stabilirea drepturilor de acces în funcție de rolul fiecărui utilizator. Se dorește ca informațiile să poată fi consultate și modificate de persoanele autorizate, în funcție de responsabilitățile pe care le au în cadrul salonului sau academiei. Pentru clienți, proiectul urmărește păstrarea datelor de contact, a preferințelor, a alergiilor declarate și a istoricului serviciilor și cursurilor urmate, alături de evidența reducerilor de fidelitate și a celor onomastice. Pentru personal se urmărește organizarea informațiilor despre roluri, specializări, certificări și disponibilitate, astfel încât activitățile să fie atribuite persoanelor potrivite. Un alt obiectiv este gestionarea serviciilor oferite și a programărilor, prin posibilitatea înregistrării, modificării, anulării și mutării acestora atât de către clienți, cât și de către personalul autorizat. Organizarea programărilor trebuie să permită urmărirea serviciilor solicitate, a duratei și a prețului acestora și să evite suprapunerea activităților unui angajat. În ceea ce privește academia, proiectul urmărește organizarea cursurilor pe niveluri și tematici și evidența sesiunilor în care acestea sunt susținute. Se dorește gestionarea înscrierilor în limita locurilor disponibile, verificarea îndeplinirii condițiilor de ocupare a unui loc și păstrarea documentelor și a informațiilor despre plăți. Totodată, vor fi urmărite participarea cursanților, retragerile, eventualele înlocuiri și persoanele aflate pe lista de așteptare. O altă direcție a proiectului este gestionarea produselor și a consumabilelor, cu separarea resurselor destinate salonului de cele folosite la cursuri. Se urmărește cunoașterea cantităților disponibile, a modului în care acestea se modifică și a termenelor în care produsele pot fi utilizate. Păstrarea ingredientelor și a produselor folosite pentru fiecare client va permite consultarea istoricului și semnalarea unor posibile nepotriviri cu alergiile declarate. Proiectul urmărește și evidența aparaturii și a instrumentarului, pentru a putea fi cunoscute starea acestora, disponibilitatea și necesarul de întreținere sau înlocuire. În strânsă legătură cu această evidență, se dorește înregistrarea produselor și a protocoalelor de dezinfectare și sterilizare și păstrarea operațiunilor efectuate într-un registru. Acesta va permite urmărirea instrumentelor de la prelucrare și ambalare până la deschiderea pungii și utilizarea în cadrul unei programări. Un obiectiv suplimentar este păstrarea feedback-ului primit după servicii și cursuri, pentru consultarea observațiilor clienților și cursanților. În completare, proiectul urmărește păstrarea istoricului modificărilor importante și obținerea unor situații privind programările, activitatea personalului, înscrierile, plățile, stocurile și instrumentarul. Prin îndeplinirea acestor obiective, baza de date trebuie să ofere o evidență clară a activității salonului și academiei și să permită verificarea informațiilor necesare organizării zilnice.</w:t>
+        <w:t xml:space="preserve">Obiectivul general al proiectului este proiectarea și implementarea unei baze de date care să sprijine organizarea activității unui salon de manichiură și a unei academii de nail art. Prin realizarea acestui proiect se urmărește păstrarea informațiilor într-un singur loc, astfel încât activitățile salonului și ale academiei să poată fi urmărite fără folosirea unor evidențe separate și greu de corelat. Un prim obiectiv este gestionarea persoanelor implicate, prin înregistrarea clienților și a angajaților și stabilirea drepturilor de acces în funcție de rolul fiecărui utilizator. Se dorește ca informațiile să poată fi consultate și modificate de persoanele autorizate, în funcție de responsabilitățile pe care le au în cadrul salonului sau academiei. Pentru clienți, proiectul urmărește păstrarea datelor de contact, a preferințelor, a alergiilor declarate și a istoricului serviciilor și cursurilor urmate, alături de evidența reducerilor de fidelitate și a celor onomastice. Pentru personal se urmărește organizarea informațiilor despre roluri, specializări, certificări și disponibilitate, astfel încât activitățile să fie atribuite persoanelor potrivite. Un alt obiectiv este gestionarea serviciilor oferite și a programărilor, prin posibilitatea înregistrării, modificării, anulării și mutării acestora atât de către clienți, cât și de către personalul autorizat. Organizarea programărilor trebuie să permită urmărirea serviciilor solicitate, a duratei și a prețului acestora și să evite suprapunerea activităților unui angajat. În ceea ce privește academia, proiectul urmărește organizarea cursurilor pe niveluri și tematici și evidența sesiunilor în care acestea sunt susținute. Se dorește gestionarea înscrierilor în limita </w:t>
+      </w:r>
+      <w:r>
+        <w:rPr>
+          <w:rFonts w:ascii="Times New Roman" w:hAnsi="Times New Roman" w:cs="Times New Roman"/>
+          <w:sz w:val="24"/>
+          <w:szCs w:val="24"/>
+        </w:rPr>
+        <w:lastRenderedPageBreak/>
+        <w:t xml:space="preserve">locurilor disponibile, verificarea îndeplinirii condițiilor de ocupare a unui loc și păstrarea documentelor și a informațiilor despre plăți. Totodată, vor fi urmărite participarea cursanților, retragerile, eventualele înlocuiri și persoanele aflate pe lista de așteptare. O altă direcție a proiectului este gestionarea produselor și a consumabilelor, cu separarea resurselor destinate salonului de cele folosite la cursuri. Se urmărește cunoașterea cantităților disponibile, a modului în care acestea se modifică și a termenelor în care produsele pot fi utilizate. Păstrarea ingredientelor și a produselor folosite pentru fiecare client va permite consultarea istoricului și semnalarea unor posibile nepotriviri cu alergiile declarate. Proiectul urmărește și evidența aparaturii și a instrumentarului, pentru a putea fi cunoscute starea acestora, disponibilitatea și necesarul de întreținere sau înlocuire. În strânsă legătură cu această evidență, se dorește înregistrarea produselor și a protocoalelor de dezinfectare și sterilizare și păstrarea </w:t>
+      </w:r>
+      <w:r>
+        <w:rPr>
+          <w:rFonts w:ascii="Times New Roman" w:hAnsi="Times New Roman" w:cs="Times New Roman"/>
+          <w:sz w:val="24"/>
+          <w:szCs w:val="24"/>
+        </w:rPr>
+        <w:t>operațiunilor efectuate într-un registru. Acesta va permite urmărirea instrumentelor de la prelucrare și ambalare până la deschiderea pungii și utilizarea în cadrul unei programări</w:t>
+      </w:r>
+      <w:r>
+        <w:rPr>
+          <w:rFonts w:ascii="Times New Roman" w:hAnsi="Times New Roman" w:cs="Times New Roman"/>
+          <w:sz w:val="24"/>
+          <w:szCs w:val="24"/>
+        </w:rPr>
+        <w:t>Un obiectiv suplimentar este păstrarea feedback-ului primit după serviciile salonului, pentru consu</w:t>
+      </w:r>
+      <w:r>
+        <w:rPr>
+          <w:rFonts w:ascii="Times New Roman" w:hAnsi="Times New Roman" w:cs="Times New Roman"/>
+          <w:sz w:val="24"/>
+          <w:szCs w:val="24"/>
+        </w:rPr>
+        <w:t>ltarea observațiilor clienților</w:t>
+      </w:r>
+      <w:r>
+        <w:rPr>
+          <w:rFonts w:ascii="Times New Roman" w:hAnsi="Times New Roman" w:cs="Times New Roman"/>
+          <w:sz w:val="24"/>
+          <w:szCs w:val="24"/>
+        </w:rPr>
+        <w:t>. În</w:t>
+      </w:r>
+      <w:r>
+        <w:rPr>
+          <w:rFonts w:ascii="Times New Roman" w:hAnsi="Times New Roman" w:cs="Times New Roman"/>
+          <w:sz w:val="24"/>
+          <w:szCs w:val="24"/>
+        </w:rPr>
+        <w:t xml:space="preserve"> completare, proiectul urmărește păstrarea istoricului modificărilor importante și obținerea unor situații privind programările, activitatea personalului, înscrierile, plățile, stocurile și instrumentarul. Prin îndeplinirea acestor obiective, baza de date trebuie să ofere o evidență clară a activității salonului și academiei și să permită verificarea informațiilor necesare organizării zilnice.</w:t>
       </w:r>
     </w:p>
     <w:p>
@@ -1521,22 +1556,217 @@
           <w:color w:val="000000" w:themeColor="text1"/>
         </w:rPr>
       </w:pPr>
-      <w:bookmarkStart w:id="3" w:name="_Toc244253046"/>
-      <w:r>
-        <w:rPr>
-          <w:rFonts w:ascii="Times New Roman" w:hAnsi="Times New Roman" w:cs="Times New Roman"/>
-          <w:color w:val="000000" w:themeColor="text1"/>
-        </w:rPr>
+      <w:bookmarkStart w:id="2" w:name="_Toc244345902"/>
+      <w:r>
+        <w:rPr>
+          <w:rFonts w:ascii="Times New Roman" w:hAnsi="Times New Roman" w:cs="Times New Roman"/>
+          <w:color w:val="000000" w:themeColor="text1"/>
+        </w:rPr>
+        <w:t>Proiectare</w:t>
+      </w:r>
+      <w:bookmarkEnd w:id="2"/>
+    </w:p>
+    <w:p>
+      <w:pPr>
+        <w:rPr>
+          <w:rFonts w:ascii="Times New Roman" w:hAnsi="Times New Roman" w:cs="Times New Roman"/>
+          <w:color w:val="000000" w:themeColor="text1"/>
+        </w:rPr>
+      </w:pPr>
+    </w:p>
+    <w:p>
+      <w:pPr>
+        <w:pStyle w:val="Heading2"/>
+        <w:rPr>
+          <w:rFonts w:ascii="Times New Roman" w:hAnsi="Times New Roman" w:cs="Times New Roman"/>
+          <w:color w:val="000000" w:themeColor="text1"/>
+        </w:rPr>
+      </w:pPr>
+      <w:bookmarkStart w:id="3" w:name="_Toc244345903"/>
+      <w:r>
+        <w:rPr>
+          <w:rFonts w:ascii="Times New Roman" w:hAnsi="Times New Roman" w:cs="Times New Roman"/>
+          <w:color w:val="000000" w:themeColor="text1"/>
+        </w:rPr>
+        <w:t>Analiza cerintelor</w:t>
+      </w:r>
+      <w:bookmarkEnd w:id="3"/>
+    </w:p>
+    <w:p>
+      <w:pPr>
+        <w:rPr>
+          <w:rFonts w:ascii="Times New Roman" w:hAnsi="Times New Roman" w:cs="Times New Roman"/>
+          <w:color w:val="000000" w:themeColor="text1"/>
+        </w:rPr>
+      </w:pPr>
+    </w:p>
+    <w:p>
+      <w:pPr>
+        <w:pStyle w:val="my-2"/>
+      </w:pPr>
+      <w:r>
+        <w:t>Sistemul propus este destinat unui salon de manichiură care oferă servicii de îngrijire și stilizare a unghiilor și organizează cursuri de nail art. Salonul și academia folosesc o parte din aceleași resurse, precum angajații, aparatura și instrumentarul, dar au nevoie de evidențe distincte pentru programări, înscrieri și stocurile de produse. Pe baza activităților descrise au fost stabilite informațiile care trebuie păstrate și regulile după care acestea vor fi înregistrate, consultate și modificate.</w:t>
+      </w:r>
+      <w:r>
+        <w:t xml:space="preserve"> </w:t>
+      </w:r>
+      <w:r>
+        <w:t xml:space="preserve">Sistemul va permite înregistrarea utilizatorilor și atribuirea rolurilor </w:t>
+      </w:r>
+      <w:r>
+        <w:t>de client, tehnician si  trainer</w:t>
+      </w:r>
+      <w:r>
+        <w:t>. Un angajat va putea avea atât rol de tehnician, cât și de trainer. Clienții vor putea consulta și gestiona propriile programări și înscrieri, fără acces la datele altor clienți. Tehnicienii vor putea consulta programările atribuite, vor putea crea programări pentru clienți și vor avea acces la informațiile necesare prestării serviciilor. Trainerii vor putea consulta sesiunile de curs pe care le sus</w:t>
+      </w:r>
+      <w:r>
+        <w:t>țin și situația participanților</w:t>
+      </w:r>
+      <w:r>
+        <w:t>. Drepturile de consultare și modificare vor fi stabilite prin roluri și vizualizări, în funcție de responsabilitățile fiecărui utilizator.</w:t>
+      </w:r>
+      <w:r>
+        <w:t xml:space="preserve"> </w:t>
+      </w:r>
+      <w:r>
+        <w:t>Pentru clienți se vor păstra datele de identificare și de contact, preferințele, alergiile declarate și informațiile despre reducerile acordate. Același client va putea beneficia de servicii în salon și se va putea înscrie la cursurile academiei, fără să fie necesară înregistrarea sa ca persoană diferită. Istoricul său va cuprinde programările, serviciile efectuate, produsele utilizate și participările la cursuri. Pentru reducerile de fidelitate și cele onomastice se vor putea păstra tipul reducerii și valoarea aplicată, astfel încât prețul final al serviciilor să poată fi urmărit.</w:t>
+      </w:r>
+      <w:r>
+        <w:t xml:space="preserve"> </w:t>
+      </w:r>
+      <w:r>
+        <w:t xml:space="preserve">Pentru fiecare angajat se vor înregistra datele de identificare și de contact, rolurile, specializările și certificările deținute. Vor fi păstrate programul de lucru, concediile și celelalte perioade de indisponibilitate. Aceste informații vor fi folosite pentru stabilirea </w:t>
+      </w:r>
+      <w:r>
         <w:lastRenderedPageBreak/>
-        <w:t>Proiectare</w:t>
-      </w:r>
-      <w:bookmarkEnd w:id="3"/>
-    </w:p>
-    <w:p>
-      <w:pPr>
-        <w:rPr>
-          <w:rFonts w:ascii="Times New Roman" w:hAnsi="Times New Roman" w:cs="Times New Roman"/>
-          <w:color w:val="000000" w:themeColor="text1"/>
+        <w:t>activităților care îi pot fi atribuite. În cazul unui angajat care lucrează atât ca tehnician, cât și ca trainer, disponibilitatea va fi verificată ținând cont de ambele tipuri de activități.</w:t>
+      </w:r>
+      <w:r>
+        <w:t xml:space="preserve"> </w:t>
+      </w:r>
+      <w:r>
+        <w:t>Serviciile oferite de salon vor fi înregistrate cu denumire, descriere, categorie, durată și preț. Fiecare programare va fi asociată unui singur client și unui tehnician și va putea include unul sau mai multe servicii. Durata totală și prețul total vor fi stabilite pe baza serviciilor selectate. Pentru fiecare serviciu din programare se va păstra prețul aplicat la momentul înregistrării, astfel încât o modificare ulterioară a listei de prețuri să nu schimbe istoricul programărilor.</w:t>
+      </w:r>
+      <w:r>
+        <w:t xml:space="preserve"> </w:t>
+      </w:r>
+      <w:r>
+        <w:t>Programările vor putea fi create de clienți sau de personalul autorizat și vor putea fi modificate, anulate ori mutate la o altă dată sau oră. Înainte de confirmarea unei programări sau a unei modificări se va verifica disponibilitatea tehnicianului pe întreaga durată necesară. Nu vor fi permise suprapuneri cu alte programări, cu sesiunile de curs susținute de același angajat sau cu perioadele sale de absență. Pentru fiecare programare se va păstra situația acesteia, precum confirmată, finalizată, anulată sau neprezentare. Se vor putea înregistra motivul anulării, persoana care a efectuat schimbarea și data modificării.</w:t>
+      </w:r>
+      <w:r>
+        <w:t xml:space="preserve"> </w:t>
+      </w:r>
+      <w:r>
+        <w:t>În cadrul academiei se va face diferența între tipul de curs și sesiunea în care acesta se desfășoară. Tipurile de curs vor include niveluri sau tematici precum Bază 1, Bază 2, Bază 3, Master Tech, Trainer Forming, Trainers in Training și Întrețineri rapide. Pentru fiecare tip se vor păstra denumirea, nivelul sau tematica și descrierea conținutului. O sesiune va reprezenta organizarea unui anumit curs într-o perioadă stabilită, cu un trainer responsabil, un program, o durată și un preț. Același tip de curs va putea fi organizat în mai multe sesiuni.</w:t>
+      </w:r>
+      <w:r>
+        <w:t xml:space="preserve"> </w:t>
+      </w:r>
+      <w:r>
+        <w:t>Fiecare sesiune va avea maximum opt cursanți confirmați. Înscrierea va presupune plata avansului și adăugarea documentelor necesare în momentul înscrierii. Locul va fi ocupat numai după îndeplinirea ambelor condiții; simpla completare a datelor nu va reprezenta rezervarea unui loc. Sistemul va verifica numărul locurilor disponibile înainte de confirmare și nu va permite depășirea limitei, inclusiv atunci când mai multe înscrieri sunt efectuate în același timp. Pentru fiecare înscriere se vor păstra data, documentele depuse, prețul aplicat, avansul, data plății și eventualele plăți ulterioare. Pe baza acestora se va putea determina suma rămasă de achitat.</w:t>
+      </w:r>
+      <w:r>
+        <w:t xml:space="preserve"> </w:t>
+      </w:r>
+      <w:r>
+        <w:t>Dacă o sesiune nu mai are locuri disponibile, persoanele interesate vor putea fi înregistrate pe o listă de așteptare. Prezența pe această listă nu va fi considerată înscriere confirmată. În cazul eliberării unui loc, persoana care urmează să îl ocupe va trebui să îndeplinească aceleași condiții privind plata avansului și depunerea documentelor.</w:t>
+      </w:r>
+      <w:r>
+        <w:t xml:space="preserve"> </w:t>
+      </w:r>
+      <w:r>
+        <w:t>Conform regulii stabilite pentru proiect, retragerea de la curs va trebui anunțată cu cel puțin două săptămâni înainte de începerea sesiunii. Dacă retragerea nu este anunțată în acest termen, cursantul va trebui să participe sau să găsească un înlocuitor. Sistemul va înregistra data la care a fost comunicată retragerea și, dacă este cazul, persoana care preia locul și documentele acesteia. Înlocuirea nu va șterge informațiile despre înscrierea inițială și plățile deja înregistrate. Pentru fiecare participant se vor putea urmări prezența și situația participării, precum înscris, în curs de pregătire, finalizat, retras sau înlocuit.</w:t>
+      </w:r>
+      <w:r>
+        <w:t xml:space="preserve"> </w:t>
+      </w:r>
+      <w:r>
+        <w:t>Produsele și consumabilele vor fi înregistrate cu denumire, ingrediente și unitate de măsură. Se va face diferența între produsul din catalog și recipientele cumpărate din acel produs. Pentru fiecare recipient se vor păstra lotul din care provine, data cumpărării, termenul de expirare, data deschiderii și perioada de utilizare după deschidere. Recipientele aceluiași produs vor putea avea date diferite de cumpărare sau deschidere și vor fi urmărite separat. Starea unui recipient va putea fi nedeschis, în utilizare, epuizat sau eliminat.</w:t>
+      </w:r>
+      <w:r>
+        <w:t xml:space="preserve"> </w:t>
+      </w:r>
+      <w:r>
+        <w:t>Stocul salonului va fi evidențiat separat de cel al academiei. Fiecare cumpărare, utilizare, transfer între cele două stocuri sau eliminare va fi înregistrată cu data, cantitatea și motivul operațiunii. Nu vor fi permise ieșiri mai mari decât cantitatea disponibilă. Pentru fiecare produs se va putea stabili o cantitate minimă, iar produsele aflate sub această limită vor putea fi identificate pentru reaprovizionare. De asemenea, vor putea fi consultate recipientele care se apropie de termenul de expirare sau de sfârșitul perioadei de utilizare după deschidere.</w:t>
+      </w:r>
+      <w:r>
+        <w:t xml:space="preserve"> </w:t>
+      </w:r>
+      <w:r>
+        <w:t xml:space="preserve">Pentru o programare finalizată se vor putea înregistra produsele și recipientele </w:t>
+      </w:r>
+      <w:r>
+        <w:lastRenderedPageBreak/>
+        <w:t>folosite. Ingredientele acestora vor putea fi comparate cu alergiile declarate de client. Dacă un produs selectat conține un ingredient asociat unei alergii înregistrate, sistemul va afișa o avertizare pentru tehnician. Această verificare se va baza exclusiv pe informațiile existente în sistem și nu va reprezenta o garanție că un produs este sigur pentru persoana respectivă.</w:t>
+      </w:r>
+      <w:r>
+        <w:t xml:space="preserve"> </w:t>
+      </w:r>
+      <w:r>
+        <w:t>Pentru aparatură se vor păstra denumirea, categoria, furnizorul, data cumpărării, garanția și starea de funcționare. Vor putea fi înregistrate termenele de verificare, întreținere sau înlocuire stabilite pentru fiecare echipament. Aparatura va putea fi marcată ca funcțională, defectă, în reparație sau scoasă din utilizare și va putea fi asociată serviciilor și sesiunilor de curs pentru care este necesară. Instrumentarul va avea o evidență separată și va putea fi identificat individual sau ca parte a unui set.</w:t>
+      </w:r>
+      <w:r>
+        <w:t xml:space="preserve"> </w:t>
+      </w:r>
+      <w:r>
+        <w:t>Soluțiile și materialele folosite pentru dezinfectare și sterilizare vor fi înregistrate distinct, cu informații despre destinație, cantitate, lot, termen de expirare și data deschiderii, după caz. Sistemul va permite păstrarea protocoalelor utilizate pentru diferite categorii de instrumente și echipamente. Pentru fiecare protocol se vor înregistra tipul operațiunii, pașii de lucru, produsele necesare și informațiile care trebuie completate la efectuarea acesteia.</w:t>
+      </w:r>
+      <w:r>
+        <w:t xml:space="preserve"> </w:t>
+      </w:r>
+      <w:r>
+        <w:t>Operațiunile de dezinfectare și sterilizare vor fi păstrate într-un registru, cu diferențierea tipului de operațiune. Fiecare înregistrare va cuprinde data și ora, angajatul responsabil, instrumentarul sau echipamentul prelucrat, protocolul urmat, soluțiile și materialele utilizate, aparatura folosită, după caz, și rezultatele verificărilor. Se vor putea adăuga observații și imagini asociate verificărilor. Registrul va păstra evidența operațiunilor declarate și a rezultatelor introduse, fără ca simpla completare a unei înregistrări să fie considerată o confirmare a respectării tuturor cerințelor de igienă.</w:t>
+      </w:r>
+      <w:r>
+        <w:t xml:space="preserve"> </w:t>
+      </w:r>
+      <w:r>
+        <w:t>Fiecare pungă de instrumente va avea un cod unic și va fi asociată listei instrumentelor conținute și operațiunii de sterilizare în care a fost prelucrată. Se vor putea păstra rezultatul verificării și imaginea martorului de sterilizare. La deschiderea pungii se vor înregistra data, programarea la care a fost utilizată și se va putea atașa imaginea martorului. O pungă înregistrată ca deschisă nu va mai putea fi atribuită unei alte utilizări ca pungă sigilată. Dacă rezultatul unei verificări este necorespunzător, instrumentarul va fi marcat ca indisponibil până la înregistrarea unei noi prelucrări cu rezultat corespunzător.</w:t>
+      </w:r>
+      <w:r>
+        <w:t xml:space="preserve"> </w:t>
+      </w:r>
+      <w:r>
+        <w:t xml:space="preserve">Clienții vor putea oferi feedback după finalizarea programărilor. Fiecare feedback va fi asociat </w:t>
+      </w:r>
+      <w:r>
+        <w:t>programarii</w:t>
+      </w:r>
+      <w:r>
+        <w:t xml:space="preserve"> la care se referă. Pentru modificările importante, precum mutarea programărilor, înregistrarea plăților, înlocuirea cursanților, modificarea stocurilor și completarea registrului, se vor păstra utilizatorul responsabil și data efectuării.</w:t>
+      </w:r>
+      <w:r>
+        <w:t xml:space="preserve"> </w:t>
+      </w:r>
+      <w:r>
+        <w:t>Pe baza datelor înregistrate, sistemul va permite consultarea programărilor unui tehnician pentru o anumită perioadă, a disponibilității personalului, a participanților și locurilor libere la cursuri, a avansurilor și sumelor rămase de plată, a produselor care necesită reaprovizionare și a recipientelor apropiate de sfârșitul perioadei de utilizare. Vor putea fi consultate și situații privind aparatura defectă sau indisponibilă, operațiunile de dezinfectare și sterilizare și istoricul unei pungi de instrumente, de la pregătire până la utilizare.</w:t>
+      </w:r>
+    </w:p>
+    <w:p>
+      <w:pPr>
+        <w:rPr>
+          <w:rFonts w:ascii="Times New Roman" w:eastAsia="Times New Roman" w:hAnsi="Times New Roman" w:cs="Times New Roman"/>
+          <w:sz w:val="24"/>
+          <w:szCs w:val="24"/>
+          <w:lang w:eastAsia="ro-RO"/>
+        </w:rPr>
+      </w:pPr>
+      <w:r>
+        <w:br w:type="page"/>
+      </w:r>
+    </w:p>
+    <w:p>
+      <w:pPr>
+        <w:pStyle w:val="my-2"/>
+      </w:pPr>
+    </w:p>
+    <w:p>
+      <w:pPr>
+        <w:rPr>
+          <w:rFonts w:ascii="Times New Roman" w:hAnsi="Times New Roman" w:cs="Times New Roman"/>
+          <w:color w:val="000000" w:themeColor="text1"/>
+          <w:sz w:val="24"/>
+          <w:szCs w:val="24"/>
         </w:rPr>
       </w:pPr>
     </w:p>
@@ -1548,13 +1778,13 @@
           <w:color w:val="000000" w:themeColor="text1"/>
         </w:rPr>
       </w:pPr>
-      <w:bookmarkStart w:id="4" w:name="_Toc244253047"/>
-      <w:r>
-        <w:rPr>
-          <w:rFonts w:ascii="Times New Roman" w:hAnsi="Times New Roman" w:cs="Times New Roman"/>
-          <w:color w:val="000000" w:themeColor="text1"/>
-        </w:rPr>
-        <w:t>Analiza cerintelor</w:t>
+      <w:bookmarkStart w:id="4" w:name="_Toc244345904"/>
+      <w:r>
+        <w:rPr>
+          <w:rFonts w:ascii="Times New Roman" w:hAnsi="Times New Roman" w:cs="Times New Roman"/>
+          <w:color w:val="000000" w:themeColor="text1"/>
+        </w:rPr>
+        <w:t>Modelul conceptual (Diagrama ER)</w:t>
       </w:r>
       <w:bookmarkEnd w:id="4"/>
     </w:p>
@@ -1563,214 +1793,6 @@
         <w:rPr>
           <w:rFonts w:ascii="Times New Roman" w:hAnsi="Times New Roman" w:cs="Times New Roman"/>
           <w:color w:val="000000" w:themeColor="text1"/>
-        </w:rPr>
-      </w:pPr>
-    </w:p>
-    <w:p>
-      <w:pPr>
-        <w:pStyle w:val="my-2"/>
-      </w:pPr>
-      <w:r>
-        <w:t>Sistemul propus este destinat unui salon de manichiură care oferă servicii de îngrijire și stilizare a unghiilor și organizează cursuri de nail art. Salonul și academia folosesc o parte din aceleași resurse, precum angajații, aparatura și instrumentarul, dar au nevoie de evidențe distincte pentru programări, înscrieri și stocurile de produse. Pe baza activităților descrise au fost stabilite informațiile care trebuie păstrate și regulile după care acestea vor fi înregistrate, consultate și modificate.</w:t>
-      </w:r>
-    </w:p>
-    <w:p>
-      <w:pPr>
-        <w:pStyle w:val="my-2"/>
-      </w:pPr>
-      <w:r>
-        <w:t>Sistemul va permite înregistrarea utilizatorilor și atribuirea rolurilor de client, tehnician, trainer și administrator. Un angajat va putea avea atât rol de tehnician, cât și de trainer. Clienții vor putea consulta și gestiona propriile programări și înscrieri, fără acces la datele altor clienți. Tehnicienii vor putea consulta programările atribuite, vor putea crea programări pentru clienți și vor avea acces la informațiile necesare prestării serviciilor. Trainerii vor putea consulta sesiunile de curs pe care le susțin și situația participanților. Administratorul va putea gestiona informațiile necesare organizării salonului și academiei. Drepturile de consultare și modificare vor fi stabilite prin roluri și vizualizări, în funcție de responsabilitățile fiecărui utilizator.</w:t>
-      </w:r>
-    </w:p>
-    <w:p>
-      <w:pPr>
-        <w:pStyle w:val="my-2"/>
-      </w:pPr>
-      <w:r>
-        <w:t>Pentru clienți se vor păstra datele de identificare și de contact, preferințele, alergiile declarate și informațiile despre reducerile acordate. Același client va putea beneficia de servicii în salon și se va putea înscrie la cursurile academiei, fără să fie necesară înregistrarea sa ca persoană diferită. Istoricul său va cuprinde programările, serviciile efectuate, produsele utilizate și participările la cursuri. Pentru reducerile de fidelitate și cele onomastice se vor putea păstra tipul reducerii și valoarea aplicată, astfel încât prețul final al serviciilor să poată fi urmărit.</w:t>
-      </w:r>
-    </w:p>
-    <w:p>
-      <w:pPr>
-        <w:pStyle w:val="my-2"/>
-      </w:pPr>
-      <w:r>
-        <w:t>Pentru fiecare angajat se vor înregistra datele de identificare și de contact, rolurile, specializările și certificările deținute. Vor fi păstrate programul de lucru, concediile și celelalte perioade de indisponibilitate. Aceste informații vor fi folosite pentru stabilirea activităților care îi pot fi atribuite. În cazul unui angajat care lucrează atât ca tehnician, cât și ca trainer, disponibilitatea va fi verificată ținând cont de ambele tipuri de activități.</w:t>
-      </w:r>
-    </w:p>
-    <w:p>
-      <w:pPr>
-        <w:pStyle w:val="my-2"/>
-      </w:pPr>
-      <w:r>
-        <w:t>Serviciile oferite de salon vor fi înregistrate cu denumire, descriere, categorie, durată și preț. Fiecare programare va fi asociată unui singur client și unui tehnician și va putea include unul sau mai multe servicii. Durata totală și prețul total vor fi stabilite pe baza serviciilor selectate. Pentru fiecare serviciu din programare se va păstra prețul aplicat la momentul înregistrării, astfel încât o modificare ulterioară a listei de prețuri să nu schimbe istoricul programărilor.</w:t>
-      </w:r>
-    </w:p>
-    <w:p>
-      <w:pPr>
-        <w:pStyle w:val="my-2"/>
-      </w:pPr>
-      <w:r>
-        <w:t>Programările vor putea fi create de clienți sau de personalul autorizat și vor putea fi modificate, anulate ori mutate la o altă dată sau oră. Înainte de confirmarea unei programări sau a unei modificări se va verifica disponibilitatea tehnicianului pe întreaga durată necesară. Nu vor fi permise suprapuneri cu alte programări, cu sesiunile de curs susținute de același angajat sau cu perioadele sale de absență. Pentru fiecare programare se va păstra situația acesteia, precum confirmată, finalizată, anulată sau neprezentare. Se vor putea înregistra motivul anulării, persoana care a efectuat schimbarea și data modificării.</w:t>
-      </w:r>
-    </w:p>
-    <w:p>
-      <w:pPr>
-        <w:pStyle w:val="my-2"/>
-      </w:pPr>
-      <w:r>
-        <w:lastRenderedPageBreak/>
-        <w:t>În cadrul academiei se va face diferența între tipul de curs și sesiunea în care acesta se desfășoară. Tipurile de curs vor include niveluri sau tematici precum Bază 1, Bază 2, Bază 3, Master Tech, Trainer Forming, Trainers in Training și Întrețineri rapide. Pentru fiecare tip se vor păstra denumirea, nivelul sau tematica și descrierea conținutului. O sesiune va reprezenta organizarea unui anumit curs într-o perioadă stabilită, cu un trainer responsabil, un program, o durată și un preț. Același tip de curs va putea fi organizat în mai multe sesiuni.</w:t>
-      </w:r>
-    </w:p>
-    <w:p>
-      <w:pPr>
-        <w:pStyle w:val="my-2"/>
-      </w:pPr>
-      <w:r>
-        <w:t>Fiecare sesiune va avea maximum opt cursanți confirmați. Înscrierea va presupune plata avansului și adăugarea documentelor necesare în momentul înscrierii. Locul va fi ocupat numai după îndeplinirea ambelor condiții; simpla completare a datelor nu va reprezenta rezervarea unui loc. Sistemul va verifica numărul locurilor disponibile înainte de confirmare și nu va permite depășirea limitei, inclusiv atunci când mai multe înscrieri sunt efectuate în același timp. Pentru fiecare înscriere se vor păstra data, documentele depuse, prețul aplicat, avansul, data plății și eventualele plăți ulterioare. Pe baza acestora se va putea determina suma rămasă de achitat.</w:t>
-      </w:r>
-    </w:p>
-    <w:p>
-      <w:pPr>
-        <w:pStyle w:val="my-2"/>
-      </w:pPr>
-      <w:r>
-        <w:t>Dacă o sesiune nu mai are locuri disponibile, persoanele interesate vor putea fi înregistrate pe o listă de așteptare. Prezența pe această listă nu va fi considerată înscriere confirmată. În cazul eliberării unui loc, persoana care urmează să îl ocupe va trebui să îndeplinească aceleași condiții privind plata avansului și depunerea documentelor.</w:t>
-      </w:r>
-    </w:p>
-    <w:p>
-      <w:pPr>
-        <w:pStyle w:val="my-2"/>
-      </w:pPr>
-      <w:r>
-        <w:t>Conform regulii stabilite pentru proiect, retragerea de la curs va trebui anunțată cu cel puțin două săptămâni înainte de începerea sesiunii. Dacă retragerea nu este anunțată în acest termen, cursantul va trebui să participe sau să găsească un înlocuitor. Sistemul va înregistra data la care a fost comunicată retragerea și, dacă este cazul, persoana care preia locul și documentele acesteia. Înlocuirea nu va șterge informațiile despre înscrierea inițială și plățile deja înregistrate. Pentru fiecare participant se vor putea urmări prezența și situația participării, precum înscris, în curs de pregătire, finalizat, retras sau înlocuit.</w:t>
-      </w:r>
-    </w:p>
-    <w:p>
-      <w:pPr>
-        <w:pStyle w:val="my-2"/>
-      </w:pPr>
-      <w:r>
-        <w:t>Produsele și consumabilele vor fi înregistrate cu denumire, ingrediente și unitate de măsură. Se va face diferența între produsul din catalog și recipientele cumpărate din acel produs. Pentru fiecare recipient se vor păstra lotul din care provine, data cumpărării, termenul de expirare, data deschiderii și perioada de utilizare după deschidere. Recipientele aceluiași produs vor putea avea date diferite de cumpărare sau deschidere și vor fi urmărite separat. Starea unui recipient va putea fi nedeschis, în utilizare, epuizat sau eliminat.</w:t>
-      </w:r>
-    </w:p>
-    <w:p>
-      <w:pPr>
-        <w:pStyle w:val="my-2"/>
-      </w:pPr>
-      <w:r>
-        <w:t>Stocul salonului va fi evidențiat separat de cel al academiei. Fiecare cumpărare, utilizare, transfer între cele două stocuri sau eliminare va fi înregistrată cu data, cantitatea și motivul operațiunii. Nu vor fi permise ieșiri mai mari decât cantitatea disponibilă. Pentru fiecare produs se va putea stabili o cantitate minimă, iar produsele aflate sub această limită vor putea fi identificate pentru reaprovizionare. De asemenea, vor putea fi consultate recipientele care se apropie de termenul de expirare sau de sfârșitul perioadei de utilizare după deschidere.</w:t>
-      </w:r>
-    </w:p>
-    <w:p>
-      <w:pPr>
-        <w:pStyle w:val="my-2"/>
-      </w:pPr>
-      <w:r>
-        <w:t>Pentru o programare finalizată se vor putea înregistra produsele și recipientele folosite. Ingredientele acestora vor putea fi comparate cu alergiile declarate de client. Dacă un produs selectat conține un ingredient asociat unei alergii înregistrate, sistemul va afișa o avertizare pentru tehnician. Această verificare se va baza exclusiv pe informațiile existente în sistem și nu va reprezenta o garanție că un produs este sigur pentru persoana respectivă.</w:t>
-      </w:r>
-    </w:p>
-    <w:p>
-      <w:pPr>
-        <w:pStyle w:val="my-2"/>
-      </w:pPr>
-      <w:r>
-        <w:lastRenderedPageBreak/>
-        <w:t>Pentru aparatură se vor păstra denumirea, categoria, furnizorul, data cumpărării, garanția și starea de funcționare. Vor putea fi înregistrate termenele de verificare, întreținere sau înlocuire stabilite pentru fiecare echipament. Aparatura va putea fi marcată ca funcțională, defectă, în reparație sau scoasă din utilizare și va putea fi asociată serviciilor și sesiunilor de curs pentru care este necesară. Instrumentarul va avea o evidență separată și va putea fi identificat individual sau ca parte a unui set.</w:t>
-      </w:r>
-    </w:p>
-    <w:p>
-      <w:pPr>
-        <w:pStyle w:val="my-2"/>
-      </w:pPr>
-      <w:r>
-        <w:t>Soluțiile și materialele folosite pentru dezinfectare și sterilizare vor fi înregistrate distinct, cu informații despre destinație, cantitate, lot, termen de expirare și data deschiderii, după caz. Sistemul va permite păstrarea protocoalelor utilizate pentru diferite categorii de instrumente și echipamente. Pentru fiecare protocol se vor înregistra tipul operațiunii, pașii de lucru, produsele necesare și informațiile care trebuie completate la efectuarea acesteia.</w:t>
-      </w:r>
-    </w:p>
-    <w:p>
-      <w:pPr>
-        <w:pStyle w:val="my-2"/>
-      </w:pPr>
-      <w:r>
-        <w:t>Operațiunile de dezinfectare și sterilizare vor fi păstrate într-un registru, cu diferențierea tipului de operațiune. Fiecare înregistrare va cuprinde data și ora, angajatul responsabil, instrumentarul sau echipamentul prelucrat, protocolul urmat, soluțiile și materialele utilizate, aparatura folosită, după caz, și rezultatele verificărilor. Se vor putea adăuga observații și imagini asociate verificărilor. Registrul va păstra evidența operațiunilor declarate și a rezultatelor introduse, fără ca simpla completare a unei înregistrări să fie considerată o confirmare a respectării tuturor cerințelor de igienă.</w:t>
-      </w:r>
-    </w:p>
-    <w:p>
-      <w:pPr>
-        <w:pStyle w:val="my-2"/>
-      </w:pPr>
-      <w:r>
-        <w:t>Fiecare pungă de instrumente va avea un cod unic și va fi asociată listei instrumentelor conținute și operațiunii de sterilizare în care a fost prelucrată. Se vor putea păstra rezultatul verificării și imaginea martorului de sterilizare. La deschiderea pungii se vor înregistra data, programarea la care a fost utilizată și se va putea atașa imaginea martorului. O pungă înregistrată ca deschisă nu va mai putea fi atribuită unei alte utilizări ca pungă sigilată. Dacă rezultatul unei verificări este necorespunzător, instrumentarul va fi marcat ca indisponibil până la înregistrarea unei noi prelucrări cu rezultat corespunzător.</w:t>
-      </w:r>
-    </w:p>
-    <w:p>
-      <w:pPr>
-        <w:pStyle w:val="my-2"/>
-      </w:pPr>
-      <w:r>
-        <w:t>Clienții vor putea oferi feedback după finalizarea programărilor, iar cursanții după participarea la cursuri. Fiecare feedback va fi asociat activității la care se referă. Pentru modificările importante, precum mutarea programărilor, înregistrarea plăților, înlocuirea cursanților, modificarea stocurilor și completarea registrului, se vor păstra utilizatorul responsabil și data efectuării.</w:t>
-      </w:r>
-    </w:p>
-    <w:p>
-      <w:pPr>
-        <w:pStyle w:val="my-2"/>
-      </w:pPr>
-      <w:r>
-        <w:t>Pe baza datelor înregistrate, sistemul va permite consultarea programărilor unui tehnician pentru o anumită perioadă, a disponibilității personalului, a participanților și locurilor libere la cursuri, a avansurilor și sumelor rămase de plată, a produselor care necesită reaprovizionare și a recipientelor apropiate de sfârșitul perioadei de utilizare. Vor putea fi consultate și situații privind aparatura defectă sau indisponibilă, operațiunile de dezinfectare și sterilizare și istoricul unei pungi de instrumente, de la pregătire până la utilizare.</w:t>
-      </w:r>
-    </w:p>
-    <w:p>
-      <w:pPr>
-        <w:rPr>
-          <w:rFonts w:ascii="Times New Roman" w:eastAsia="Times New Roman" w:hAnsi="Times New Roman" w:cs="Times New Roman"/>
-          <w:sz w:val="24"/>
-          <w:szCs w:val="24"/>
-          <w:lang w:eastAsia="ro-RO"/>
-        </w:rPr>
-      </w:pPr>
-      <w:r>
-        <w:br w:type="page"/>
-      </w:r>
-    </w:p>
-    <w:p>
-      <w:pPr>
-        <w:pStyle w:val="my-2"/>
-      </w:pPr>
-    </w:p>
-    <w:p>
-      <w:pPr>
-        <w:rPr>
-          <w:rFonts w:ascii="Times New Roman" w:hAnsi="Times New Roman" w:cs="Times New Roman"/>
-          <w:color w:val="000000" w:themeColor="text1"/>
-          <w:sz w:val="24"/>
-          <w:szCs w:val="24"/>
-        </w:rPr>
-      </w:pPr>
-    </w:p>
-    <w:p>
-      <w:pPr>
-        <w:pStyle w:val="Heading2"/>
-        <w:rPr>
-          <w:rFonts w:ascii="Times New Roman" w:hAnsi="Times New Roman" w:cs="Times New Roman"/>
-          <w:color w:val="000000" w:themeColor="text1"/>
-        </w:rPr>
-      </w:pPr>
-      <w:bookmarkStart w:id="5" w:name="_Toc244253048"/>
-      <w:r>
-        <w:rPr>
-          <w:rFonts w:ascii="Times New Roman" w:hAnsi="Times New Roman" w:cs="Times New Roman"/>
-          <w:color w:val="000000" w:themeColor="text1"/>
-        </w:rPr>
-        <w:t>Modelul conceptual (Diagrama ER)</w:t>
-      </w:r>
-      <w:bookmarkEnd w:id="5"/>
-    </w:p>
-    <w:p>
-      <w:pPr>
-        <w:rPr>
-          <w:rFonts w:ascii="Times New Roman" w:hAnsi="Times New Roman" w:cs="Times New Roman"/>
-          <w:color w:val="000000" w:themeColor="text1"/>
           <w:sz w:val="24"/>
           <w:szCs w:val="24"/>
         </w:rPr>
@@ -1800,15 +1822,6 @@
         </w:rPr>
         <w:t xml:space="preserve"> </w:t>
       </w:r>
-    </w:p>
-    <w:p>
-      <w:pPr>
-        <w:rPr>
-          <w:rFonts w:ascii="Times New Roman" w:hAnsi="Times New Roman" w:cs="Times New Roman"/>
-          <w:sz w:val="24"/>
-          <w:szCs w:val="24"/>
-        </w:rPr>
-      </w:pPr>
       <w:r>
         <w:rPr>
           <w:rFonts w:ascii="Times New Roman" w:hAnsi="Times New Roman" w:cs="Times New Roman"/>
@@ -2102,7 +2115,23 @@
           <w:sz w:val="24"/>
           <w:szCs w:val="24"/>
         </w:rPr>
-        <w:t xml:space="preserve">, </w:t>
+        <w:t xml:space="preserve"> </w:t>
+      </w:r>
+      <w:r>
+        <w:rPr>
+          <w:rFonts w:ascii="Times New Roman" w:hAnsi="Times New Roman" w:cs="Times New Roman"/>
+          <w:sz w:val="24"/>
+          <w:szCs w:val="24"/>
+        </w:rPr>
+        <w:t>si</w:t>
+      </w:r>
+      <w:r>
+        <w:rPr>
+          <w:rFonts w:asciiTheme="majorHAnsi" w:hAnsiTheme="majorHAnsi" w:cstheme="majorHAnsi"/>
+          <w:sz w:val="24"/>
+          <w:szCs w:val="24"/>
+        </w:rPr>
+        <w:t xml:space="preserve"> </w:t>
       </w:r>
       <w:r>
         <w:rPr>
@@ -2115,27 +2144,11 @@
       </w:r>
       <w:r>
         <w:rPr>
-          <w:rFonts w:asciiTheme="majorHAnsi" w:hAnsiTheme="majorHAnsi" w:cstheme="majorHAnsi"/>
-          <w:sz w:val="24"/>
-          <w:szCs w:val="24"/>
-        </w:rPr>
-        <w:t xml:space="preserve"> </w:t>
-      </w:r>
-      <w:r>
-        <w:rPr>
-          <w:rFonts w:ascii="Times New Roman" w:hAnsi="Times New Roman" w:cs="Times New Roman"/>
-          <w:sz w:val="24"/>
-          <w:szCs w:val="24"/>
-        </w:rPr>
-        <w:t>și</w:t>
-      </w:r>
-      <w:r>
-        <w:rPr>
-          <w:rFonts w:asciiTheme="majorHAnsi" w:hAnsiTheme="majorHAnsi" w:cstheme="majorHAnsi"/>
-          <w:sz w:val="24"/>
-          <w:szCs w:val="24"/>
-        </w:rPr>
-        <w:t xml:space="preserve"> </w:t>
+          <w:rFonts w:ascii="Times New Roman" w:hAnsi="Times New Roman" w:cs="Times New Roman"/>
+          <w:sz w:val="24"/>
+          <w:szCs w:val="24"/>
+        </w:rPr>
+        <w:t xml:space="preserve">. Entitatea </w:t>
       </w:r>
       <w:r>
         <w:rPr>
@@ -2144,15 +2157,15 @@
           <w:sz w:val="24"/>
           <w:szCs w:val="24"/>
         </w:rPr>
-        <w:t>Feedback_Curs</w:t>
-      </w:r>
-      <w:r>
-        <w:rPr>
-          <w:rFonts w:ascii="Times New Roman" w:hAnsi="Times New Roman" w:cs="Times New Roman"/>
-          <w:sz w:val="24"/>
-          <w:szCs w:val="24"/>
-        </w:rPr>
-        <w:t xml:space="preserve">. Entitatea </w:t>
+        <w:t>Curs</w:t>
+      </w:r>
+      <w:r>
+        <w:rPr>
+          <w:rFonts w:ascii="Times New Roman" w:hAnsi="Times New Roman" w:cs="Times New Roman"/>
+          <w:sz w:val="24"/>
+          <w:szCs w:val="24"/>
+        </w:rPr>
+        <w:t xml:space="preserve"> descrie tipul de pregătire oferit, iar </w:t>
       </w:r>
       <w:r>
         <w:rPr>
@@ -2161,15 +2174,15 @@
           <w:sz w:val="24"/>
           <w:szCs w:val="24"/>
         </w:rPr>
-        <w:t>Curs</w:t>
-      </w:r>
-      <w:r>
-        <w:rPr>
-          <w:rFonts w:ascii="Times New Roman" w:hAnsi="Times New Roman" w:cs="Times New Roman"/>
-          <w:sz w:val="24"/>
-          <w:szCs w:val="24"/>
-        </w:rPr>
-        <w:t xml:space="preserve"> descrie tipul de pregătire oferit, iar </w:t>
+        <w:t>Sesiune_Curs</w:t>
+      </w:r>
+      <w:r>
+        <w:rPr>
+          <w:rFonts w:ascii="Times New Roman" w:hAnsi="Times New Roman" w:cs="Times New Roman"/>
+          <w:sz w:val="24"/>
+          <w:szCs w:val="24"/>
+        </w:rPr>
+        <w:t xml:space="preserve"> reprezintă organizarea acestuia într-o anumită perioadă, cu un program, un preț și un trainer responsabil. Relația dintre curs și sesiune este de tip unu-la-mulți, deoarece același curs poate fi organizat de mai multe ori. În mod asemănător, un angajat cu rol de trainer poate susține mai multe sesiuni. Entitatea </w:t>
       </w:r>
       <w:r>
         <w:rPr>
@@ -2178,23 +2191,6 @@
           <w:sz w:val="24"/>
           <w:szCs w:val="24"/>
         </w:rPr>
-        <w:t>Sesiune_Curs</w:t>
-      </w:r>
-      <w:r>
-        <w:rPr>
-          <w:rFonts w:ascii="Times New Roman" w:hAnsi="Times New Roman" w:cs="Times New Roman"/>
-          <w:sz w:val="24"/>
-          <w:szCs w:val="24"/>
-        </w:rPr>
-        <w:t xml:space="preserve"> reprezintă organizarea acestuia într-o anumită perioadă, cu un program, un preț și un trainer responsabil. Relația dintre curs și sesiune este de tip unu-la-mulți, deoarece același curs poate fi organizat de mai multe ori. În mod asemănător, un angajat cu rol de trainer poate susține mai multe sesiuni. Entitatea </w:t>
-      </w:r>
-      <w:r>
-        <w:rPr>
-          <w:rStyle w:val="HTMLCode"/>
-          <w:rFonts w:asciiTheme="majorHAnsi" w:eastAsiaTheme="minorHAnsi" w:hAnsiTheme="majorHAnsi" w:cstheme="majorHAnsi"/>
-          <w:sz w:val="24"/>
-          <w:szCs w:val="24"/>
-        </w:rPr>
         <w:t>Inscriere</w:t>
       </w:r>
       <w:r>
@@ -2203,26 +2199,34 @@
           <w:sz w:val="24"/>
           <w:szCs w:val="24"/>
         </w:rPr>
-        <w:t xml:space="preserve"> face legătura dintre client și sesiunea de curs aleasă. Aceasta păstrează informații despre data înscrierii, situația participării, prețul aplicat, prezență și eventuala retragere. Plățile și documentele sunt reprezentate separat și asociate înscrierii corespunzătoare. Această organizare permite păstrarea mai multor plăți și documente pentru aceeași înscriere. Modelul include și relația prin care un client poate fi trecut pe lista de așteptare pentru o sesiune, precum și posibilitatea de a urmări înlocuirea unei înscrieri cu alta. Feedback-ul cursantului este asociat înscrierii, pentru a putea fi identificată sesiunea la care se referă. Pentru activitatea academiei se aplică regulile stabilite în analiza cerințelor: o sesiune are maximum opt participanți confirmați, iar ocuparea locului presupune plata avansului și depunerea documentelor necesare în momentul înscrierii. Retragerea trebuie anunțată cu minimum două săptămâni înainte de începerea sesiunii; în caz contrar, conform regulii proiectului, cursantul trebuie să participe sau să </w:t>
-      </w:r>
-      <w:r>
-        <w:rPr>
-          <w:rFonts w:ascii="Times New Roman" w:hAnsi="Times New Roman" w:cs="Times New Roman"/>
-          <w:sz w:val="24"/>
-          <w:szCs w:val="24"/>
+        <w:t xml:space="preserve"> face legătura dintre client și sesiunea de curs aleasă. Aceasta păstrează informații despre data înscrierii, situația participării, prețul aplicat, prezență și eventuala retragere. Plățile și documentele sunt reprezentate separat și asociate înscrierii corespunzătoare. Această organizare permite păstrarea mai multor plăți și documente pentru aceeași înscriere. Modelul include și relația prin care un client poate fi trecut pe lista de așteptare pentru o sesiune, precum și posibilitatea de a urmări în</w:t>
+      </w:r>
+      <w:r>
+        <w:rPr>
+          <w:rFonts w:ascii="Times New Roman" w:hAnsi="Times New Roman" w:cs="Times New Roman"/>
+          <w:sz w:val="24"/>
+          <w:szCs w:val="24"/>
+        </w:rPr>
+        <w:t>locuirea unei înscrieri cu alta</w:t>
+      </w:r>
+      <w:r>
+        <w:rPr>
+          <w:rFonts w:ascii="Times New Roman" w:hAnsi="Times New Roman" w:cs="Times New Roman"/>
+          <w:sz w:val="24"/>
+          <w:szCs w:val="24"/>
+        </w:rPr>
+        <w:t>. Pentru activitatea academiei se aplică regulile stabilite în analiza cerințelor: o sesiune are maximum opt participanți confirmați, iar ocuparea locului presupune plata avansului și depunerea documentelor necesare în momentul înscrierii. Retragerea trebuie anunțată cu minimum două săptămâni înainte de începerea sesiunii; în caz contrar, conform regulii proiectului, cursantul trebuie să participe sau să găsească un înlocuitor. Aceste condiții completează relațiile reprezentate în diagramă și vor fi avute în vedere la implementare.</w:t>
+      </w:r>
+    </w:p>
+    <w:p>
+      <w:pPr>
+        <w:pStyle w:val="my-2"/>
+      </w:pPr>
+      <w:r>
+        <w:rPr>
+          <w:noProof/>
         </w:rPr>
         <w:lastRenderedPageBreak/>
-        <w:t>găsească un înlocuitor. Aceste condiții completează relațiile reprezentate în diagramă și vor fi avute în vedere la implementare.</w:t>
-      </w:r>
-    </w:p>
-    <w:p>
-      <w:pPr>
-        <w:pStyle w:val="my-2"/>
-      </w:pPr>
-      <w:r>
-        <w:rPr>
-          <w:noProof/>
-        </w:rPr>
         <w:drawing>
           <wp:inline distT="0" distB="0" distL="0" distR="0">
             <wp:extent cx="5759450" cy="2235835"/>
@@ -2557,6 +2561,7 @@
     </w:p>
     <w:p>
       <w:pPr>
+        <w:jc w:val="center"/>
         <w:rPr>
           <w:rFonts w:ascii="Times New Roman" w:hAnsi="Times New Roman" w:cs="Times New Roman"/>
           <w:color w:val="000000" w:themeColor="text1"/>
@@ -2616,18 +2621,6 @@
           </wp:inline>
         </w:drawing>
       </w:r>
-    </w:p>
-    <w:p>
-      <w:pPr>
-        <w:jc w:val="center"/>
-        <w:rPr>
-          <w:rFonts w:ascii="Times New Roman" w:hAnsi="Times New Roman" w:cs="Times New Roman"/>
-          <w:i/>
-          <w:color w:val="000000" w:themeColor="text1"/>
-          <w:sz w:val="24"/>
-          <w:szCs w:val="24"/>
-        </w:rPr>
-      </w:pPr>
       <w:r>
         <w:rPr>
           <w:rFonts w:ascii="Times New Roman" w:hAnsi="Times New Roman" w:cs="Times New Roman"/>
@@ -2667,15 +2660,678 @@
         </w:rPr>
         <w:t xml:space="preserve"> </w:t>
       </w:r>
-      <w:bookmarkStart w:id="6" w:name="_Toc244253049"/>
+      <w:bookmarkStart w:id="5" w:name="_Toc244345905"/>
       <w:r>
         <w:rPr>
           <w:rFonts w:ascii="Times New Roman" w:hAnsi="Times New Roman" w:cs="Times New Roman"/>
           <w:color w:val="auto"/>
         </w:rPr>
-        <w:t>Diagrama cazului de utilizare</w:t>
-      </w:r>
+        <w:t>Diagrama cazurilor</w:t>
+      </w:r>
+      <w:r>
+        <w:rPr>
+          <w:rFonts w:ascii="Times New Roman" w:hAnsi="Times New Roman" w:cs="Times New Roman"/>
+          <w:color w:val="auto"/>
+        </w:rPr>
+        <w:t xml:space="preserve"> de utilizare</w:t>
+      </w:r>
+      <w:bookmarkEnd w:id="5"/>
+    </w:p>
+    <w:p>
+      <w:pPr>
+        <w:rPr>
+          <w:rFonts w:ascii="Times New Roman" w:hAnsi="Times New Roman" w:cs="Times New Roman"/>
+          <w:color w:val="000000" w:themeColor="text1"/>
+          <w:sz w:val="24"/>
+          <w:szCs w:val="24"/>
+        </w:rPr>
+      </w:pPr>
+    </w:p>
+    <w:p>
+      <w:pPr>
+        <w:rPr>
+          <w:rFonts w:ascii="Times New Roman" w:hAnsi="Times New Roman" w:cs="Times New Roman"/>
+          <w:sz w:val="24"/>
+          <w:szCs w:val="24"/>
+        </w:rPr>
+      </w:pPr>
+      <w:r>
+        <w:rPr>
+          <w:rFonts w:ascii="Times New Roman" w:hAnsi="Times New Roman" w:cs="Times New Roman"/>
+          <w:sz w:val="24"/>
+          <w:szCs w:val="24"/>
+        </w:rPr>
+        <w:t>Cazurile de utilizare ale sistemului sunt prezentate prin trei diagrame, care descriu interacțiunile utilizatorilor cu aplicația. Acestea separă funcțiile comune angajaților de activitățile specifice salonului și academiei. Actorii sunt reprezentați în exteriorul dreptunghiului care delimitează sistemul, iar acțiunile pe care le pot realiza sunt reprezentate prin ovale în interiorul acestuia. Legăturile dintre actori și cazurile de utilizare arată funcțiile la care participă fiecare rol</w:t>
+      </w:r>
+      <w:r>
+        <w:rPr>
+          <w:rFonts w:ascii="Times New Roman" w:hAnsi="Times New Roman" w:cs="Times New Roman"/>
+          <w:sz w:val="24"/>
+          <w:szCs w:val="24"/>
+        </w:rPr>
+        <w:t>.</w:t>
+      </w:r>
+      <w:r>
+        <w:rPr>
+          <w:rFonts w:ascii="Times New Roman" w:hAnsi="Times New Roman" w:cs="Times New Roman"/>
+          <w:sz w:val="24"/>
+          <w:szCs w:val="24"/>
+        </w:rPr>
+        <w:t xml:space="preserve"> </w:t>
+      </w:r>
+      <w:r>
+        <w:rPr>
+          <w:rFonts w:ascii="Times New Roman" w:eastAsia="Times New Roman" w:hAnsi="Times New Roman" w:cs="Times New Roman"/>
+          <w:sz w:val="24"/>
+          <w:szCs w:val="24"/>
+          <w:lang w:eastAsia="ro-RO"/>
+        </w:rPr>
+        <w:t xml:space="preserve">Prima diagramă prezintă actorul </w:t>
+      </w:r>
+      <w:r>
+        <w:rPr>
+          <w:rFonts w:asciiTheme="majorHAnsi" w:eastAsia="Times New Roman" w:hAnsiTheme="majorHAnsi" w:cstheme="majorHAnsi"/>
+          <w:sz w:val="24"/>
+          <w:szCs w:val="24"/>
+          <w:lang w:eastAsia="ro-RO"/>
+        </w:rPr>
+        <w:t>Angajat</w:t>
+      </w:r>
+      <w:r>
+        <w:rPr>
+          <w:rFonts w:ascii="Times New Roman" w:eastAsia="Times New Roman" w:hAnsi="Times New Roman" w:cs="Times New Roman"/>
+          <w:sz w:val="24"/>
+          <w:szCs w:val="24"/>
+          <w:lang w:eastAsia="ro-RO"/>
+        </w:rPr>
+        <w:t xml:space="preserve"> și specializările sale, </w:t>
+      </w:r>
+      <w:r>
+        <w:rPr>
+          <w:rFonts w:asciiTheme="majorHAnsi" w:eastAsia="Times New Roman" w:hAnsiTheme="majorHAnsi" w:cstheme="majorHAnsi"/>
+          <w:sz w:val="24"/>
+          <w:szCs w:val="24"/>
+          <w:lang w:eastAsia="ro-RO"/>
+        </w:rPr>
+        <w:t>Tehnician</w:t>
+      </w:r>
+      <w:r>
+        <w:rPr>
+          <w:rFonts w:ascii="Times New Roman" w:eastAsia="Times New Roman" w:hAnsi="Times New Roman" w:cs="Times New Roman"/>
+          <w:sz w:val="24"/>
+          <w:szCs w:val="24"/>
+          <w:lang w:eastAsia="ro-RO"/>
+        </w:rPr>
+        <w:t xml:space="preserve"> și </w:t>
+      </w:r>
+      <w:r>
+        <w:rPr>
+          <w:rFonts w:asciiTheme="majorHAnsi" w:eastAsia="Times New Roman" w:hAnsiTheme="majorHAnsi" w:cstheme="majorHAnsi"/>
+          <w:sz w:val="24"/>
+          <w:szCs w:val="24"/>
+          <w:lang w:eastAsia="ro-RO"/>
+        </w:rPr>
+        <w:t>Trainer</w:t>
+      </w:r>
+      <w:r>
+        <w:rPr>
+          <w:rFonts w:ascii="Times New Roman" w:eastAsia="Times New Roman" w:hAnsi="Times New Roman" w:cs="Times New Roman"/>
+          <w:sz w:val="24"/>
+          <w:szCs w:val="24"/>
+          <w:lang w:eastAsia="ro-RO"/>
+        </w:rPr>
+        <w:t>. Funcțiile comune ale angajatului sunt autentificarea, actualizarea profilului propriu și gestionarea disponibilității proprii. Prin autentificare, angajatul accesează funcțiile corespunzătoare rolului său. Actualizarea profilului permite modificarea informațiilor personale din cont, iar gestionarea disponibilității permite stabilirea perioadelor în care acesta poate desfășura activități și a perioadelor de absență.</w:t>
+      </w:r>
+      <w:r>
+        <w:rPr>
+          <w:rFonts w:ascii="Times New Roman" w:eastAsia="Times New Roman" w:hAnsi="Times New Roman" w:cs="Times New Roman"/>
+          <w:sz w:val="24"/>
+          <w:szCs w:val="24"/>
+          <w:lang w:eastAsia="ro-RO"/>
+        </w:rPr>
+        <w:t xml:space="preserve"> </w:t>
+      </w:r>
+      <w:r>
+        <w:rPr>
+          <w:rFonts w:asciiTheme="majorHAnsi" w:eastAsia="Times New Roman" w:hAnsiTheme="majorHAnsi" w:cstheme="majorHAnsi"/>
+          <w:sz w:val="24"/>
+          <w:szCs w:val="24"/>
+          <w:lang w:eastAsia="ro-RO"/>
+        </w:rPr>
+        <w:t>Tehnicianul</w:t>
+      </w:r>
+      <w:r>
+        <w:rPr>
+          <w:rFonts w:ascii="Times New Roman" w:eastAsia="Times New Roman" w:hAnsi="Times New Roman" w:cs="Times New Roman"/>
+          <w:sz w:val="24"/>
+          <w:szCs w:val="24"/>
+          <w:lang w:eastAsia="ro-RO"/>
+        </w:rPr>
+        <w:t xml:space="preserve"> și </w:t>
+      </w:r>
+      <w:r>
+        <w:rPr>
+          <w:rFonts w:asciiTheme="majorHAnsi" w:eastAsia="Times New Roman" w:hAnsiTheme="majorHAnsi" w:cstheme="majorHAnsi"/>
+          <w:sz w:val="24"/>
+          <w:szCs w:val="24"/>
+          <w:lang w:eastAsia="ro-RO"/>
+        </w:rPr>
+        <w:t>trainerul</w:t>
+      </w:r>
+      <w:r>
+        <w:rPr>
+          <w:rFonts w:ascii="Times New Roman" w:eastAsia="Times New Roman" w:hAnsi="Times New Roman" w:cs="Times New Roman"/>
+          <w:sz w:val="24"/>
+          <w:szCs w:val="24"/>
+          <w:lang w:eastAsia="ro-RO"/>
+        </w:rPr>
+        <w:t xml:space="preserve"> sunt legați de actorul </w:t>
+      </w:r>
+      <w:r>
+        <w:rPr>
+          <w:rFonts w:asciiTheme="majorHAnsi" w:eastAsia="Times New Roman" w:hAnsiTheme="majorHAnsi" w:cstheme="majorHAnsi"/>
+          <w:sz w:val="24"/>
+          <w:szCs w:val="24"/>
+          <w:lang w:eastAsia="ro-RO"/>
+        </w:rPr>
+        <w:t>Angajat</w:t>
+      </w:r>
+      <w:r>
+        <w:rPr>
+          <w:rFonts w:ascii="Times New Roman" w:eastAsia="Times New Roman" w:hAnsi="Times New Roman" w:cs="Times New Roman"/>
+          <w:sz w:val="24"/>
+          <w:szCs w:val="24"/>
+          <w:lang w:eastAsia="ro-RO"/>
+        </w:rPr>
+        <w:t xml:space="preserve"> prin relații de generalizare. Astfel, ambele roluri beneficiază de funcțiile comune, fără ca acestea să fie repetate în fiecare diagramă. Tehnicianul se ocupă de activitatea legată de programările pentru serviciile salonului, iar trainerul gestionează activitatea cursurilor pe care le susține. Aceeași persoană poate îndeplini ambele roluri, fără a fi necesară crearea unui actor suplimentar. Gestionarea propriilor informații nu presupune existența unui rol separat de administrator și nu oferă automat dreptul de a modifica datele sau activitățile altor angajați.</w:t>
+      </w:r>
+    </w:p>
+    <w:p>
+      <w:pPr>
+        <w:spacing w:before="100" w:beforeAutospacing="1" w:after="100" w:afterAutospacing="1" w:line="240" w:lineRule="auto"/>
+        <w:rPr>
+          <w:rFonts w:ascii="Times New Roman" w:eastAsia="Times New Roman" w:hAnsi="Times New Roman" w:cs="Times New Roman"/>
+          <w:sz w:val="24"/>
+          <w:szCs w:val="24"/>
+          <w:lang w:eastAsia="ro-RO"/>
+        </w:rPr>
+      </w:pPr>
+      <w:r>
+        <w:rPr>
+          <w:rFonts w:ascii="Times New Roman" w:eastAsia="Times New Roman" w:hAnsi="Times New Roman" w:cs="Times New Roman"/>
+          <w:noProof/>
+          <w:sz w:val="24"/>
+          <w:szCs w:val="24"/>
+          <w:lang w:eastAsia="ro-RO"/>
+        </w:rPr>
+        <w:lastRenderedPageBreak/>
+        <w:drawing>
+          <wp:inline distT="0" distB="0" distL="0" distR="0" wp14:anchorId="5C5DFFD8" wp14:editId="1D2CECB2">
+            <wp:extent cx="5759450" cy="3296285"/>
+            <wp:effectExtent l="0" t="0" r="0" b="0"/>
+            <wp:docPr id="2" name="Picture 2"/>
+            <wp:cNvGraphicFramePr>
+              <a:graphicFrameLocks xmlns:a="http://schemas.openxmlformats.org/drawingml/2006/main" noChangeAspect="1"/>
+            </wp:cNvGraphicFramePr>
+            <a:graphic xmlns:a="http://schemas.openxmlformats.org/drawingml/2006/main">
+              <a:graphicData uri="http://schemas.openxmlformats.org/drawingml/2006/picture">
+                <pic:pic xmlns:pic="http://schemas.openxmlformats.org/drawingml/2006/picture">
+                  <pic:nvPicPr>
+                    <pic:cNvPr id="2" name="diagrama_cazuri_utilizare_angajat.png"/>
+                    <pic:cNvPicPr/>
+                  </pic:nvPicPr>
+                  <pic:blipFill>
+                    <a:blip r:embed="rId10">
+                      <a:extLst>
+                        <a:ext uri="{28A0092B-C50C-407E-A947-70E740481C1C}">
+                          <a14:useLocalDpi xmlns:a14="http://schemas.microsoft.com/office/drawing/2010/main" val="0"/>
+                        </a:ext>
+                      </a:extLst>
+                    </a:blip>
+                    <a:stretch>
+                      <a:fillRect/>
+                    </a:stretch>
+                  </pic:blipFill>
+                  <pic:spPr>
+                    <a:xfrm>
+                      <a:off x="0" y="0"/>
+                      <a:ext cx="5800637" cy="3319857"/>
+                    </a:xfrm>
+                    <a:prstGeom prst="rect">
+                      <a:avLst/>
+                    </a:prstGeom>
+                  </pic:spPr>
+                </pic:pic>
+              </a:graphicData>
+            </a:graphic>
+          </wp:inline>
+        </w:drawing>
+      </w:r>
+    </w:p>
+    <w:p>
+      <w:pPr>
+        <w:spacing w:before="100" w:beforeAutospacing="1" w:after="100" w:afterAutospacing="1" w:line="240" w:lineRule="auto"/>
+        <w:jc w:val="center"/>
+        <w:rPr>
+          <w:rFonts w:ascii="Times New Roman" w:eastAsia="Times New Roman" w:hAnsi="Times New Roman" w:cs="Times New Roman"/>
+          <w:i/>
+          <w:iCs/>
+          <w:sz w:val="24"/>
+          <w:szCs w:val="24"/>
+          <w:lang w:eastAsia="ro-RO"/>
+        </w:rPr>
+      </w:pPr>
+      <w:r>
+        <w:rPr>
+          <w:rFonts w:ascii="Times New Roman" w:eastAsia="Times New Roman" w:hAnsi="Times New Roman" w:cs="Times New Roman"/>
+          <w:i/>
+          <w:iCs/>
+          <w:sz w:val="24"/>
+          <w:szCs w:val="24"/>
+          <w:lang w:eastAsia="ro-RO"/>
+        </w:rPr>
+        <w:t>Figura 3. Cazuri de utilizare comune angajaților și specializarea rolurilor</w:t>
+      </w:r>
+    </w:p>
+    <w:p>
+      <w:pPr>
+        <w:spacing w:before="100" w:beforeAutospacing="1" w:after="100" w:afterAutospacing="1" w:line="240" w:lineRule="auto"/>
+        <w:jc w:val="center"/>
+        <w:rPr>
+          <w:rFonts w:ascii="Times New Roman" w:eastAsia="Times New Roman" w:hAnsi="Times New Roman" w:cs="Times New Roman"/>
+          <w:i/>
+          <w:iCs/>
+          <w:sz w:val="24"/>
+          <w:szCs w:val="24"/>
+          <w:lang w:eastAsia="ro-RO"/>
+        </w:rPr>
+      </w:pPr>
+    </w:p>
+    <w:p>
+      <w:pPr>
+        <w:spacing w:before="100" w:beforeAutospacing="1" w:after="100" w:afterAutospacing="1" w:line="240" w:lineRule="auto"/>
+        <w:rPr>
+          <w:rFonts w:ascii="Times New Roman" w:eastAsia="Times New Roman" w:hAnsi="Times New Roman" w:cs="Times New Roman"/>
+          <w:sz w:val="24"/>
+          <w:szCs w:val="24"/>
+          <w:lang w:eastAsia="ro-RO"/>
+        </w:rPr>
+      </w:pPr>
+      <w:r>
+        <w:rPr>
+          <w:rFonts w:ascii="Times New Roman" w:eastAsia="Times New Roman" w:hAnsi="Times New Roman" w:cs="Times New Roman"/>
+          <w:sz w:val="24"/>
+          <w:szCs w:val="24"/>
+          <w:lang w:eastAsia="ro-RO"/>
+        </w:rPr>
+        <w:t xml:space="preserve">A doua diagramă prezintă activitatea salonului și interacțiunile actorilor </w:t>
+      </w:r>
+      <w:r>
+        <w:rPr>
+          <w:rFonts w:asciiTheme="majorHAnsi" w:eastAsia="Times New Roman" w:hAnsiTheme="majorHAnsi" w:cstheme="majorHAnsi"/>
+          <w:sz w:val="24"/>
+          <w:szCs w:val="24"/>
+          <w:lang w:eastAsia="ro-RO"/>
+        </w:rPr>
+        <w:t>Client</w:t>
+      </w:r>
+      <w:r>
+        <w:rPr>
+          <w:rFonts w:ascii="Times New Roman" w:eastAsia="Times New Roman" w:hAnsi="Times New Roman" w:cs="Times New Roman"/>
+          <w:sz w:val="24"/>
+          <w:szCs w:val="24"/>
+          <w:lang w:eastAsia="ro-RO"/>
+        </w:rPr>
+        <w:t xml:space="preserve"> și </w:t>
+      </w:r>
+      <w:r>
+        <w:rPr>
+          <w:rFonts w:asciiTheme="majorHAnsi" w:eastAsia="Times New Roman" w:hAnsiTheme="majorHAnsi" w:cstheme="majorHAnsi"/>
+          <w:sz w:val="24"/>
+          <w:szCs w:val="24"/>
+          <w:lang w:eastAsia="ro-RO"/>
+        </w:rPr>
+        <w:t>Tehnician</w:t>
+      </w:r>
+      <w:r>
+        <w:rPr>
+          <w:rFonts w:ascii="Times New Roman" w:eastAsia="Times New Roman" w:hAnsi="Times New Roman" w:cs="Times New Roman"/>
+          <w:sz w:val="24"/>
+          <w:szCs w:val="24"/>
+          <w:lang w:eastAsia="ro-RO"/>
+        </w:rPr>
+        <w:t xml:space="preserve"> cu sistemul. Clientul poate consulta serviciile oferite și disponibilitatea pentru programări. După alegerea serviciilor și a unui interval disponibil, acesta poate crea o programare. Ulterior, poate modifica, muta sau anula programările proprii și poate consulta istoricul acestora. Clientul poate oferi feedback pentru serviciile primite, iar observațiile sale sunt asociate programării la care se referă.</w:t>
+      </w:r>
+      <w:r>
+        <w:rPr>
+          <w:rFonts w:ascii="Times New Roman" w:eastAsia="Times New Roman" w:hAnsi="Times New Roman" w:cs="Times New Roman"/>
+          <w:sz w:val="24"/>
+          <w:szCs w:val="24"/>
+          <w:lang w:eastAsia="ro-RO"/>
+        </w:rPr>
+        <w:t xml:space="preserve"> </w:t>
+      </w:r>
+      <w:r>
+        <w:rPr>
+          <w:rFonts w:ascii="Times New Roman" w:eastAsia="Times New Roman" w:hAnsi="Times New Roman" w:cs="Times New Roman"/>
+          <w:sz w:val="24"/>
+          <w:szCs w:val="24"/>
+          <w:lang w:eastAsia="ro-RO"/>
+        </w:rPr>
+        <w:t>Tehnicianul poate crea programări pentru clienți și poate modifica, muta sau anula programările care îi sunt atribuite. Consultarea programărilor îi permite să urmărească activitatea planificată, iar accesul la fișa clientului îi oferă informațiile necesare efectuării serviciilor. După prestarea acestora, tehnicianul poate înregistra serviciile realizate și produsele utilizate și poate actualiza starea programării, în funcție de situația acesteia.</w:t>
+      </w:r>
+      <w:r>
+        <w:rPr>
+          <w:rFonts w:ascii="Times New Roman" w:eastAsia="Times New Roman" w:hAnsi="Times New Roman" w:cs="Times New Roman"/>
+          <w:sz w:val="24"/>
+          <w:szCs w:val="24"/>
+          <w:lang w:eastAsia="ro-RO"/>
+        </w:rPr>
+        <w:t xml:space="preserve"> </w:t>
+      </w:r>
+      <w:r>
+        <w:rPr>
+          <w:rFonts w:ascii="Times New Roman" w:eastAsia="Times New Roman" w:hAnsi="Times New Roman" w:cs="Times New Roman"/>
+          <w:sz w:val="24"/>
+          <w:szCs w:val="24"/>
+          <w:lang w:eastAsia="ro-RO"/>
+        </w:rPr>
+        <w:t>Crearea și modificarea programărilor sunt funcții la care participă atât clientul, cât și tehnicianul, însă fiecare acționează în limitele drepturilor sale. Clientul își gestionează propriile programări, iar tehnicianul gestionează programările pentru care este responsabil. La crearea sau mutarea unei programări, sistemul trebuie să verifice disponibilitatea tehnicianului pe întreaga durată necesară, ținând cont de celelalte programări, de cursurile susținute și de perioadele de absență. Această verificare urmărește evitarea suprapunerilor între activitățile aceleiași persoane.</w:t>
+      </w:r>
+    </w:p>
+    <w:p>
+      <w:pPr>
+        <w:spacing w:before="100" w:beforeAutospacing="1" w:after="100" w:afterAutospacing="1" w:line="240" w:lineRule="auto"/>
+        <w:rPr>
+          <w:rFonts w:ascii="Times New Roman" w:eastAsia="Times New Roman" w:hAnsi="Times New Roman" w:cs="Times New Roman"/>
+          <w:i/>
+          <w:iCs/>
+          <w:sz w:val="24"/>
+          <w:szCs w:val="24"/>
+          <w:lang w:eastAsia="ro-RO"/>
+        </w:rPr>
+      </w:pPr>
+      <w:r>
+        <w:rPr>
+          <w:rFonts w:ascii="Times New Roman" w:eastAsia="Times New Roman" w:hAnsi="Times New Roman" w:cs="Times New Roman"/>
+          <w:i/>
+          <w:iCs/>
+          <w:noProof/>
+          <w:sz w:val="24"/>
+          <w:szCs w:val="24"/>
+          <w:lang w:eastAsia="ro-RO"/>
+        </w:rPr>
+        <w:lastRenderedPageBreak/>
+        <w:drawing>
+          <wp:inline distT="0" distB="0" distL="0" distR="0">
+            <wp:extent cx="4724400" cy="5051514"/>
+            <wp:effectExtent l="0" t="0" r="0" b="0"/>
+            <wp:docPr id="4" name="Picture 4"/>
+            <wp:cNvGraphicFramePr>
+              <a:graphicFrameLocks xmlns:a="http://schemas.openxmlformats.org/drawingml/2006/main" noChangeAspect="1"/>
+            </wp:cNvGraphicFramePr>
+            <a:graphic xmlns:a="http://schemas.openxmlformats.org/drawingml/2006/main">
+              <a:graphicData uri="http://schemas.openxmlformats.org/drawingml/2006/picture">
+                <pic:pic xmlns:pic="http://schemas.openxmlformats.org/drawingml/2006/picture">
+                  <pic:nvPicPr>
+                    <pic:cNvPr id="4" name="d.c.u_salon.png"/>
+                    <pic:cNvPicPr/>
+                  </pic:nvPicPr>
+                  <pic:blipFill>
+                    <a:blip r:embed="rId11">
+                      <a:extLst>
+                        <a:ext uri="{28A0092B-C50C-407E-A947-70E740481C1C}">
+                          <a14:useLocalDpi xmlns:a14="http://schemas.microsoft.com/office/drawing/2010/main" val="0"/>
+                        </a:ext>
+                      </a:extLst>
+                    </a:blip>
+                    <a:stretch>
+                      <a:fillRect/>
+                    </a:stretch>
+                  </pic:blipFill>
+                  <pic:spPr>
+                    <a:xfrm>
+                      <a:off x="0" y="0"/>
+                      <a:ext cx="4730523" cy="5058061"/>
+                    </a:xfrm>
+                    <a:prstGeom prst="rect">
+                      <a:avLst/>
+                    </a:prstGeom>
+                  </pic:spPr>
+                </pic:pic>
+              </a:graphicData>
+            </a:graphic>
+          </wp:inline>
+        </w:drawing>
+      </w:r>
+    </w:p>
+    <w:p>
+      <w:pPr>
+        <w:spacing w:before="100" w:beforeAutospacing="1" w:after="100" w:afterAutospacing="1" w:line="240" w:lineRule="auto"/>
+        <w:jc w:val="center"/>
+        <w:rPr>
+          <w:rFonts w:ascii="Times New Roman" w:eastAsia="Times New Roman" w:hAnsi="Times New Roman" w:cs="Times New Roman"/>
+          <w:sz w:val="24"/>
+          <w:szCs w:val="24"/>
+          <w:lang w:eastAsia="ro-RO"/>
+        </w:rPr>
+      </w:pPr>
+      <w:r>
+        <w:rPr>
+          <w:rFonts w:ascii="Times New Roman" w:eastAsia="Times New Roman" w:hAnsi="Times New Roman" w:cs="Times New Roman"/>
+          <w:i/>
+          <w:iCs/>
+          <w:sz w:val="24"/>
+          <w:szCs w:val="24"/>
+          <w:lang w:eastAsia="ro-RO"/>
+        </w:rPr>
+        <w:t>Figura 4. Cazuri de utilizare pentru activitatea salonului — Client și Tehnician</w:t>
+      </w:r>
+    </w:p>
+    <w:p>
+      <w:pPr>
+        <w:spacing w:before="100" w:beforeAutospacing="1" w:after="100" w:afterAutospacing="1" w:line="240" w:lineRule="auto"/>
+        <w:rPr>
+          <w:rFonts w:ascii="Times New Roman" w:eastAsia="Times New Roman" w:hAnsi="Times New Roman" w:cs="Times New Roman"/>
+          <w:sz w:val="24"/>
+          <w:szCs w:val="24"/>
+          <w:lang w:eastAsia="ro-RO"/>
+        </w:rPr>
+      </w:pPr>
+    </w:p>
+    <w:p>
+      <w:pPr>
+        <w:spacing w:before="100" w:beforeAutospacing="1" w:after="100" w:afterAutospacing="1" w:line="240" w:lineRule="auto"/>
+        <w:rPr>
+          <w:rFonts w:ascii="Times New Roman" w:eastAsia="Times New Roman" w:hAnsi="Times New Roman" w:cs="Times New Roman"/>
+          <w:sz w:val="24"/>
+          <w:szCs w:val="24"/>
+          <w:lang w:eastAsia="ro-RO"/>
+        </w:rPr>
+      </w:pPr>
+      <w:r>
+        <w:rPr>
+          <w:rFonts w:ascii="Times New Roman" w:eastAsia="Times New Roman" w:hAnsi="Times New Roman" w:cs="Times New Roman"/>
+          <w:sz w:val="24"/>
+          <w:szCs w:val="24"/>
+          <w:lang w:eastAsia="ro-RO"/>
+        </w:rPr>
+        <w:t xml:space="preserve">A treia diagramă prezintă activitatea academiei și interacțiunile actorilor </w:t>
+      </w:r>
+      <w:r>
+        <w:rPr>
+          <w:rFonts w:asciiTheme="majorHAnsi" w:eastAsia="Times New Roman" w:hAnsiTheme="majorHAnsi" w:cstheme="majorHAnsi"/>
+          <w:sz w:val="24"/>
+          <w:szCs w:val="24"/>
+          <w:lang w:eastAsia="ro-RO"/>
+        </w:rPr>
+        <w:t>Client</w:t>
+      </w:r>
+      <w:r>
+        <w:rPr>
+          <w:rFonts w:ascii="Times New Roman" w:eastAsia="Times New Roman" w:hAnsi="Times New Roman" w:cs="Times New Roman"/>
+          <w:sz w:val="24"/>
+          <w:szCs w:val="24"/>
+          <w:lang w:eastAsia="ro-RO"/>
+        </w:rPr>
+        <w:t xml:space="preserve"> și </w:t>
+      </w:r>
+      <w:r>
+        <w:rPr>
+          <w:rFonts w:asciiTheme="majorHAnsi" w:eastAsia="Times New Roman" w:hAnsiTheme="majorHAnsi" w:cstheme="majorHAnsi"/>
+          <w:sz w:val="24"/>
+          <w:szCs w:val="24"/>
+          <w:lang w:eastAsia="ro-RO"/>
+        </w:rPr>
+        <w:t>Trainer</w:t>
+      </w:r>
+      <w:r>
+        <w:rPr>
+          <w:rFonts w:ascii="Times New Roman" w:eastAsia="Times New Roman" w:hAnsi="Times New Roman" w:cs="Times New Roman"/>
+          <w:sz w:val="24"/>
+          <w:szCs w:val="24"/>
+          <w:lang w:eastAsia="ro-RO"/>
+        </w:rPr>
+        <w:t xml:space="preserve"> cu sistemul. În această parte a aplicației, clientul reprezintă și persoana care dorește să participe la un curs. Acesta poate consulta cursurile și sesiunile disponibile, se poate înscrie la sesiunea aleasă și poate depune documentele necesare. De asemenea, își poate consulta înscrierile și plățile proprii, pentru a urmări situația participării și sumele înregistrate. Înscrierea la o sesiune presupune plata avansului și depunerea documentelor necesare în momentul înscrierii. Locul este ocupat numai după îndeplinirea ambelor condiții și în limita celor opt participanți confirmați. Dacă sesiunea nu mai are locuri disponibile, clientul se poate înscrie pe lista de așteptare. Această acțiune nu reprezintă confirmarea participării, ci păstrarea solicitării pentru situația în care se eliberează un loc. Clientul poate anunța retragerea de la curs sau poate propune un înlocuitor. Conform regulii stabilite pentru proiect, retragerea trebuie comunicată cu minimum două săptămâni înainte de începerea sesiunii. Dacă termenul nu este respectat, cursantul trebuie să participe sau să găsească o persoană care să îi ocupe locul. Sistemul va păstra informațiile despre retragere și eventuala înlocuire, fără a elimina istoricul înscrierii inițiale. Trainerul poate gestiona sesiunile proprii de curs și informațiile necesare desfășurării acestora. El poate urmări și gestiona înscrierile, documentele depuse și înlocuirile </w:t>
+      </w:r>
+      <w:r>
+        <w:rPr>
+          <w:rFonts w:ascii="Times New Roman" w:eastAsia="Times New Roman" w:hAnsi="Times New Roman" w:cs="Times New Roman"/>
+          <w:sz w:val="24"/>
+          <w:szCs w:val="24"/>
+          <w:lang w:eastAsia="ro-RO"/>
+        </w:rPr>
+        <w:lastRenderedPageBreak/>
+        <w:t>participanților. De asemenea, poate înregistra sau verifica situația plăților pentru sesiunile pe care le susține. Această funcție se referă la evidența sumelor achitate și a diferențelor rămase de plată, fără a presupune procesarea online a plăților în cadrul aplicației. Pe parcursul desfășurării cursului, trainerul poate înregistra prezența și poate actualiza situația participării fiecărui cursant. Drepturile trainerului sunt limitate la sesiunile proprii și la informațiile asociate acestora. El nu primește automat acces pentru modificarea cursurilor sau a înscrierilor gestionate de alți traineri. Feedback-ul nu este inclus în activitatea academiei, această funcție fiind păstrată numai pentru serviciile salonului.</w:t>
+      </w:r>
+    </w:p>
+    <w:p>
+      <w:pPr>
+        <w:spacing w:before="100" w:beforeAutospacing="1" w:after="100" w:afterAutospacing="1" w:line="240" w:lineRule="auto"/>
+        <w:rPr>
+          <w:rFonts w:ascii="Times New Roman" w:eastAsia="Times New Roman" w:hAnsi="Times New Roman" w:cs="Times New Roman"/>
+          <w:sz w:val="24"/>
+          <w:szCs w:val="24"/>
+          <w:lang w:eastAsia="ro-RO"/>
+        </w:rPr>
+      </w:pPr>
+    </w:p>
+    <w:p>
+      <w:pPr>
+        <w:spacing w:before="100" w:beforeAutospacing="1" w:after="100" w:afterAutospacing="1" w:line="240" w:lineRule="auto"/>
+        <w:rPr>
+          <w:rFonts w:ascii="Times New Roman" w:eastAsia="Times New Roman" w:hAnsi="Times New Roman" w:cs="Times New Roman"/>
+          <w:sz w:val="24"/>
+          <w:szCs w:val="24"/>
+          <w:lang w:eastAsia="ro-RO"/>
+        </w:rPr>
+      </w:pPr>
+      <w:r>
+        <w:rPr>
+          <w:rFonts w:ascii="Times New Roman" w:eastAsia="Times New Roman" w:hAnsi="Times New Roman" w:cs="Times New Roman"/>
+          <w:noProof/>
+          <w:sz w:val="24"/>
+          <w:szCs w:val="24"/>
+          <w:lang w:eastAsia="ro-RO"/>
+        </w:rPr>
+        <w:drawing>
+          <wp:inline distT="0" distB="0" distL="0" distR="0">
+            <wp:extent cx="5267325" cy="6083267"/>
+            <wp:effectExtent l="0" t="0" r="0" b="0"/>
+            <wp:docPr id="5" name="Picture 5"/>
+            <wp:cNvGraphicFramePr>
+              <a:graphicFrameLocks xmlns:a="http://schemas.openxmlformats.org/drawingml/2006/main" noChangeAspect="1"/>
+            </wp:cNvGraphicFramePr>
+            <a:graphic xmlns:a="http://schemas.openxmlformats.org/drawingml/2006/main">
+              <a:graphicData uri="http://schemas.openxmlformats.org/drawingml/2006/picture">
+                <pic:pic xmlns:pic="http://schemas.openxmlformats.org/drawingml/2006/picture">
+                  <pic:nvPicPr>
+                    <pic:cNvPr id="5" name="d.c.u_academie.png"/>
+                    <pic:cNvPicPr/>
+                  </pic:nvPicPr>
+                  <pic:blipFill>
+                    <a:blip r:embed="rId12">
+                      <a:extLst>
+                        <a:ext uri="{28A0092B-C50C-407E-A947-70E740481C1C}">
+                          <a14:useLocalDpi xmlns:a14="http://schemas.microsoft.com/office/drawing/2010/main" val="0"/>
+                        </a:ext>
+                      </a:extLst>
+                    </a:blip>
+                    <a:stretch>
+                      <a:fillRect/>
+                    </a:stretch>
+                  </pic:blipFill>
+                  <pic:spPr>
+                    <a:xfrm>
+                      <a:off x="0" y="0"/>
+                      <a:ext cx="5275804" cy="6093059"/>
+                    </a:xfrm>
+                    <a:prstGeom prst="rect">
+                      <a:avLst/>
+                    </a:prstGeom>
+                  </pic:spPr>
+                </pic:pic>
+              </a:graphicData>
+            </a:graphic>
+          </wp:inline>
+        </w:drawing>
+      </w:r>
+    </w:p>
+    <w:p>
+      <w:pPr>
+        <w:spacing w:before="100" w:beforeAutospacing="1" w:after="100" w:afterAutospacing="1" w:line="240" w:lineRule="auto"/>
+        <w:jc w:val="center"/>
+        <w:rPr>
+          <w:rFonts w:ascii="Times New Roman" w:eastAsia="Times New Roman" w:hAnsi="Times New Roman" w:cs="Times New Roman"/>
+          <w:sz w:val="24"/>
+          <w:szCs w:val="24"/>
+          <w:lang w:eastAsia="ro-RO"/>
+        </w:rPr>
+      </w:pPr>
+      <w:bookmarkStart w:id="6" w:name="_GoBack"/>
       <w:bookmarkEnd w:id="6"/>
+      <w:r>
+        <w:rPr>
+          <w:rFonts w:ascii="Times New Roman" w:eastAsia="Times New Roman" w:hAnsi="Times New Roman" w:cs="Times New Roman"/>
+          <w:i/>
+          <w:iCs/>
+          <w:sz w:val="24"/>
+          <w:szCs w:val="24"/>
+          <w:lang w:eastAsia="ro-RO"/>
+        </w:rPr>
+        <w:t>Figura 5. Cazuri de utilizare pentru activitatea academiei — Client și Trainer</w:t>
+      </w:r>
+    </w:p>
+    <w:p>
+      <w:pPr>
+        <w:spacing w:before="100" w:beforeAutospacing="1" w:after="100" w:afterAutospacing="1" w:line="240" w:lineRule="auto"/>
+        <w:rPr>
+          <w:rFonts w:ascii="Times New Roman" w:eastAsia="Times New Roman" w:hAnsi="Times New Roman" w:cs="Times New Roman"/>
+          <w:sz w:val="24"/>
+          <w:szCs w:val="24"/>
+          <w:lang w:eastAsia="ro-RO"/>
+        </w:rPr>
+      </w:pPr>
+      <w:r>
+        <w:rPr>
+          <w:rFonts w:ascii="Times New Roman" w:eastAsia="Times New Roman" w:hAnsi="Times New Roman" w:cs="Times New Roman"/>
+          <w:sz w:val="24"/>
+          <w:szCs w:val="24"/>
+          <w:lang w:eastAsia="ro-RO"/>
+        </w:rPr>
+        <w:lastRenderedPageBreak/>
+        <w:t>Prin cele trei diagrame sunt delimitate responsabilitățile utilizatorilor și funcțiile la care aceștia au acces. Separarea dintre funcțiile comune ale angajatului și activitățile specifice tehnicianului și trainerului permite organizarea aplicației în funcție de rolurile îndeplinite. În același timp, limitele de acces păstrează distincte informațiile proprii ale clienților, programările atribuite tehnicienilor și sesiunile gestionate de traineri.</w:t>
+      </w:r>
+    </w:p>
+    <w:p>
+      <w:pPr>
+        <w:rPr>
+          <w:rFonts w:ascii="Times New Roman" w:hAnsi="Times New Roman" w:cs="Times New Roman"/>
+          <w:color w:val="000000" w:themeColor="text1"/>
+          <w:sz w:val="24"/>
+          <w:szCs w:val="24"/>
+        </w:rPr>
+      </w:pPr>
     </w:p>
     <w:p>
       <w:pPr>
@@ -2688,8 +3344,8 @@
       </w:pPr>
     </w:p>
     <w:sectPr>
-      <w:footerReference w:type="default" r:id="rId10"/>
-      <w:footerReference w:type="first" r:id="rId11"/>
+      <w:footerReference w:type="default" r:id="rId13"/>
+      <w:footerReference w:type="first" r:id="rId14"/>
       <w:pgSz w:w="11906" w:h="16838" w:code="9"/>
       <w:pgMar w:top="1418" w:right="1418" w:bottom="1418" w:left="1418" w:header="709" w:footer="709" w:gutter="0"/>
       <w:cols w:space="708"/>
@@ -2759,7 +3415,7 @@
           <w:rPr>
             <w:noProof/>
           </w:rPr>
-          <w:t>10</w:t>
+          <w:t>13</w:t>
         </w:r>
         <w:r>
           <w:rPr>
@@ -5482,6 +6138,17 @@
       <w:szCs w:val="20"/>
     </w:rPr>
   </w:style>
+  <w:style w:type="character" w:styleId="Emphasis">
+    <w:name w:val="Emphasis"/>
+    <w:basedOn w:val="DefaultParagraphFont"/>
+    <w:uiPriority w:val="20"/>
+    <w:qFormat/>
+    <w:rsid w:val="004042C9"/>
+    <w:rPr>
+      <w:i/>
+      <w:iCs/>
+    </w:rPr>
+  </w:style>
 </w:styles>
 </file>
 
@@ -5751,7 +6418,7 @@
 </file>
 
 <file path=customXml/itemProps1.xml><?xml version="1.0" encoding="utf-8"?>
-<ds:datastoreItem xmlns:ds="http://schemas.openxmlformats.org/officeDocument/2006/customXml" ds:itemID="{F39CD497-6C24-4582-BAC6-441EC4A62712}">
+<ds:datastoreItem xmlns:ds="http://schemas.openxmlformats.org/officeDocument/2006/customXml" ds:itemID="{CD5D6D0B-263B-4D45-BA61-D06BFE4E7DC0}">
   <ds:schemaRefs>
     <ds:schemaRef ds:uri="http://schemas.openxmlformats.org/officeDocument/2006/bibliography"/>
   </ds:schemaRefs>

</xml_diff>